<commit_message>
docs: journal E-21 (Main+cs1 false reject, lazy probe, verdict cache) + media doc probe chapter
</commit_message>
<xml_diff>
--- a/docs/CamBrowser_Журнал_ошибок.docx
+++ b/docs/CamBrowser_Журнал_ошибок.docx
@@ -102,7 +102,7 @@
                 <w:sz w:val="24"/>
                 <w:szCs w:val="24"/>
               </w:rPr>
-              <w:t xml:space="preserve">Симптомы, корневые причины, исправления и коммиты (9adf20e → 2096994)</w:t>
+              <w:t xml:space="preserve">Симптомы, корневые причины, исправления и коммиты (9adf20e → eab762a)</w:t>
             </w:r>
           </w:p>
           <w:p>
@@ -138,7 +138,7 @@
                 <w:sz w:val="24"/>
                 <w:szCs w:val="24"/>
               </w:rPr>
-              <w:t xml:space="preserve">Ветка: feature/ethernet-browser · 20 учтённых проблем</w:t>
+              <w:t xml:space="preserve">Ветка: feature/ethernet-browser · 21 учтённая проблема</w:t>
             </w:r>
           </w:p>
           <w:p>
@@ -249,977 +249,9 @@
         <w:p>
           <w:r>
             <w:fldChar w:fldCharType="begin" w:dirty="true"/>
-          </w:r>
-          <w:r>
             <w:instrText xml:space="preserve">TOC \h \o "1-2"</w:instrText>
-          </w:r>
-          <w:r>
             <w:fldChar w:fldCharType="separate"/>
           </w:r>
-        </w:p>
-        <w:p>
-          <w:pPr>
-            <w:pStyle w:val="9"/>
-            <w:tabs>
-              <w:tab w:val="right" w:leader="dot" w:pos="9026"/>
-            </w:tabs>
-            <w:spacing w:before="120" w:after="60"/>
-          </w:pPr>
-          <w:hyperlink w:anchor="_Toc100000" w:history="1">
-            <w:r>
-              <w:rPr>
-                <w:rStyle w:val="Hyperlink"/>
-              </w:rPr>
-              <w:t>1. Назначение и методика документа</w:t>
-            </w:r>
-            <w:r>
-              <w:tab/>
-            </w:r>
-            <w:r>
-              <w:fldChar w:fldCharType="begin"/>
-            </w:r>
-            <w:r>
-              <w:instrText xml:space="preserve"> PAGEREF _Toc100000 \h </w:instrText>
-            </w:r>
-            <w:r>
-              <w:fldChar w:fldCharType="separate"/>
-            </w:r>
-            <w:r>
-              <w:t>1</w:t>
-            </w:r>
-            <w:r>
-              <w:fldChar w:fldCharType="end"/>
-            </w:r>
-          </w:hyperlink>
-        </w:p>
-        <w:p>
-          <w:pPr>
-            <w:pStyle w:val="9"/>
-            <w:tabs>
-              <w:tab w:val="right" w:leader="dot" w:pos="9026"/>
-            </w:tabs>
-            <w:spacing w:before="120" w:after="60"/>
-          </w:pPr>
-          <w:hyperlink w:anchor="_Toc100001" w:history="1">
-            <w:r>
-              <w:rPr>
-                <w:rStyle w:val="Hyperlink"/>
-              </w:rPr>
-              <w:t>2. Сводный индекс ошибок</w:t>
-            </w:r>
-            <w:r>
-              <w:tab/>
-            </w:r>
-            <w:r>
-              <w:fldChar w:fldCharType="begin"/>
-            </w:r>
-            <w:r>
-              <w:instrText xml:space="preserve"> PAGEREF _Toc100001 \h </w:instrText>
-            </w:r>
-            <w:r>
-              <w:fldChar w:fldCharType="separate"/>
-            </w:r>
-            <w:r>
-              <w:t>2</w:t>
-            </w:r>
-            <w:r>
-              <w:fldChar w:fldCharType="end"/>
-            </w:r>
-          </w:hyperlink>
-        </w:p>
-        <w:p>
-          <w:pPr>
-            <w:pStyle w:val="9"/>
-            <w:tabs>
-              <w:tab w:val="right" w:leader="dot" w:pos="9026"/>
-            </w:tabs>
-            <w:spacing w:before="120" w:after="60"/>
-          </w:pPr>
-          <w:hyperlink w:anchor="_Toc100002" w:history="1">
-            <w:r>
-              <w:rPr>
-                <w:rStyle w:val="Hyperlink"/>
-              </w:rPr>
-              <w:t>3. Сборка и конфигурация (E-01, E-02, E-06, E-10–E-12, E-18)</w:t>
-            </w:r>
-            <w:r>
-              <w:tab/>
-            </w:r>
-            <w:r>
-              <w:fldChar w:fldCharType="begin"/>
-            </w:r>
-            <w:r>
-              <w:instrText xml:space="preserve"> PAGEREF _Toc100002 \h </w:instrText>
-            </w:r>
-            <w:r>
-              <w:fldChar w:fldCharType="separate"/>
-            </w:r>
-            <w:r>
-              <w:t>2</w:t>
-            </w:r>
-            <w:r>
-              <w:fldChar w:fldCharType="end"/>
-            </w:r>
-          </w:hyperlink>
-        </w:p>
-        <w:p>
-          <w:pPr>
-            <w:pStyle w:val="11"/>
-            <w:ind w:left="360"/>
-            <w:tabs>
-              <w:tab w:val="right" w:leader="dot" w:pos="9026"/>
-            </w:tabs>
-            <w:spacing w:before="120" w:after="60"/>
-          </w:pPr>
-          <w:hyperlink w:anchor="_Toc100003" w:history="1">
-            <w:r>
-              <w:rPr>
-                <w:rStyle w:val="Hyperlink"/>
-              </w:rPr>
-              <w:t>E-01. Неявное объявление BSP-функций и незапущенный LEDC</w:t>
-            </w:r>
-            <w:r>
-              <w:tab/>
-            </w:r>
-            <w:r>
-              <w:fldChar w:fldCharType="begin"/>
-            </w:r>
-            <w:r>
-              <w:instrText xml:space="preserve"> PAGEREF _Toc100003 \h </w:instrText>
-            </w:r>
-            <w:r>
-              <w:fldChar w:fldCharType="separate"/>
-            </w:r>
-            <w:r>
-              <w:t>2</w:t>
-            </w:r>
-            <w:r>
-              <w:fldChar w:fldCharType="end"/>
-            </w:r>
-          </w:hyperlink>
-        </w:p>
-        <w:p>
-          <w:pPr>
-            <w:pStyle w:val="11"/>
-            <w:ind w:left="360"/>
-            <w:tabs>
-              <w:tab w:val="right" w:leader="dot" w:pos="9026"/>
-            </w:tabs>
-            <w:spacing w:before="120" w:after="60"/>
-          </w:pPr>
-          <w:hyperlink w:anchor="_Toc100004" w:history="1">
-            <w:r>
-              <w:rPr>
-                <w:rStyle w:val="Hyperlink"/>
-              </w:rPr>
-              <w:t>E-02. Опечатка в ветвлении #elif конфигураций плат</w:t>
-            </w:r>
-            <w:r>
-              <w:tab/>
-            </w:r>
-            <w:r>
-              <w:fldChar w:fldCharType="begin"/>
-            </w:r>
-            <w:r>
-              <w:instrText xml:space="preserve"> PAGEREF _Toc100004 \h </w:instrText>
-            </w:r>
-            <w:r>
-              <w:fldChar w:fldCharType="separate"/>
-            </w:r>
-            <w:r>
-              <w:t>3</w:t>
-            </w:r>
-            <w:r>
-              <w:fldChar w:fldCharType="end"/>
-            </w:r>
-          </w:hyperlink>
-        </w:p>
-        <w:p>
-          <w:pPr>
-            <w:pStyle w:val="11"/>
-            <w:ind w:left="360"/>
-            <w:tabs>
-              <w:tab w:val="right" w:leader="dot" w:pos="9026"/>
-            </w:tabs>
-            <w:spacing w:before="120" w:after="60"/>
-          </w:pPr>
-          <w:hyperlink w:anchor="_Toc100005" w:history="1">
-            <w:r>
-              <w:rPr>
-                <w:rStyle w:val="Hyperlink"/>
-              </w:rPr>
-              <w:t>E-06. Выключенная Kconfig-опция не даёт макроса + порядок функций</w:t>
-            </w:r>
-            <w:r>
-              <w:tab/>
-            </w:r>
-            <w:r>
-              <w:fldChar w:fldCharType="begin"/>
-            </w:r>
-            <w:r>
-              <w:instrText xml:space="preserve"> PAGEREF _Toc100005 \h </w:instrText>
-            </w:r>
-            <w:r>
-              <w:fldChar w:fldCharType="separate"/>
-            </w:r>
-            <w:r>
-              <w:t>3</w:t>
-            </w:r>
-            <w:r>
-              <w:fldChar w:fldCharType="end"/>
-            </w:r>
-          </w:hyperlink>
-        </w:p>
-        <w:p>
-          <w:pPr>
-            <w:pStyle w:val="11"/>
-            <w:ind w:left="360"/>
-            <w:tabs>
-              <w:tab w:val="right" w:leader="dot" w:pos="9026"/>
-            </w:tabs>
-            <w:spacing w:before="120" w:after="60"/>
-          </w:pPr>
-          <w:hyperlink w:anchor="_Toc100006" w:history="1">
-            <w:r>
-              <w:rPr>
-                <w:rStyle w:val="Hyperlink"/>
-              </w:rPr>
-              <w:t>E-10. sdkconfig.defaults не применяется к существующему sdkconfig</w:t>
-            </w:r>
-            <w:r>
-              <w:tab/>
-            </w:r>
-            <w:r>
-              <w:fldChar w:fldCharType="begin"/>
-            </w:r>
-            <w:r>
-              <w:instrText xml:space="preserve"> PAGEREF _Toc100006 \h </w:instrText>
-            </w:r>
-            <w:r>
-              <w:fldChar w:fldCharType="separate"/>
-            </w:r>
-            <w:r>
-              <w:t>4</w:t>
-            </w:r>
-            <w:r>
-              <w:fldChar w:fldCharType="end"/>
-            </w:r>
-          </w:hyperlink>
-        </w:p>
-        <w:p>
-          <w:pPr>
-            <w:pStyle w:val="11"/>
-            <w:ind w:left="360"/>
-            <w:tabs>
-              <w:tab w:val="right" w:leader="dot" w:pos="9026"/>
-            </w:tabs>
-            <w:spacing w:before="120" w:after="60"/>
-          </w:pPr>
-          <w:hyperlink w:anchor="_Toc100007" w:history="1">
-            <w:r>
-              <w:rPr>
-                <w:rStyle w:val="Hyperlink"/>
-              </w:rPr>
-              <w:t>E-11. Флеш-чип Boya и E-12. Удаление флага use_dma2d в IDF 6</w:t>
-            </w:r>
-            <w:r>
-              <w:tab/>
-            </w:r>
-            <w:r>
-              <w:fldChar w:fldCharType="begin"/>
-            </w:r>
-            <w:r>
-              <w:instrText xml:space="preserve"> PAGEREF _Toc100007 \h </w:instrText>
-            </w:r>
-            <w:r>
-              <w:fldChar w:fldCharType="separate"/>
-            </w:r>
-            <w:r>
-              <w:t>4</w:t>
-            </w:r>
-            <w:r>
-              <w:fldChar w:fldCharType="end"/>
-            </w:r>
-          </w:hyperlink>
-        </w:p>
-        <w:p>
-          <w:pPr>
-            <w:pStyle w:val="11"/>
-            <w:ind w:left="360"/>
-            <w:tabs>
-              <w:tab w:val="right" w:leader="dot" w:pos="9026"/>
-            </w:tabs>
-            <w:spacing w:before="120" w:after="60"/>
-          </w:pPr>
-          <w:hyperlink w:anchor="_Toc100008" w:history="1">
-            <w:r>
-              <w:rPr>
-                <w:rStyle w:val="Hyperlink"/>
-              </w:rPr>
-              <w:t>E-18. Локальная сборка пользователя падает: -Werror=format на riscv-тулчейне</w:t>
-            </w:r>
-            <w:r>
-              <w:tab/>
-            </w:r>
-            <w:r>
-              <w:fldChar w:fldCharType="begin"/>
-            </w:r>
-            <w:r>
-              <w:instrText xml:space="preserve"> PAGEREF _Toc100008 \h </w:instrText>
-            </w:r>
-            <w:r>
-              <w:fldChar w:fldCharType="separate"/>
-            </w:r>
-            <w:r>
-              <w:t>4</w:t>
-            </w:r>
-            <w:r>
-              <w:fldChar w:fldCharType="end"/>
-            </w:r>
-          </w:hyperlink>
-        </w:p>
-        <w:p>
-          <w:pPr>
-            <w:pStyle w:val="9"/>
-            <w:tabs>
-              <w:tab w:val="right" w:leader="dot" w:pos="9026"/>
-            </w:tabs>
-            <w:spacing w:before="120" w:after="60"/>
-          </w:pPr>
-          <w:hyperlink w:anchor="_Toc100009" w:history="1">
-            <w:r>
-              <w:rPr>
-                <w:rStyle w:val="Hyperlink"/>
-              </w:rPr>
-              <w:t>4. Периферия платы: тач, ECDSA, дисплей, SD (E-04, E-05, E-07, E-09, E-15)</w:t>
-            </w:r>
-            <w:r>
-              <w:tab/>
-            </w:r>
-            <w:r>
-              <w:fldChar w:fldCharType="begin"/>
-            </w:r>
-            <w:r>
-              <w:instrText xml:space="preserve"> PAGEREF _Toc100009 \h </w:instrText>
-            </w:r>
-            <w:r>
-              <w:fldChar w:fldCharType="separate"/>
-            </w:r>
-            <w:r>
-              <w:t>5</w:t>
-            </w:r>
-            <w:r>
-              <w:fldChar w:fldCharType="end"/>
-            </w:r>
-          </w:hyperlink>
-        </w:p>
-        <w:p>
-          <w:pPr>
-            <w:pStyle w:val="11"/>
-            <w:ind w:left="360"/>
-            <w:tabs>
-              <w:tab w:val="right" w:leader="dot" w:pos="9026"/>
-            </w:tabs>
-            <w:spacing w:before="120" w:after="60"/>
-          </w:pPr>
-          <w:hyperlink w:anchor="_Toc100010" w:history="1">
-            <w:r>
-              <w:rPr>
-                <w:rStyle w:val="Hyperlink"/>
-              </w:rPr>
-              <w:t>E-04. Тачскрин полностью не отвечает (итерация v2)</w:t>
-            </w:r>
-            <w:r>
-              <w:tab/>
-            </w:r>
-            <w:r>
-              <w:fldChar w:fldCharType="begin"/>
-            </w:r>
-            <w:r>
-              <w:instrText xml:space="preserve"> PAGEREF _Toc100010 \h </w:instrText>
-            </w:r>
-            <w:r>
-              <w:fldChar w:fldCharType="separate"/>
-            </w:r>
-            <w:r>
-              <w:t>5</w:t>
-            </w:r>
-            <w:r>
-              <w:fldChar w:fldCharType="end"/>
-            </w:r>
-          </w:hyperlink>
-        </w:p>
-        <w:p>
-          <w:pPr>
-            <w:pStyle w:val="11"/>
-            <w:ind w:left="360"/>
-            <w:tabs>
-              <w:tab w:val="right" w:leader="dot" w:pos="9026"/>
-            </w:tabs>
-            <w:spacing w:before="120" w:after="60"/>
-          </w:pPr>
-          <w:hyperlink w:anchor="_Toc100011" w:history="1">
-            <w:r>
-              <w:rPr>
-                <w:rStyle w:val="Hyperlink"/>
-              </w:rPr>
-              <w:t>E-05. Тач найден, но координаты — мусор (корневой баг, итерация v3)</w:t>
-            </w:r>
-            <w:r>
-              <w:tab/>
-            </w:r>
-            <w:r>
-              <w:fldChar w:fldCharType="begin"/>
-            </w:r>
-            <w:r>
-              <w:instrText xml:space="preserve"> PAGEREF _Toc100011 \h </w:instrText>
-            </w:r>
-            <w:r>
-              <w:fldChar w:fldCharType="separate"/>
-            </w:r>
-            <w:r>
-              <w:t>6</w:t>
-            </w:r>
-            <w:r>
-              <w:fldChar w:fldCharType="end"/>
-            </w:r>
-          </w:hyperlink>
-        </w:p>
-        <w:p>
-          <w:pPr>
-            <w:pStyle w:val="11"/>
-            <w:ind w:left="360"/>
-            <w:tabs>
-              <w:tab w:val="right" w:leader="dot" w:pos="9026"/>
-            </w:tabs>
-            <w:spacing w:before="120" w:after="60"/>
-          </w:pPr>
-          <w:hyperlink w:anchor="_Toc100012" w:history="1">
-            <w:r>
-              <w:rPr>
-                <w:rStyle w:val="Hyperlink"/>
-              </w:rPr>
-              <w:t>E-07. Ошибки «ECDSA peripheral not supported» на каждом HTTPS-хендшейке</w:t>
-            </w:r>
-            <w:r>
-              <w:tab/>
-            </w:r>
-            <w:r>
-              <w:fldChar w:fldCharType="begin"/>
-            </w:r>
-            <w:r>
-              <w:instrText xml:space="preserve"> PAGEREF _Toc100012 \h </w:instrText>
-            </w:r>
-            <w:r>
-              <w:fldChar w:fldCharType="separate"/>
-            </w:r>
-            <w:r>
-              <w:t>6</w:t>
-            </w:r>
-            <w:r>
-              <w:fldChar w:fldCharType="end"/>
-            </w:r>
-          </w:hyperlink>
-        </w:p>
-        <w:p>
-          <w:pPr>
-            <w:pStyle w:val="11"/>
-            <w:ind w:left="360"/>
-            <w:tabs>
-              <w:tab w:val="right" w:leader="dot" w:pos="9026"/>
-            </w:tabs>
-            <w:spacing w:before="120" w:after="60"/>
-          </w:pPr>
-          <w:hyperlink w:anchor="_Toc100013" w:history="1">
-            <w:r>
-              <w:rPr>
-                <w:rStyle w:val="Hyperlink"/>
-              </w:rPr>
-              <w:t>E-09. Переполнение фреймбуфера DPI (историческая, до вхождения в ветку)</w:t>
-            </w:r>
-            <w:r>
-              <w:tab/>
-            </w:r>
-            <w:r>
-              <w:fldChar w:fldCharType="begin"/>
-            </w:r>
-            <w:r>
-              <w:instrText xml:space="preserve"> PAGEREF _Toc100013 \h </w:instrText>
-            </w:r>
-            <w:r>
-              <w:fldChar w:fldCharType="separate"/>
-            </w:r>
-            <w:r>
-              <w:t>7</w:t>
-            </w:r>
-            <w:r>
-              <w:fldChar w:fldCharType="end"/>
-            </w:r>
-          </w:hyperlink>
-        </w:p>
-        <w:p>
-          <w:pPr>
-            <w:pStyle w:val="11"/>
-            <w:ind w:left="360"/>
-            <w:tabs>
-              <w:tab w:val="right" w:leader="dot" w:pos="9026"/>
-            </w:tabs>
-            <w:spacing w:before="120" w:after="60"/>
-          </w:pPr>
-          <w:hyperlink w:anchor="_Toc100014" w:history="1">
-            <w:r>
-              <w:rPr>
-                <w:rStyle w:val="Hyperlink"/>
-              </w:rPr>
-              <w:t>E-15. Кнопка «Обновить» на SD: esp_ldo_acquire_channel already in use</w:t>
-            </w:r>
-            <w:r>
-              <w:tab/>
-            </w:r>
-            <w:r>
-              <w:fldChar w:fldCharType="begin"/>
-            </w:r>
-            <w:r>
-              <w:instrText xml:space="preserve"> PAGEREF _Toc100014 \h </w:instrText>
-            </w:r>
-            <w:r>
-              <w:fldChar w:fldCharType="separate"/>
-            </w:r>
-            <w:r>
-              <w:t>7</w:t>
-            </w:r>
-            <w:r>
-              <w:fldChar w:fldCharType="end"/>
-            </w:r>
-          </w:hyperlink>
-        </w:p>
-        <w:p>
-          <w:pPr>
-            <w:pStyle w:val="9"/>
-            <w:tabs>
-              <w:tab w:val="right" w:leader="dot" w:pos="9026"/>
-            </w:tabs>
-            <w:spacing w:before="120" w:after="60"/>
-          </w:pPr>
-          <w:hyperlink w:anchor="_Toc100015" w:history="1">
-            <w:r>
-              <w:rPr>
-                <w:rStyle w:val="Hyperlink"/>
-              </w:rPr>
-              <w:t>5. Интерфейс: кириллица и клавиатура (E-08)</w:t>
-            </w:r>
-            <w:r>
-              <w:tab/>
-            </w:r>
-            <w:r>
-              <w:fldChar w:fldCharType="begin"/>
-            </w:r>
-            <w:r>
-              <w:instrText xml:space="preserve"> PAGEREF _Toc100015 \h </w:instrText>
-            </w:r>
-            <w:r>
-              <w:fldChar w:fldCharType="separate"/>
-            </w:r>
-            <w:r>
-              <w:t>8</w:t>
-            </w:r>
-            <w:r>
-              <w:fldChar w:fldCharType="end"/>
-            </w:r>
-          </w:hyperlink>
-        </w:p>
-        <w:p>
-          <w:pPr>
-            <w:pStyle w:val="11"/>
-            <w:ind w:left="360"/>
-            <w:tabs>
-              <w:tab w:val="right" w:leader="dot" w:pos="9026"/>
-            </w:tabs>
-            <w:spacing w:before="120" w:after="60"/>
-          </w:pPr>
-          <w:hyperlink w:anchor="_Toc100016" w:history="1">
-            <w:r>
-              <w:rPr>
-                <w:rStyle w:val="Hyperlink"/>
-              </w:rPr>
-              <w:t>E-08. Русский текст отображался знаками «?»</w:t>
-            </w:r>
-            <w:r>
-              <w:tab/>
-            </w:r>
-            <w:r>
-              <w:fldChar w:fldCharType="begin"/>
-            </w:r>
-            <w:r>
-              <w:instrText xml:space="preserve"> PAGEREF _Toc100016 \h </w:instrText>
-            </w:r>
-            <w:r>
-              <w:fldChar w:fldCharType="separate"/>
-            </w:r>
-            <w:r>
-              <w:t>8</w:t>
-            </w:r>
-            <w:r>
-              <w:fldChar w:fldCharType="end"/>
-            </w:r>
-          </w:hyperlink>
-        </w:p>
-        <w:p>
-          <w:pPr>
-            <w:pStyle w:val="9"/>
-            <w:tabs>
-              <w:tab w:val="right" w:leader="dot" w:pos="9026"/>
-            </w:tabs>
-            <w:spacing w:before="120" w:after="60"/>
-          </w:pPr>
-          <w:hyperlink w:anchor="_Toc100017" w:history="1">
-            <w:r>
-              <w:rPr>
-                <w:rStyle w:val="Hyperlink"/>
-              </w:rPr>
-              <w:t>6. Медиа-подсистема: сеть, фильмы, плеер, индикация (E-16, E-17, E-19, E-20)</w:t>
-            </w:r>
-            <w:r>
-              <w:tab/>
-            </w:r>
-            <w:r>
-              <w:fldChar w:fldCharType="begin"/>
-            </w:r>
-            <w:r>
-              <w:instrText xml:space="preserve"> PAGEREF _Toc100017 \h </w:instrText>
-            </w:r>
-            <w:r>
-              <w:fldChar w:fldCharType="separate"/>
-            </w:r>
-            <w:r>
-              <w:t>9</w:t>
-            </w:r>
-            <w:r>
-              <w:fldChar w:fldCharType="end"/>
-            </w:r>
-          </w:hyperlink>
-        </w:p>
-        <w:p>
-          <w:pPr>
-            <w:pStyle w:val="11"/>
-            <w:ind w:left="360"/>
-            <w:tabs>
-              <w:tab w:val="right" w:leader="dot" w:pos="9026"/>
-            </w:tabs>
-            <w:spacing w:before="120" w:after="60"/>
-          </w:pPr>
-          <w:hyperlink w:anchor="_Toc100018" w:history="1">
-            <w:r>
-              <w:rPr>
-                <w:rStyle w:val="Hyperlink"/>
-              </w:rPr>
-              <w:t>E-16. Все фильмы отклонялись с «сервер не ответил»</w:t>
-            </w:r>
-            <w:r>
-              <w:tab/>
-            </w:r>
-            <w:r>
-              <w:fldChar w:fldCharType="begin"/>
-            </w:r>
-            <w:r>
-              <w:instrText xml:space="preserve"> PAGEREF _Toc100018 \h </w:instrText>
-            </w:r>
-            <w:r>
-              <w:fldChar w:fldCharType="separate"/>
-            </w:r>
-            <w:r>
-              <w:t>9</w:t>
-            </w:r>
-            <w:r>
-              <w:fldChar w:fldCharType="end"/>
-            </w:r>
-          </w:hyperlink>
-        </w:p>
-        <w:p>
-          <w:pPr>
-            <w:pStyle w:val="11"/>
-            <w:ind w:left="360"/>
-            <w:tabs>
-              <w:tab w:val="right" w:leader="dot" w:pos="9026"/>
-            </w:tabs>
-            <w:spacing w:before="120" w:after="60"/>
-          </w:pPr>
-          <w:hyperlink w:anchor="_Toc100019" w:history="1">
-            <w:r>
-              <w:rPr>
-                <w:rStyle w:val="Hyperlink"/>
-              </w:rPr>
-              <w:t>E-17. Экран молчит минуты при долгих операциях — «контроллер повис?»</w:t>
-            </w:r>
-            <w:r>
-              <w:tab/>
-            </w:r>
-            <w:r>
-              <w:fldChar w:fldCharType="begin"/>
-            </w:r>
-            <w:r>
-              <w:instrText xml:space="preserve"> PAGEREF _Toc100019 \h </w:instrText>
-            </w:r>
-            <w:r>
-              <w:fldChar w:fldCharType="separate"/>
-            </w:r>
-            <w:r>
-              <w:t>9</w:t>
-            </w:r>
-            <w:r>
-              <w:fldChar w:fldCharType="end"/>
-            </w:r>
-          </w:hyperlink>
-        </w:p>
-        <w:p>
-          <w:pPr>
-            <w:pStyle w:val="11"/>
-            <w:ind w:left="360"/>
-            <w:tabs>
-              <w:tab w:val="right" w:leader="dot" w:pos="9026"/>
-            </w:tabs>
-            <w:spacing w:before="120" w:after="60"/>
-          </w:pPr>
-          <w:hyperlink w:anchor="_Toc100020" w:history="1">
-            <w:r>
-              <w:rPr>
-                <w:rStyle w:val="Hyperlink"/>
-              </w:rPr>
-              <w:t>E-19. Спам «Write too slow», гейт буферизации отключается, «Failed to set event cb»</w:t>
-            </w:r>
-            <w:r>
-              <w:tab/>
-            </w:r>
-            <w:r>
-              <w:fldChar w:fldCharType="begin"/>
-            </w:r>
-            <w:r>
-              <w:instrText xml:space="preserve"> PAGEREF _Toc100020 \h </w:instrText>
-            </w:r>
-            <w:r>
-              <w:fldChar w:fldCharType="separate"/>
-            </w:r>
-            <w:r>
-              <w:t>10</w:t>
-            </w:r>
-            <w:r>
-              <w:fldChar w:fldCharType="end"/>
-            </w:r>
-          </w:hyperlink>
-        </w:p>
-        <w:p>
-          <w:pPr>
-            <w:pStyle w:val="11"/>
-            <w:ind w:left="360"/>
-            <w:tabs>
-              <w:tab w:val="right" w:leader="dot" w:pos="9026"/>
-            </w:tabs>
-            <w:spacing w:before="120" w:after="60"/>
-          </w:pPr>
-          <w:hyperlink w:anchor="_Toc100021" w:history="1">
-            <w:r>
-              <w:rPr>
-                <w:rStyle w:val="Hyperlink"/>
-              </w:rPr>
-              <w:t>E-20. «The Flame»: мгновенный ложный «сервер не ответил» — moov &gt; 4 МБ</w:t>
-            </w:r>
-            <w:r>
-              <w:tab/>
-            </w:r>
-            <w:r>
-              <w:fldChar w:fldCharType="begin"/>
-            </w:r>
-            <w:r>
-              <w:instrText xml:space="preserve"> PAGEREF _Toc100021 \h </w:instrText>
-            </w:r>
-            <w:r>
-              <w:fldChar w:fldCharType="separate"/>
-            </w:r>
-            <w:r>
-              <w:t>10</w:t>
-            </w:r>
-            <w:r>
-              <w:fldChar w:fldCharType="end"/>
-            </w:r>
-          </w:hyperlink>
-        </w:p>
-        <w:p>
-          <w:pPr>
-            <w:pStyle w:val="9"/>
-            <w:tabs>
-              <w:tab w:val="right" w:leader="dot" w:pos="9026"/>
-            </w:tabs>
-            <w:spacing w:before="120" w:after="60"/>
-          </w:pPr>
-          <w:hyperlink w:anchor="_Toc100022" w:history="1">
-            <w:r>
-              <w:rPr>
-                <w:rStyle w:val="Hyperlink"/>
-              </w:rPr>
-              <w:t>7. Инфраструктура и окружение (E-03, E-13, E-14)</w:t>
-            </w:r>
-            <w:r>
-              <w:tab/>
-            </w:r>
-            <w:r>
-              <w:fldChar w:fldCharType="begin"/>
-            </w:r>
-            <w:r>
-              <w:instrText xml:space="preserve"> PAGEREF _Toc100022 \h </w:instrText>
-            </w:r>
-            <w:r>
-              <w:fldChar w:fldCharType="separate"/>
-            </w:r>
-            <w:r>
-              <w:t>11</w:t>
-            </w:r>
-            <w:r>
-              <w:fldChar w:fldCharType="end"/>
-            </w:r>
-          </w:hyperlink>
-        </w:p>
-        <w:p>
-          <w:pPr>
-            <w:pStyle w:val="11"/>
-            <w:ind w:left="360"/>
-            <w:tabs>
-              <w:tab w:val="right" w:leader="dot" w:pos="9026"/>
-            </w:tabs>
-            <w:spacing w:before="120" w:after="60"/>
-          </w:pPr>
-          <w:hyperlink w:anchor="_Toc100023" w:history="1">
-            <w:r>
-              <w:rPr>
-                <w:rStyle w:val="Hyperlink"/>
-              </w:rPr>
-              <w:t>E-13. Проблемы окружения: инструменты, токен, контейнеризация</w:t>
-            </w:r>
-            <w:r>
-              <w:tab/>
-            </w:r>
-            <w:r>
-              <w:fldChar w:fldCharType="begin"/>
-            </w:r>
-            <w:r>
-              <w:instrText xml:space="preserve"> PAGEREF _Toc100023 \h </w:instrText>
-            </w:r>
-            <w:r>
-              <w:fldChar w:fldCharType="separate"/>
-            </w:r>
-            <w:r>
-              <w:t>11</w:t>
-            </w:r>
-            <w:r>
-              <w:fldChar w:fldCharType="end"/>
-            </w:r>
-          </w:hyperlink>
-        </w:p>
-        <w:p>
-          <w:pPr>
-            <w:pStyle w:val="11"/>
-            <w:ind w:left="360"/>
-            <w:tabs>
-              <w:tab w:val="right" w:leader="dot" w:pos="9026"/>
-            </w:tabs>
-            <w:spacing w:before="120" w:after="60"/>
-          </w:pPr>
-          <w:hyperlink w:anchor="_Toc100024" w:history="1">
-            <w:r>
-              <w:rPr>
-                <w:rStyle w:val="Hyperlink"/>
-              </w:rPr>
-              <w:t>E-03. Документация репозитория отстала от кода</w:t>
-            </w:r>
-            <w:r>
-              <w:tab/>
-            </w:r>
-            <w:r>
-              <w:fldChar w:fldCharType="begin"/>
-            </w:r>
-            <w:r>
-              <w:instrText xml:space="preserve"> PAGEREF _Toc100024 \h </w:instrText>
-            </w:r>
-            <w:r>
-              <w:fldChar w:fldCharType="separate"/>
-            </w:r>
-            <w:r>
-              <w:t>12</w:t>
-            </w:r>
-            <w:r>
-              <w:fldChar w:fldCharType="end"/>
-            </w:r>
-          </w:hyperlink>
-        </w:p>
-        <w:p>
-          <w:pPr>
-            <w:pStyle w:val="11"/>
-            <w:ind w:left="360"/>
-            <w:tabs>
-              <w:tab w:val="right" w:leader="dot" w:pos="9026"/>
-            </w:tabs>
-            <w:spacing w:before="120" w:after="60"/>
-          </w:pPr>
-          <w:hyperlink w:anchor="_Toc100025" w:history="1">
-            <w:r>
-              <w:rPr>
-                <w:rStyle w:val="Hyperlink"/>
-              </w:rPr>
-              <w:t>E-14. Не исправляется: vendor-warning в espressif__esp_lcd_st7701</w:t>
-            </w:r>
-            <w:r>
-              <w:tab/>
-            </w:r>
-            <w:r>
-              <w:fldChar w:fldCharType="begin"/>
-            </w:r>
-            <w:r>
-              <w:instrText xml:space="preserve"> PAGEREF _Toc100025 \h </w:instrText>
-            </w:r>
-            <w:r>
-              <w:fldChar w:fldCharType="separate"/>
-            </w:r>
-            <w:r>
-              <w:t>12</w:t>
-            </w:r>
-            <w:r>
-              <w:fldChar w:fldCharType="end"/>
-            </w:r>
-          </w:hyperlink>
-        </w:p>
-        <w:p>
-          <w:pPr>
-            <w:pStyle w:val="9"/>
-            <w:tabs>
-              <w:tab w:val="right" w:leader="dot" w:pos="9026"/>
-            </w:tabs>
-            <w:spacing w:before="120" w:after="60"/>
-          </w:pPr>
-          <w:hyperlink w:anchor="_Toc100026" w:history="1">
-            <w:r>
-              <w:rPr>
-                <w:rStyle w:val="Hyperlink"/>
-              </w:rPr>
-              <w:t>8. Выводы и практики, внедрённые по итогам</w:t>
-            </w:r>
-            <w:r>
-              <w:tab/>
-            </w:r>
-            <w:r>
-              <w:fldChar w:fldCharType="begin"/>
-            </w:r>
-            <w:r>
-              <w:instrText xml:space="preserve"> PAGEREF _Toc100026 \h </w:instrText>
-            </w:r>
-            <w:r>
-              <w:fldChar w:fldCharType="separate"/>
-            </w:r>
-            <w:r>
-              <w:t>12</w:t>
-            </w:r>
-            <w:r>
-              <w:fldChar w:fldCharType="end"/>
-            </w:r>
-          </w:hyperlink>
         </w:p>
         <w:p>
           <w:r>
@@ -1259,7 +291,6 @@
         <w:pStyle w:val="Heading1"/>
         <w:spacing w:after="160" w:before="360" w:line="312"/>
       </w:pPr>
-      <w:bookmarkStart w:id="100000" w:name="_Toc100000"/>
       <w:r>
         <w:rPr>
           <w:rFonts w:ascii="Arial" w:eastAsia="Arial" w:hAnsi="Arial"/>
@@ -1271,7 +302,6 @@
         </w:rPr>
         <w:t xml:space="preserve">1. Назначение и методика документа</w:t>
       </w:r>
-      <w:bookmarkEnd w:id="100000"/>
     </w:p>
     <w:p>
       <w:pPr>
@@ -1336,7 +366,7 @@
           <w:sz w:val="24"/>
           <w:szCs w:val="24"/>
         </w:rPr>
-        <w:t xml:space="preserve">Журнал открыт: записи E-01…E-14 охватывают первый цикл отладки (подъём сборки на IDF 6, периферия, кириллица), записи E-15…E-20 — второй цикл (SD-карта, подсистема «ФИЛЬМЫ», плеер esp_player, индикация занятости, переход пользователя на локальную сборку). Новые записи добавляются по той же схеме: симптом → причина → решение → урок.</w:t>
+        <w:t xml:space="preserve">Журнал открыт: записи E-01…E-14 охватывают первый цикл отладки (подъём сборки на IDF 6, периферия, кириллица), записи E-15…E-21 — второй цикл (SD-карта, подсистема «ФИЛЬМЫ», плеер esp_player, индикация занятости, переход пользователя на локальную сборку). Новые записи добавляются по той же схеме: симптом → причина → решение → урок.</w:t>
       </w:r>
     </w:p>
     <w:p>
@@ -1344,7 +374,6 @@
         <w:pStyle w:val="Heading1"/>
         <w:spacing w:after="160" w:before="360" w:line="312"/>
       </w:pPr>
-      <w:bookmarkStart w:id="100001" w:name="_Toc100001"/>
       <w:r>
         <w:rPr>
           <w:rFonts w:ascii="Arial" w:eastAsia="Arial" w:hAnsi="Arial"/>
@@ -1356,7 +385,6 @@
         </w:rPr>
         <w:t xml:space="preserve">2. Сводный индекс ошибок</w:t>
       </w:r>
-      <w:bookmarkEnd w:id="100001"/>
     </w:p>
     <w:p>
       <w:pPr>
@@ -4467,6 +3495,152 @@
           </w:p>
         </w:tc>
       </w:tr>
+      <w:tr>
+        <w:trPr>
+          <w:cantSplit/>
+          <w:tblHeader w:val="off"/>
+        </w:trPr>
+        <w:tc>
+          <w:tcPr>
+            <w:tcW w:type="pct" w:w="400"/>
+            <w:tcMar>
+              <w:top w:type="dxa" w:w="60"/>
+              <w:left w:type="dxa" w:w="120"/>
+              <w:bottom w:type="dxa" w:w="60"/>
+              <w:right w:type="dxa" w:w="120"/>
+            </w:tcMar>
+          </w:tcPr>
+          <w:p>
+            <w:pPr>
+              <w:spacing w:line="276"/>
+              <w:jc w:val="left"/>
+            </w:pPr>
+            <w:r>
+              <w:rPr>
+                <w:rFonts w:ascii="Times New Roman" w:eastAsia="Times New Roman" w:hAnsi="Times New Roman"/>
+                <w:b w:val="false"/>
+                <w:bCs w:val="false"/>
+                <w:color w:val="000000"/>
+                <w:sz w:val="20"/>
+                <w:szCs w:val="20"/>
+              </w:rPr>
+              <w:t xml:space="preserve">E-21</w:t>
+            </w:r>
+          </w:p>
+        </w:tc>
+        <w:tc>
+          <w:tcPr>
+            <w:tcW w:type="pct" w:w="1700"/>
+            <w:tcMar>
+              <w:top w:type="dxa" w:w="60"/>
+              <w:left w:type="dxa" w:w="120"/>
+              <w:bottom w:type="dxa" w:w="60"/>
+              <w:right w:type="dxa" w:w="120"/>
+            </w:tcMar>
+          </w:tcPr>
+          <w:p>
+            <w:pPr>
+              <w:spacing w:line="276"/>
+              <w:jc w:val="left"/>
+            </w:pPr>
+            <w:r>
+              <w:rPr>
+                <w:rFonts w:ascii="Times New Roman" w:eastAsia="Times New Roman" w:hAnsi="Times New Roman"/>
+                <w:b w:val="false"/>
+                <w:bCs w:val="false"/>
+                <w:color w:val="000000"/>
+                <w:sz w:val="20"/>
+                <w:szCs w:val="20"/>
+              </w:rPr>
+              <w:t xml:space="preserve">Все фильмы Main отклонялись «нужен Baseline»; повторные moov-пробы</w:t>
+            </w:r>
+          </w:p>
+        </w:tc>
+        <w:tc>
+          <w:tcPr>
+            <w:tcW w:type="pct" w:w="800"/>
+            <w:tcMar>
+              <w:top w:type="dxa" w:w="60"/>
+              <w:left w:type="dxa" w:w="120"/>
+              <w:bottom w:type="dxa" w:w="60"/>
+              <w:right w:type="dxa" w:w="120"/>
+            </w:tcMar>
+          </w:tcPr>
+          <w:p>
+            <w:pPr>
+              <w:spacing w:line="276"/>
+              <w:jc w:val="left"/>
+            </w:pPr>
+            <w:r>
+              <w:rPr>
+                <w:rFonts w:ascii="Times New Roman" w:eastAsia="Times New Roman" w:hAnsi="Times New Roman"/>
+                <w:b w:val="false"/>
+                <w:bCs w:val="false"/>
+                <w:color w:val="000000"/>
+                <w:sz w:val="20"/>
+                <w:szCs w:val="20"/>
+              </w:rPr>
+              <w:t xml:space="preserve">ФИЛЬМЫ / probe</w:t>
+            </w:r>
+          </w:p>
+        </w:tc>
+        <w:tc>
+          <w:tcPr>
+            <w:tcW w:type="pct" w:w="1300"/>
+            <w:tcMar>
+              <w:top w:type="dxa" w:w="60"/>
+              <w:left w:type="dxa" w:w="120"/>
+              <w:bottom w:type="dxa" w:w="60"/>
+              <w:right w:type="dxa" w:w="120"/>
+            </w:tcMar>
+          </w:tcPr>
+          <w:p>
+            <w:pPr>
+              <w:spacing w:line="276"/>
+              <w:jc w:val="left"/>
+            </w:pPr>
+            <w:r>
+              <w:rPr>
+                <w:rFonts w:ascii="Times New Roman" w:eastAsia="Times New Roman" w:hAnsi="Times New Roman"/>
+                <w:b w:val="false"/>
+                <w:bCs w:val="false"/>
+                <w:color w:val="000000"/>
+                <w:sz w:val="20"/>
+                <w:szCs w:val="20"/>
+              </w:rPr>
+              <w:t xml:space="preserve">eab762a</w:t>
+            </w:r>
+          </w:p>
+        </w:tc>
+        <w:tc>
+          <w:tcPr>
+            <w:tcW w:type="pct" w:w="800"/>
+            <w:tcMar>
+              <w:top w:type="dxa" w:w="60"/>
+              <w:left w:type="dxa" w:w="120"/>
+              <w:bottom w:type="dxa" w:w="60"/>
+              <w:right w:type="dxa" w:w="120"/>
+            </w:tcMar>
+          </w:tcPr>
+          <w:p>
+            <w:pPr>
+              <w:spacing w:line="276"/>
+              <w:jc w:val="left"/>
+            </w:pPr>
+            <w:r>
+              <w:rPr>
+                <w:rFonts w:ascii="Times New Roman" w:eastAsia="Times New Roman" w:hAnsi="Times New Roman"/>
+                <w:b w:val="false"/>
+                <w:bCs w:val="false"/>
+                <w:color w:val="000000"/>
+                <w:sz w:val="20"/>
+                <w:szCs w:val="20"/>
+              </w:rPr>
+              <w:t xml:space="preserve">Исправлено</w:t>
+            </w:r>
+          </w:p>
+        </w:tc>
+      </w:tr>
     </w:tbl>
     <w:p>
       <w:pPr>
@@ -4481,7 +3655,7 @@
           <w:sz w:val="24"/>
           <w:szCs w:val="24"/>
         </w:rPr>
-        <w:t xml:space="preserve">Коммиты d2e3606 и 668083b применены пользователем параллельно (содержимое совпало с подготовленным патчем); 343c42f…53482b7 — первый цикл исправлений ветки; 7ab5082…2096994 — второй цикл (медиа-подсистема). После каждого коммита CI завершался SUCCESS; ключевые исправления подтверждены работой на реальной плате (E-04/E-05/E-07/E-08/E-15/E-16/E-17/E-19/E-20). Начиная с E-18 сборку выполняет сам пользователь локально в VS Code ESP-IDF; CI остаётся независимым контролем ревизии.</w:t>
+        <w:t xml:space="preserve">Коммиты d2e3606 и 668083b применены пользователем параллельно (содержимое совпало с подготовленным патчем); 343c42f…53482b7 — первый цикл исправлений ветки; 7ab5082…eab762a — второй цикл (медиа-подсистема). После каждого коммита CI завершался SUCCESS; ключевые исправления подтверждены работой на реальной плате (E-04/E-05/E-07/E-08/E-15/E-16/E-17/E-19/E-20). Начиная с E-18 сборку выполняет сам пользователь локально в VS Code ESP-IDF; CI остаётся независимым контролем ревизии.</w:t>
       </w:r>
     </w:p>
     <w:p>
@@ -4489,7 +3663,6 @@
         <w:pStyle w:val="Heading1"/>
         <w:spacing w:after="160" w:before="360" w:line="312"/>
       </w:pPr>
-      <w:bookmarkStart w:id="100002" w:name="_Toc100002"/>
       <w:r>
         <w:rPr>
           <w:rFonts w:ascii="Arial" w:eastAsia="Arial" w:hAnsi="Arial"/>
@@ -4501,14 +3674,12 @@
         </w:rPr>
         <w:t xml:space="preserve">3. Сборка и конфигурация (E-01, E-02, E-06, E-10–E-12, E-18)</w:t>
       </w:r>
-      <w:bookmarkEnd w:id="100002"/>
     </w:p>
     <w:p>
       <w:pPr>
         <w:pStyle w:val="Heading2"/>
         <w:spacing w:after="120" w:before="260" w:line="312"/>
       </w:pPr>
-      <w:bookmarkStart w:id="100003" w:name="_Toc100003"/>
       <w:r>
         <w:rPr>
           <w:rFonts w:ascii="Arial" w:eastAsia="Arial" w:hAnsi="Arial"/>
@@ -4520,7 +3691,6 @@
         </w:rPr>
         <w:t xml:space="preserve">E-01. Неявное объявление BSP-функций и незапущенный LEDC</w:t>
       </w:r>
-      <w:bookmarkEnd w:id="100003"/>
     </w:p>
     <w:p>
       <w:pPr>
@@ -4646,7 +3816,6 @@
         <w:pStyle w:val="Heading2"/>
         <w:spacing w:after="120" w:before="260" w:line="312"/>
       </w:pPr>
-      <w:bookmarkStart w:id="100004" w:name="_Toc100004"/>
       <w:r>
         <w:rPr>
           <w:rFonts w:ascii="Arial" w:eastAsia="Arial" w:hAnsi="Arial"/>
@@ -4658,7 +3827,6 @@
         </w:rPr>
         <w:t xml:space="preserve">E-02. Опечатка в ветвлении #elif конфигураций плат</w:t>
       </w:r>
-      <w:bookmarkEnd w:id="100004"/>
     </w:p>
     <w:p>
       <w:pPr>
@@ -4820,7 +3988,6 @@
         <w:pStyle w:val="Heading2"/>
         <w:spacing w:after="120" w:before="260" w:line="312"/>
       </w:pPr>
-      <w:bookmarkStart w:id="100005" w:name="_Toc100005"/>
       <w:r>
         <w:rPr>
           <w:rFonts w:ascii="Arial" w:eastAsia="Arial" w:hAnsi="Arial"/>
@@ -4832,7 +3999,6 @@
         </w:rPr>
         <w:t xml:space="preserve">E-06. Выключенная Kconfig-опция не даёт макроса + порядок функций</w:t>
       </w:r>
-      <w:bookmarkEnd w:id="100005"/>
     </w:p>
     <w:p>
       <w:pPr>
@@ -4958,7 +4124,6 @@
         <w:pStyle w:val="Heading2"/>
         <w:spacing w:after="120" w:before="260" w:line="312"/>
       </w:pPr>
-      <w:bookmarkStart w:id="100006" w:name="_Toc100006"/>
       <w:r>
         <w:rPr>
           <w:rFonts w:ascii="Arial" w:eastAsia="Arial" w:hAnsi="Arial"/>
@@ -4970,7 +4135,6 @@
         </w:rPr>
         <w:t xml:space="preserve">E-10. sdkconfig.defaults не применяется к существующему sdkconfig</w:t>
       </w:r>
-      <w:bookmarkEnd w:id="100006"/>
     </w:p>
     <w:p>
       <w:pPr>
@@ -5094,7 +4258,6 @@
         <w:pStyle w:val="Heading2"/>
         <w:spacing w:after="120" w:before="260" w:line="312"/>
       </w:pPr>
-      <w:bookmarkStart w:id="100007" w:name="_Toc100007"/>
       <w:r>
         <w:rPr>
           <w:rFonts w:ascii="Arial" w:eastAsia="Arial" w:hAnsi="Arial"/>
@@ -5106,7 +4269,6 @@
         </w:rPr>
         <w:t xml:space="preserve">E-11. Флеш-чип Boya и E-12. Удаление флага use_dma2d в IDF 6</w:t>
       </w:r>
-      <w:bookmarkEnd w:id="100007"/>
     </w:p>
     <w:p>
       <w:pPr>
@@ -5203,7 +4365,6 @@
         <w:pStyle w:val="Heading2"/>
         <w:spacing w:after="120" w:before="260" w:line="312"/>
       </w:pPr>
-      <w:bookmarkStart w:id="100008" w:name="_Toc100008"/>
       <w:r>
         <w:rPr>
           <w:rFonts w:ascii="Arial" w:eastAsia="Arial" w:hAnsi="Arial"/>
@@ -5215,7 +4376,6 @@
         </w:rPr>
         <w:t xml:space="preserve">E-18. Локальная сборка пользователя падает: -Werror=format на riscv-тулчейне</w:t>
       </w:r>
-      <w:bookmarkEnd w:id="100008"/>
     </w:p>
     <w:p>
       <w:pPr>
@@ -5377,7 +4537,6 @@
         <w:pStyle w:val="Heading1"/>
         <w:spacing w:after="160" w:before="360" w:line="312"/>
       </w:pPr>
-      <w:bookmarkStart w:id="100009" w:name="_Toc100009"/>
       <w:r>
         <w:rPr>
           <w:rFonts w:ascii="Arial" w:eastAsia="Arial" w:hAnsi="Arial"/>
@@ -5389,14 +4548,12 @@
         </w:rPr>
         <w:t xml:space="preserve">4. Периферия платы: тач, ECDSA, дисплей, SD (E-04, E-05, E-07, E-09, E-15)</w:t>
       </w:r>
-      <w:bookmarkEnd w:id="100009"/>
     </w:p>
     <w:p>
       <w:pPr>
         <w:pStyle w:val="Heading2"/>
         <w:spacing w:after="120" w:before="260" w:line="312"/>
       </w:pPr>
-      <w:bookmarkStart w:id="100010" w:name="_Toc100010"/>
       <w:r>
         <w:rPr>
           <w:rFonts w:ascii="Arial" w:eastAsia="Arial" w:hAnsi="Arial"/>
@@ -5408,7 +4565,6 @@
         </w:rPr>
         <w:t xml:space="preserve">E-04. Тачскрин полностью не отвечает (итерация v2)</w:t>
       </w:r>
-      <w:bookmarkEnd w:id="100010"/>
     </w:p>
     <w:p>
       <w:pPr>
@@ -5526,7 +4682,6 @@
         <w:pStyle w:val="Heading2"/>
         <w:spacing w:after="120" w:before="260" w:line="312"/>
       </w:pPr>
-      <w:bookmarkStart w:id="100011" w:name="_Toc100011"/>
       <w:r>
         <w:rPr>
           <w:rFonts w:ascii="Arial" w:eastAsia="Arial" w:hAnsi="Arial"/>
@@ -5538,7 +4693,6 @@
         </w:rPr>
         <w:t xml:space="preserve">E-05. Тач найден, но координаты — мусор (корневой баг, итерация v3)</w:t>
       </w:r>
-      <w:bookmarkEnd w:id="100011"/>
     </w:p>
     <w:p>
       <w:pPr>
@@ -6276,7 +5430,6 @@
         <w:pStyle w:val="Heading2"/>
         <w:spacing w:after="120" w:before="260" w:line="312"/>
       </w:pPr>
-      <w:bookmarkStart w:id="100012" w:name="_Toc100012"/>
       <w:r>
         <w:rPr>
           <w:rFonts w:ascii="Arial" w:eastAsia="Arial" w:hAnsi="Arial"/>
@@ -6288,7 +5441,6 @@
         </w:rPr>
         <w:t xml:space="preserve">E-07. Ошибки «ECDSA peripheral not supported» на каждом HTTPS-хендшейке</w:t>
       </w:r>
-      <w:bookmarkEnd w:id="100012"/>
     </w:p>
     <w:p>
       <w:pPr>
@@ -6414,7 +5566,6 @@
         <w:pStyle w:val="Heading2"/>
         <w:spacing w:after="120" w:before="260" w:line="312"/>
       </w:pPr>
-      <w:bookmarkStart w:id="100013" w:name="_Toc100013"/>
       <w:r>
         <w:rPr>
           <w:rFonts w:ascii="Arial" w:eastAsia="Arial" w:hAnsi="Arial"/>
@@ -6426,7 +5577,6 @@
         </w:rPr>
         <w:t xml:space="preserve">E-09. Переполнение фреймбуфера DPI (историческая, до вхождения в ветку)</w:t>
       </w:r>
-      <w:bookmarkEnd w:id="100013"/>
     </w:p>
     <w:p>
       <w:pPr>
@@ -6487,7 +5637,6 @@
         <w:pStyle w:val="Heading2"/>
         <w:spacing w:after="120" w:before="260" w:line="312"/>
       </w:pPr>
-      <w:bookmarkStart w:id="100014" w:name="_Toc100014"/>
       <w:r>
         <w:rPr>
           <w:rFonts w:ascii="Arial" w:eastAsia="Arial" w:hAnsi="Arial"/>
@@ -6499,7 +5648,6 @@
         </w:rPr>
         <w:t xml:space="preserve">E-15. Кнопка «Обновить» на SD: esp_ldo_acquire_channel already in use</w:t>
       </w:r>
-      <w:bookmarkEnd w:id="100014"/>
     </w:p>
     <w:p>
       <w:pPr>
@@ -6625,7 +5773,6 @@
         <w:pStyle w:val="Heading1"/>
         <w:spacing w:after="160" w:before="360" w:line="312"/>
       </w:pPr>
-      <w:bookmarkStart w:id="100015" w:name="_Toc100015"/>
       <w:r>
         <w:rPr>
           <w:rFonts w:ascii="Arial" w:eastAsia="Arial" w:hAnsi="Arial"/>
@@ -6637,14 +5784,12 @@
         </w:rPr>
         <w:t xml:space="preserve">5. Интерфейс: кириллица и клавиатура (E-08)</w:t>
       </w:r>
-      <w:bookmarkEnd w:id="100015"/>
     </w:p>
     <w:p>
       <w:pPr>
         <w:pStyle w:val="Heading2"/>
         <w:spacing w:after="120" w:before="260" w:line="312"/>
       </w:pPr>
-      <w:bookmarkStart w:id="100016" w:name="_Toc100016"/>
       <w:r>
         <w:rPr>
           <w:rFonts w:ascii="Arial" w:eastAsia="Arial" w:hAnsi="Arial"/>
@@ -6656,7 +5801,6 @@
         </w:rPr>
         <w:t xml:space="preserve">E-08. Русский текст отображался знаками «?»</w:t>
       </w:r>
-      <w:bookmarkEnd w:id="100016"/>
     </w:p>
     <w:p>
       <w:pPr>
@@ -6762,7 +5906,6 @@
         <w:pStyle w:val="Heading1"/>
         <w:spacing w:after="160" w:before="360" w:line="312"/>
       </w:pPr>
-      <w:bookmarkStart w:id="100017" w:name="_Toc100017"/>
       <w:r>
         <w:rPr>
           <w:rFonts w:ascii="Arial" w:eastAsia="Arial" w:hAnsi="Arial"/>
@@ -6772,9 +5915,8 @@
           <w:sz w:val="32"/>
           <w:szCs w:val="32"/>
         </w:rPr>
-        <w:t xml:space="preserve">6. Медиа-подсистема: сеть, фильмы, плеер, индикация (E-16, E-17, E-19, E-20)</w:t>
-      </w:r>
-      <w:bookmarkEnd w:id="100017"/>
+        <w:t xml:space="preserve">6. Медиа-подсистема: сеть, фильмы, плеер, индикация (E-16, E-17, E-19, E-20, E-21)</w:t>
+      </w:r>
     </w:p>
     <w:p>
       <w:pPr>
@@ -6797,7 +5939,6 @@
         <w:pStyle w:val="Heading2"/>
         <w:spacing w:after="120" w:before="260" w:line="312"/>
       </w:pPr>
-      <w:bookmarkStart w:id="100018" w:name="_Toc100018"/>
       <w:r>
         <w:rPr>
           <w:rFonts w:ascii="Arial" w:eastAsia="Arial" w:hAnsi="Arial"/>
@@ -6809,7 +5950,6 @@
         </w:rPr>
         <w:t xml:space="preserve">E-16. Все фильмы отклонялись с «сервер не ответил»</w:t>
       </w:r>
-      <w:bookmarkEnd w:id="100018"/>
     </w:p>
     <w:p>
       <w:pPr>
@@ -6935,7 +6075,6 @@
         <w:pStyle w:val="Heading2"/>
         <w:spacing w:after="120" w:before="260" w:line="312"/>
       </w:pPr>
-      <w:bookmarkStart w:id="100019" w:name="_Toc100019"/>
       <w:r>
         <w:rPr>
           <w:rFonts w:ascii="Arial" w:eastAsia="Arial" w:hAnsi="Arial"/>
@@ -6947,7 +6086,6 @@
         </w:rPr>
         <w:t xml:space="preserve">E-17. Экран молчит минуты при долгих операциях — «контроллер повис?»</w:t>
       </w:r>
-      <w:bookmarkEnd w:id="100019"/>
     </w:p>
     <w:p>
       <w:pPr>
@@ -7075,7 +6213,6 @@
         <w:pStyle w:val="Heading2"/>
         <w:spacing w:after="120" w:before="260" w:line="312"/>
       </w:pPr>
-      <w:bookmarkStart w:id="100020" w:name="_Toc100020"/>
       <w:r>
         <w:rPr>
           <w:rFonts w:ascii="Arial" w:eastAsia="Arial" w:hAnsi="Arial"/>
@@ -7087,7 +6224,6 @@
         </w:rPr>
         <w:t xml:space="preserve">E-19. Спам «Write too slow», гейт буферизации отключается, «Failed to set event cb»</w:t>
       </w:r>
-      <w:bookmarkEnd w:id="100020"/>
     </w:p>
     <w:p>
       <w:pPr>
@@ -7809,7 +6945,6 @@
         <w:pStyle w:val="Heading2"/>
         <w:spacing w:after="120" w:before="260" w:line="312"/>
       </w:pPr>
-      <w:bookmarkStart w:id="100021" w:name="_Toc100021"/>
       <w:r>
         <w:rPr>
           <w:rFonts w:ascii="Arial" w:eastAsia="Arial" w:hAnsi="Arial"/>
@@ -7821,7 +6956,6 @@
         </w:rPr>
         <w:t xml:space="preserve">E-20. «The Flame»: мгновенный ложный «сервер не ответил» — moov &gt; 4 МБ</w:t>
       </w:r>
-      <w:bookmarkEnd w:id="100021"/>
     </w:p>
     <w:p>
       <w:pPr>
@@ -7944,10 +7078,145 @@
     </w:p>
     <w:p>
       <w:pPr>
+        <w:pStyle w:val="Heading2"/>
+        <w:spacing w:after="120" w:before="260" w:line="312"/>
+      </w:pPr>
+      <w:r>
+        <w:rPr>
+          <w:rFonts w:ascii="Arial" w:eastAsia="Arial" w:hAnsi="Arial"/>
+          <w:b/>
+          <w:bCs/>
+          <w:color w:val="0F2B40"/>
+          <w:sz w:val="28"/>
+          <w:szCs w:val="28"/>
+        </w:rPr>
+        <w:t xml:space="preserve">E-21. Все фильмы Main отклонялись: «нужен H.264 Baseline»; повторные 4,5 МБ moov-пробы</w:t>
+      </w:r>
+    </w:p>
+    <w:p>
+      <w:pPr>
+        <w:spacing w:after="80" w:line="312"/>
+        <w:ind w:firstLine="480"/>
+        <w:jc w:val="both"/>
+      </w:pPr>
+      <w:r>
+        <w:rPr>
+          <w:rFonts w:ascii="Times New Roman" w:eastAsia="Times New Roman" w:hAnsi="Times New Roman"/>
+          <w:b/>
+          <w:bCs/>
+          <w:color w:val="000000"/>
+          <w:sz w:val="24"/>
+          <w:szCs w:val="24"/>
+        </w:rPr>
+        <w:t xml:space="preserve">Симптом. </w:t>
+      </w:r>
+      <w:r>
+        <w:rPr>
+          <w:rFonts w:ascii="Times New Roman" w:eastAsia="Times New Roman" w:hAnsi="Times New Roman"/>
+          <w:color w:val="000000"/>
+          <w:sz w:val="24"/>
+          <w:szCs w:val="24"/>
+        </w:rPr>
+        <w:t xml:space="preserve">Лог g20060e4-dirty: четыре фильма подряд (Crawlspace, Territories, The Mountie, Red State) отклонены после многосекундных проб: </w:t>
+      </w:r>
+      <w:r>
+        <w:rPr>
+          <w:rFonts w:ascii="Consolas" w:eastAsia="Consolas" w:hAnsi="Consolas"/>
+          <w:color w:val="000000"/>
+          <w:sz w:val="24"/>
+          <w:szCs w:val="24"/>
+        </w:rPr>
+        <w:t xml:space="preserve">avcC: profile=77 constraint=0x40 … нужен H.264 Baseline</w:t>
+      </w:r>
+      <w:r>
+        <w:rPr>
+          <w:rFonts w:ascii="Times New Roman" w:eastAsia="Times New Roman" w:hAnsi="Times New Roman"/>
+          <w:color w:val="000000"/>
+          <w:sz w:val="24"/>
+          <w:szCs w:val="24"/>
+        </w:rPr>
+        <w:t xml:space="preserve">. Пользователь ретапает отклонённые фильмы — вердикт не кэшировался, и каждый повторный тап заново качал весь moov (в логе — дважды по 4,5 МБ, ~3 минуты на пробу при ~20 кБ/с).</w:t>
+      </w:r>
+    </w:p>
+    <w:p>
+      <w:pPr>
+        <w:spacing w:after="80" w:line="312"/>
+        <w:ind w:firstLine="480"/>
+        <w:jc w:val="both"/>
+      </w:pPr>
+      <w:r>
+        <w:rPr>
+          <w:rFonts w:ascii="Times New Roman" w:eastAsia="Times New Roman" w:hAnsi="Times New Roman"/>
+          <w:b/>
+          <w:bCs/>
+          <w:color w:val="000000"/>
+          <w:sz w:val="24"/>
+          <w:szCs w:val="24"/>
+        </w:rPr>
+        <w:t xml:space="preserve">Корневая причина (две независимые). </w:t>
+      </w:r>
+      <w:r>
+        <w:rPr>
+          <w:rFonts w:ascii="Times New Roman" w:eastAsia="Times New Roman" w:hAnsi="Times New Roman"/>
+          <w:color w:val="000000"/>
+          <w:sz w:val="24"/>
+          <w:szCs w:val="24"/>
+        </w:rPr>
+        <w:t xml:space="preserve">(1) Профильный gate проверял только profile==66. Но у всех этих рипов установлен constraint_set1_flag (0x40): по спецификации H.264 такой поток ограничен инструментами Baseline (CAVLC, без B-кадров). Сверка с фактическим декодером (исходники esp_h264 1.4.1 / esp_video_codec 0.5.7): SW-декодер — h264bsd, его SPS-парсер вообще не смотрит на profile_idc (печатает лишь отладочную пометку), а PPS-парсер отклоняет только CABAC — то есть constrained-Main он декодирует. HW-декодера H.264 на ESP32-P4 нет вовсе (esp_h264 несёт только HW-энкодер) — прежний отказ от 77 ничего не защищал, просто отсекал весь каталог. (2) Вердикт пробы не запоминался между тапами: повторная проба повторяла и чтение индекса.</w:t>
+      </w:r>
+    </w:p>
+    <w:p>
+      <w:pPr>
+        <w:spacing w:after="80" w:line="312"/>
+        <w:ind w:firstLine="480"/>
+        <w:jc w:val="both"/>
+      </w:pPr>
+      <w:r>
+        <w:rPr>
+          <w:rFonts w:ascii="Times New Roman" w:eastAsia="Times New Roman" w:hAnsi="Times New Roman"/>
+          <w:b/>
+          <w:bCs/>
+          <w:color w:val="000000"/>
+          <w:sz w:val="24"/>
+          <w:szCs w:val="24"/>
+        </w:rPr>
+        <w:t xml:space="preserve">Решение (коммит eab762a). </w:t>
+      </w:r>
+      <w:r>
+        <w:rPr>
+          <w:rFonts w:ascii="Times New Roman" w:eastAsia="Times New Roman" w:hAnsi="Times New Roman"/>
+          <w:color w:val="000000"/>
+          <w:sz w:val="24"/>
+          <w:szCs w:val="24"/>
+        </w:rPr>
+        <w:t xml:space="preserve">(1) Gate: Baseline (66) — всегда; Main (77) — при constraint_set1 и отсутствии B-кадров; B-кадры детектируются по боксу ctts (ненулевые композиционные сдвиги существуют только при pts ≠ dts) — защита от кодировщиков, ставящих флаг небрежно; High и Main без флага отклоняются с честной строкой «нужен H.264 Baseline/Main(constr.)». (2) Проба переведена на «ленивый» обход moov через скользящее окно 64 КБ: дочерние боксы пропускаются по заголовку, качаются только hdlr/stsd/avcC/ctts — десятки КБ за 1–4 запроса; moov целиком больше не скачивается, лимит 12 МБ стал санитарным 64 МБ (индексы вроде The Flame больше не отсекаются). (3) Транспортный буфер Range-чтений 4 → 32 КБ: именно окно приёма ограничивало поток ~20 кБ/с. (4) Кэш вердиктов (8 LRU по URL): повторный тап мгновенен; транспортные коды (NET/NO_RANGE) не кэшируются. Покрыто host-тестами (31 проверка: синтетические и реальные ffmpeg-фикстуры через фейковый HTTP-слой с ассертами на вердикты/запросы/трафик). </w:t>
+      </w:r>
+      <w:r>
+        <w:rPr>
+          <w:rFonts w:ascii="Times New Roman" w:eastAsia="Times New Roman" w:hAnsi="Times New Roman"/>
+          <w:b/>
+          <w:bCs/>
+          <w:color w:val="000000"/>
+          <w:sz w:val="24"/>
+          <w:szCs w:val="24"/>
+        </w:rPr>
+        <w:t xml:space="preserve">Урок: </w:t>
+      </w:r>
+      <w:r>
+        <w:rPr>
+          <w:rFonts w:ascii="Times New Roman" w:eastAsia="Times New Roman" w:hAnsi="Times New Roman"/>
+          <w:color w:val="000000"/>
+          <w:sz w:val="24"/>
+          <w:szCs w:val="24"/>
+        </w:rPr>
+        <w:t xml:space="preserve">ограничения декодера брать из его фактического кода, а не из номера профиля в avcC; constraint_set1 — нормативный признак Baseline-совместимости, ctts — дешёвый прокси наличия B-кадров; любой детерминированный вердикт обязан кэшироваться — повторная дорогая проба это баг.</w:t>
+      </w:r>
+    </w:p>
+    <w:p>
+      <w:pPr>
         <w:pStyle w:val="Heading1"/>
         <w:spacing w:after="160" w:before="360" w:line="312"/>
       </w:pPr>
-      <w:bookmarkStart w:id="100022" w:name="_Toc100022"/>
       <w:r>
         <w:rPr>
           <w:rFonts w:ascii="Arial" w:eastAsia="Arial" w:hAnsi="Arial"/>
@@ -7959,14 +7228,12 @@
         </w:rPr>
         <w:t xml:space="preserve">7. Инфраструктура и окружение (E-03, E-13, E-14)</w:t>
       </w:r>
-      <w:bookmarkEnd w:id="100022"/>
     </w:p>
     <w:p>
       <w:pPr>
         <w:pStyle w:val="Heading2"/>
         <w:spacing w:after="120" w:before="260" w:line="312"/>
       </w:pPr>
-      <w:bookmarkStart w:id="100023" w:name="_Toc100023"/>
       <w:r>
         <w:rPr>
           <w:rFonts w:ascii="Arial" w:eastAsia="Arial" w:hAnsi="Arial"/>
@@ -7978,7 +7245,6 @@
         </w:rPr>
         <w:t xml:space="preserve">E-13. Проблемы окружения: инструменты, токен, контейнеризация</w:t>
       </w:r>
-      <w:bookmarkEnd w:id="100023"/>
     </w:p>
     <w:p>
       <w:pPr>
@@ -8066,7 +7332,6 @@
         <w:pStyle w:val="Heading2"/>
         <w:spacing w:after="120" w:before="260" w:line="312"/>
       </w:pPr>
-      <w:bookmarkStart w:id="100024" w:name="_Toc100024"/>
       <w:r>
         <w:rPr>
           <w:rFonts w:ascii="Arial" w:eastAsia="Arial" w:hAnsi="Arial"/>
@@ -8078,7 +7343,6 @@
         </w:rPr>
         <w:t xml:space="preserve">E-03. Документация репозитория отстала от кода</w:t>
       </w:r>
-      <w:bookmarkEnd w:id="100024"/>
     </w:p>
     <w:p>
       <w:pPr>
@@ -8101,7 +7365,6 @@
         <w:pStyle w:val="Heading2"/>
         <w:spacing w:after="120" w:before="260" w:line="312"/>
       </w:pPr>
-      <w:bookmarkStart w:id="100025" w:name="_Toc100025"/>
       <w:r>
         <w:rPr>
           <w:rFonts w:ascii="Arial" w:eastAsia="Arial" w:hAnsi="Arial"/>
@@ -8113,7 +7376,6 @@
         </w:rPr>
         <w:t xml:space="preserve">E-14. Не исправляется: vendor-warning в espressif__esp_lcd_st7701</w:t>
       </w:r>
-      <w:bookmarkEnd w:id="100025"/>
     </w:p>
     <w:p>
       <w:pPr>
@@ -8136,7 +7398,6 @@
         <w:pStyle w:val="Heading1"/>
         <w:spacing w:after="160" w:before="360" w:line="312"/>
       </w:pPr>
-      <w:bookmarkStart w:id="100026" w:name="_Toc100026"/>
       <w:r>
         <w:rPr>
           <w:rFonts w:ascii="Arial" w:eastAsia="Arial" w:hAnsi="Arial"/>
@@ -8148,7 +7409,6 @@
         </w:rPr>
         <w:t xml:space="preserve">8. Выводы и практики, внедрённые по итогам</w:t>
       </w:r>
-      <w:bookmarkEnd w:id="100026"/>
     </w:p>
     <w:p>
       <w:pPr>
@@ -8163,7 +7423,7 @@
           <w:sz w:val="24"/>
           <w:szCs w:val="24"/>
         </w:rPr>
-        <w:t xml:space="preserve">За два цикла отладки (9adf20e → 2096994) закрыты: три критичных дефекта периферии (Ethernet не поднялся бы без сброса PHY и правильного тактирования; тач не отвечал без hw-reset и верной шины; координаты были мусором из-за однобайтового смещения регистра), две системные проблемы конфигурации (старение sdkconfig, ECDSA-периферия по ревизии чипа), полный конвейер кириллицы, состояние SD-драйвера при повторной инициализации, сквозной тракт воспроизведения фильмов (прямой URL узла, честные коды ошибок, лимит moov) и видимость долгих операций (busy-карточка). Ни одна ошибка не потребовала изменения железа — все решения вошли в код/конфиг и подтверждены на плате.</w:t>
+        <w:t xml:space="preserve">За два цикла отладки (9adf20e → eab762a) закрыты: три критичных дефекта периферии (Ethernet не поднялся бы без сброса PHY и правильного тактирования; тач не отвечал без hw-reset и верной шины; координаты были мусором из-за однобайтового смещения регистра), две системные проблемы конфигурации (старение sdkconfig, ECDSA-периферия по ревизии чипа), полный конвейер кириллицы, состояние SD-драйвера при повторной инициализации, сквозной тракт воспроизведения фильмов (прямой URL узла, честные коды ошибок, ленивая проба, профильный gate по факту декодера, кэш вердиктов) и видимость долгих операций (busy-карточка). Ни одна ошибка не потребовала изменения железа — все решения вошли в код/конфиг и подтверждены на плате.</w:t>
       </w:r>
     </w:p>
     <w:p>
@@ -8407,6 +7667,32 @@
           <w:szCs w:val="24"/>
         </w:rPr>
         <w:t xml:space="preserve">9. </w:t>
+      </w:r>
+      <w:r>
+        <w:rPr>
+          <w:rFonts w:ascii="Times New Roman" w:eastAsia="Times New Roman" w:hAnsi="Times New Roman"/>
+          <w:color w:val="000000"/>
+          <w:sz w:val="24"/>
+          <w:szCs w:val="24"/>
+        </w:rPr>
+        <w:t xml:space="preserve">Ограничения декодера сверять с его исходниками, а не с названием профиля: h264bsd игнорирует profile_idc, зато жёстко отвергает CABAC — gate пускает constrained-Main и честно отклоняет High (E-21).</w:t>
+      </w:r>
+    </w:p>
+    <w:p>
+      <w:pPr>
+        <w:spacing w:after="80" w:line="312"/>
+        <w:jc w:val="both"/>
+      </w:pPr>
+      <w:r>
+        <w:rPr>
+          <w:rFonts w:ascii="Times New Roman" w:eastAsia="Times New Roman" w:hAnsi="Times New Roman"/>
+          <w:b/>
+          <w:bCs/>
+          <w:color w:val="000000"/>
+          <w:sz w:val="24"/>
+          <w:szCs w:val="24"/>
+        </w:rPr>
+        <w:t xml:space="preserve">10. </w:t>
       </w:r>
       <w:r>
         <w:rPr>
@@ -8705,9 +7991,6 @@
     </w:rPr>
   </w:style>
   <w:style w:type="paragraph" w:styleId="Heading3">
-    <w:pPr>
-      <w:outlineLvl w:val="2"/>
-    </w:pPr>
     <w:name w:val="Heading 3"/>
     <w:basedOn w:val="Normal"/>
     <w:next w:val="Normal"/>
@@ -8719,9 +8002,6 @@
     </w:rPr>
   </w:style>
   <w:style w:type="paragraph" w:styleId="Heading4">
-    <w:pPr>
-      <w:outlineLvl w:val="3"/>
-    </w:pPr>
     <w:name w:val="Heading 4"/>
     <w:basedOn w:val="Normal"/>
     <w:next w:val="Normal"/>
@@ -8733,9 +8013,6 @@
     </w:rPr>
   </w:style>
   <w:style w:type="paragraph" w:styleId="Heading5">
-    <w:pPr>
-      <w:outlineLvl w:val="4"/>
-    </w:pPr>
     <w:name w:val="Heading 5"/>
     <w:basedOn w:val="Normal"/>
     <w:next w:val="Normal"/>
@@ -8745,9 +8022,6 @@
     </w:rPr>
   </w:style>
   <w:style w:type="paragraph" w:styleId="Heading6">
-    <w:pPr>
-      <w:outlineLvl w:val="5"/>
-    </w:pPr>
     <w:name w:val="Heading 6"/>
     <w:basedOn w:val="Normal"/>
     <w:next w:val="Normal"/>
@@ -8854,45 +8128,6 @@
       <w:sz w:val="20"/>
       <w:szCs w:val="20"/>
     </w:rPr>
-  </w:style>
-  <w:style xmlns:w="http://schemas.openxmlformats.org/wordprocessingml/2006/main" w:type="paragraph" w:styleId="9">
-    <w:name w:val="toc 1"/>
-    <w:basedOn w:val="Normal"/>
-    <w:uiPriority w:val="39"/>
-    <w:pPr>
-      <w:tabs>
-        <w:tab w:val="right" w:leader="dot" w:pos="9026"/>
-      </w:tabs>
-      <w:spacing w:before="120" w:after="60"/>
-    </w:pPr>
-    <w:rPr>
-      <w:b/>
-      <w:bCs/>
-    </w:rPr>
-  </w:style>
-  <w:style xmlns:w="http://schemas.openxmlformats.org/wordprocessingml/2006/main" w:type="paragraph" w:styleId="11">
-    <w:name w:val="toc 2"/>
-    <w:basedOn w:val="Normal"/>
-    <w:uiPriority w:val="39"/>
-    <w:pPr>
-      <w:tabs>
-        <w:tab w:val="right" w:leader="dot" w:pos="9026"/>
-      </w:tabs>
-      <w:ind w:left="360"/>
-      <w:spacing w:before="60" w:after="40"/>
-    </w:pPr>
-  </w:style>
-  <w:style xmlns:w="http://schemas.openxmlformats.org/wordprocessingml/2006/main" w:type="paragraph" w:styleId="12">
-    <w:name w:val="toc 3"/>
-    <w:basedOn w:val="Normal"/>
-    <w:uiPriority w:val="39"/>
-    <w:pPr>
-      <w:tabs>
-        <w:tab w:val="right" w:leader="dot" w:pos="9026"/>
-      </w:tabs>
-      <w:ind w:left="720"/>
-      <w:spacing w:before="40" w:after="20"/>
-    </w:pPr>
   </w:style>
 </w:styles>
 </file>

</xml_diff>

<commit_message>
docs: journal E-22 (invisible bottleneck causes, WDT noise) + media doc stats chapter
- Journal: E-22 - buffering cycles + IDLE1 WDT dumps on g-eab762a;
  root causes (lwIP window/RTT ceiling, SW-decode core saturation,
  gate thresholds the pool could never satisfy), fix c1243b6,
  new table: OSD rows -> reading symptoms; lessons 10-11 added.
- Media subsystem doc: new chapter 7 'Экранная статистика
  производительности' (metric sources, symptom reading), buffer
  config table updated to 2MB/256KB/1.5s values, limitations and
  history refreshed, revision bumped to c1243b6.
</commit_message>
<xml_diff>
--- a/docs/CamBrowser_Журнал_ошибок.docx
+++ b/docs/CamBrowser_Журнал_ошибок.docx
@@ -249,9 +249,1049 @@
         <w:p>
           <w:r>
             <w:fldChar w:fldCharType="begin" w:dirty="true"/>
+          </w:r>
+          <w:r>
             <w:instrText xml:space="preserve">TOC \h \o "1-2"</w:instrText>
+          </w:r>
+          <w:r>
             <w:fldChar w:fldCharType="separate"/>
           </w:r>
+        </w:p>
+        <w:p>
+          <w:pPr>
+            <w:pStyle w:val="9"/>
+            <w:tabs>
+              <w:tab w:val="right" w:leader="dot" w:pos="9026"/>
+            </w:tabs>
+            <w:spacing w:before="120" w:after="60"/>
+          </w:pPr>
+          <w:hyperlink w:anchor="_Toc100000" w:history="1">
+            <w:r>
+              <w:rPr>
+                <w:rStyle w:val="Hyperlink"/>
+              </w:rPr>
+              <w:t>1. Назначение и методика документа</w:t>
+            </w:r>
+            <w:r>
+              <w:tab/>
+            </w:r>
+            <w:r>
+              <w:fldChar w:fldCharType="begin"/>
+            </w:r>
+            <w:r>
+              <w:instrText xml:space="preserve"> PAGEREF _Toc100000 \h </w:instrText>
+            </w:r>
+            <w:r>
+              <w:fldChar w:fldCharType="separate"/>
+            </w:r>
+            <w:r>
+              <w:t>1</w:t>
+            </w:r>
+            <w:r>
+              <w:fldChar w:fldCharType="end"/>
+            </w:r>
+          </w:hyperlink>
+        </w:p>
+        <w:p>
+          <w:pPr>
+            <w:pStyle w:val="9"/>
+            <w:tabs>
+              <w:tab w:val="right" w:leader="dot" w:pos="9026"/>
+            </w:tabs>
+            <w:spacing w:before="120" w:after="60"/>
+          </w:pPr>
+          <w:hyperlink w:anchor="_Toc100001" w:history="1">
+            <w:r>
+              <w:rPr>
+                <w:rStyle w:val="Hyperlink"/>
+              </w:rPr>
+              <w:t>2. Сводный индекс ошибок</w:t>
+            </w:r>
+            <w:r>
+              <w:tab/>
+            </w:r>
+            <w:r>
+              <w:fldChar w:fldCharType="begin"/>
+            </w:r>
+            <w:r>
+              <w:instrText xml:space="preserve"> PAGEREF _Toc100001 \h </w:instrText>
+            </w:r>
+            <w:r>
+              <w:fldChar w:fldCharType="separate"/>
+            </w:r>
+            <w:r>
+              <w:t>2</w:t>
+            </w:r>
+            <w:r>
+              <w:fldChar w:fldCharType="end"/>
+            </w:r>
+          </w:hyperlink>
+        </w:p>
+        <w:p>
+          <w:pPr>
+            <w:pStyle w:val="9"/>
+            <w:tabs>
+              <w:tab w:val="right" w:leader="dot" w:pos="9026"/>
+            </w:tabs>
+            <w:spacing w:before="120" w:after="60"/>
+          </w:pPr>
+          <w:hyperlink w:anchor="_Toc100002" w:history="1">
+            <w:r>
+              <w:rPr>
+                <w:rStyle w:val="Hyperlink"/>
+              </w:rPr>
+              <w:t>3. Сборка и конфигурация (E-01, E-02, E-06, E-10–E-12, E-18)</w:t>
+            </w:r>
+            <w:r>
+              <w:tab/>
+            </w:r>
+            <w:r>
+              <w:fldChar w:fldCharType="begin"/>
+            </w:r>
+            <w:r>
+              <w:instrText xml:space="preserve"> PAGEREF _Toc100002 \h </w:instrText>
+            </w:r>
+            <w:r>
+              <w:fldChar w:fldCharType="separate"/>
+            </w:r>
+            <w:r>
+              <w:t>2</w:t>
+            </w:r>
+            <w:r>
+              <w:fldChar w:fldCharType="end"/>
+            </w:r>
+          </w:hyperlink>
+        </w:p>
+        <w:p>
+          <w:pPr>
+            <w:pStyle w:val="11"/>
+            <w:ind w:left="360"/>
+            <w:tabs>
+              <w:tab w:val="right" w:leader="dot" w:pos="9026"/>
+            </w:tabs>
+            <w:spacing w:before="120" w:after="60"/>
+          </w:pPr>
+          <w:hyperlink w:anchor="_Toc100003" w:history="1">
+            <w:r>
+              <w:rPr>
+                <w:rStyle w:val="Hyperlink"/>
+              </w:rPr>
+              <w:t>E-01. Неявное объявление BSP-функций и незапущенный LEDC</w:t>
+            </w:r>
+            <w:r>
+              <w:tab/>
+            </w:r>
+            <w:r>
+              <w:fldChar w:fldCharType="begin"/>
+            </w:r>
+            <w:r>
+              <w:instrText xml:space="preserve"> PAGEREF _Toc100003 \h </w:instrText>
+            </w:r>
+            <w:r>
+              <w:fldChar w:fldCharType="separate"/>
+            </w:r>
+            <w:r>
+              <w:t>2</w:t>
+            </w:r>
+            <w:r>
+              <w:fldChar w:fldCharType="end"/>
+            </w:r>
+          </w:hyperlink>
+        </w:p>
+        <w:p>
+          <w:pPr>
+            <w:pStyle w:val="11"/>
+            <w:ind w:left="360"/>
+            <w:tabs>
+              <w:tab w:val="right" w:leader="dot" w:pos="9026"/>
+            </w:tabs>
+            <w:spacing w:before="120" w:after="60"/>
+          </w:pPr>
+          <w:hyperlink w:anchor="_Toc100004" w:history="1">
+            <w:r>
+              <w:rPr>
+                <w:rStyle w:val="Hyperlink"/>
+              </w:rPr>
+              <w:t>E-02. Опечатка в ветвлении #elif конфигураций плат</w:t>
+            </w:r>
+            <w:r>
+              <w:tab/>
+            </w:r>
+            <w:r>
+              <w:fldChar w:fldCharType="begin"/>
+            </w:r>
+            <w:r>
+              <w:instrText xml:space="preserve"> PAGEREF _Toc100004 \h </w:instrText>
+            </w:r>
+            <w:r>
+              <w:fldChar w:fldCharType="separate"/>
+            </w:r>
+            <w:r>
+              <w:t>3</w:t>
+            </w:r>
+            <w:r>
+              <w:fldChar w:fldCharType="end"/>
+            </w:r>
+          </w:hyperlink>
+        </w:p>
+        <w:p>
+          <w:pPr>
+            <w:pStyle w:val="11"/>
+            <w:ind w:left="360"/>
+            <w:tabs>
+              <w:tab w:val="right" w:leader="dot" w:pos="9026"/>
+            </w:tabs>
+            <w:spacing w:before="120" w:after="60"/>
+          </w:pPr>
+          <w:hyperlink w:anchor="_Toc100005" w:history="1">
+            <w:r>
+              <w:rPr>
+                <w:rStyle w:val="Hyperlink"/>
+              </w:rPr>
+              <w:t>E-06. Выключенная Kconfig-опция не даёт макроса + порядок функций</w:t>
+            </w:r>
+            <w:r>
+              <w:tab/>
+            </w:r>
+            <w:r>
+              <w:fldChar w:fldCharType="begin"/>
+            </w:r>
+            <w:r>
+              <w:instrText xml:space="preserve"> PAGEREF _Toc100005 \h </w:instrText>
+            </w:r>
+            <w:r>
+              <w:fldChar w:fldCharType="separate"/>
+            </w:r>
+            <w:r>
+              <w:t>3</w:t>
+            </w:r>
+            <w:r>
+              <w:fldChar w:fldCharType="end"/>
+            </w:r>
+          </w:hyperlink>
+        </w:p>
+        <w:p>
+          <w:pPr>
+            <w:pStyle w:val="11"/>
+            <w:ind w:left="360"/>
+            <w:tabs>
+              <w:tab w:val="right" w:leader="dot" w:pos="9026"/>
+            </w:tabs>
+            <w:spacing w:before="120" w:after="60"/>
+          </w:pPr>
+          <w:hyperlink w:anchor="_Toc100006" w:history="1">
+            <w:r>
+              <w:rPr>
+                <w:rStyle w:val="Hyperlink"/>
+              </w:rPr>
+              <w:t>E-10. sdkconfig.defaults не применяется к существующему sdkconfig</w:t>
+            </w:r>
+            <w:r>
+              <w:tab/>
+            </w:r>
+            <w:r>
+              <w:fldChar w:fldCharType="begin"/>
+            </w:r>
+            <w:r>
+              <w:instrText xml:space="preserve"> PAGEREF _Toc100006 \h </w:instrText>
+            </w:r>
+            <w:r>
+              <w:fldChar w:fldCharType="separate"/>
+            </w:r>
+            <w:r>
+              <w:t>4</w:t>
+            </w:r>
+            <w:r>
+              <w:fldChar w:fldCharType="end"/>
+            </w:r>
+          </w:hyperlink>
+        </w:p>
+        <w:p>
+          <w:pPr>
+            <w:pStyle w:val="11"/>
+            <w:ind w:left="360"/>
+            <w:tabs>
+              <w:tab w:val="right" w:leader="dot" w:pos="9026"/>
+            </w:tabs>
+            <w:spacing w:before="120" w:after="60"/>
+          </w:pPr>
+          <w:hyperlink w:anchor="_Toc100007" w:history="1">
+            <w:r>
+              <w:rPr>
+                <w:rStyle w:val="Hyperlink"/>
+              </w:rPr>
+              <w:t>E-11. Флеш-чип Boya и E-12. Удаление флага use_dma2d в IDF 6</w:t>
+            </w:r>
+            <w:r>
+              <w:tab/>
+            </w:r>
+            <w:r>
+              <w:fldChar w:fldCharType="begin"/>
+            </w:r>
+            <w:r>
+              <w:instrText xml:space="preserve"> PAGEREF _Toc100007 \h </w:instrText>
+            </w:r>
+            <w:r>
+              <w:fldChar w:fldCharType="separate"/>
+            </w:r>
+            <w:r>
+              <w:t>4</w:t>
+            </w:r>
+            <w:r>
+              <w:fldChar w:fldCharType="end"/>
+            </w:r>
+          </w:hyperlink>
+        </w:p>
+        <w:p>
+          <w:pPr>
+            <w:pStyle w:val="11"/>
+            <w:ind w:left="360"/>
+            <w:tabs>
+              <w:tab w:val="right" w:leader="dot" w:pos="9026"/>
+            </w:tabs>
+            <w:spacing w:before="120" w:after="60"/>
+          </w:pPr>
+          <w:hyperlink w:anchor="_Toc100008" w:history="1">
+            <w:r>
+              <w:rPr>
+                <w:rStyle w:val="Hyperlink"/>
+              </w:rPr>
+              <w:t>E-18. Локальная сборка пользователя падает: -Werror=format на riscv-тулчейне</w:t>
+            </w:r>
+            <w:r>
+              <w:tab/>
+            </w:r>
+            <w:r>
+              <w:fldChar w:fldCharType="begin"/>
+            </w:r>
+            <w:r>
+              <w:instrText xml:space="preserve"> PAGEREF _Toc100008 \h </w:instrText>
+            </w:r>
+            <w:r>
+              <w:fldChar w:fldCharType="separate"/>
+            </w:r>
+            <w:r>
+              <w:t>4</w:t>
+            </w:r>
+            <w:r>
+              <w:fldChar w:fldCharType="end"/>
+            </w:r>
+          </w:hyperlink>
+        </w:p>
+        <w:p>
+          <w:pPr>
+            <w:pStyle w:val="9"/>
+            <w:tabs>
+              <w:tab w:val="right" w:leader="dot" w:pos="9026"/>
+            </w:tabs>
+            <w:spacing w:before="120" w:after="60"/>
+          </w:pPr>
+          <w:hyperlink w:anchor="_Toc100009" w:history="1">
+            <w:r>
+              <w:rPr>
+                <w:rStyle w:val="Hyperlink"/>
+              </w:rPr>
+              <w:t>4. Периферия платы: тач, ECDSA, дисплей, SD (E-04, E-05, E-07, E-09, E-15)</w:t>
+            </w:r>
+            <w:r>
+              <w:tab/>
+            </w:r>
+            <w:r>
+              <w:fldChar w:fldCharType="begin"/>
+            </w:r>
+            <w:r>
+              <w:instrText xml:space="preserve"> PAGEREF _Toc100009 \h </w:instrText>
+            </w:r>
+            <w:r>
+              <w:fldChar w:fldCharType="separate"/>
+            </w:r>
+            <w:r>
+              <w:t>5</w:t>
+            </w:r>
+            <w:r>
+              <w:fldChar w:fldCharType="end"/>
+            </w:r>
+          </w:hyperlink>
+        </w:p>
+        <w:p>
+          <w:pPr>
+            <w:pStyle w:val="11"/>
+            <w:ind w:left="360"/>
+            <w:tabs>
+              <w:tab w:val="right" w:leader="dot" w:pos="9026"/>
+            </w:tabs>
+            <w:spacing w:before="120" w:after="60"/>
+          </w:pPr>
+          <w:hyperlink w:anchor="_Toc100010" w:history="1">
+            <w:r>
+              <w:rPr>
+                <w:rStyle w:val="Hyperlink"/>
+              </w:rPr>
+              <w:t>E-04. Тачскрин полностью не отвечает (итерация v2)</w:t>
+            </w:r>
+            <w:r>
+              <w:tab/>
+            </w:r>
+            <w:r>
+              <w:fldChar w:fldCharType="begin"/>
+            </w:r>
+            <w:r>
+              <w:instrText xml:space="preserve"> PAGEREF _Toc100010 \h </w:instrText>
+            </w:r>
+            <w:r>
+              <w:fldChar w:fldCharType="separate"/>
+            </w:r>
+            <w:r>
+              <w:t>5</w:t>
+            </w:r>
+            <w:r>
+              <w:fldChar w:fldCharType="end"/>
+            </w:r>
+          </w:hyperlink>
+        </w:p>
+        <w:p>
+          <w:pPr>
+            <w:pStyle w:val="11"/>
+            <w:ind w:left="360"/>
+            <w:tabs>
+              <w:tab w:val="right" w:leader="dot" w:pos="9026"/>
+            </w:tabs>
+            <w:spacing w:before="120" w:after="60"/>
+          </w:pPr>
+          <w:hyperlink w:anchor="_Toc100011" w:history="1">
+            <w:r>
+              <w:rPr>
+                <w:rStyle w:val="Hyperlink"/>
+              </w:rPr>
+              <w:t>E-05. Тач найден, но координаты — мусор (корневой баг, итерация v3)</w:t>
+            </w:r>
+            <w:r>
+              <w:tab/>
+            </w:r>
+            <w:r>
+              <w:fldChar w:fldCharType="begin"/>
+            </w:r>
+            <w:r>
+              <w:instrText xml:space="preserve"> PAGEREF _Toc100011 \h </w:instrText>
+            </w:r>
+            <w:r>
+              <w:fldChar w:fldCharType="separate"/>
+            </w:r>
+            <w:r>
+              <w:t>6</w:t>
+            </w:r>
+            <w:r>
+              <w:fldChar w:fldCharType="end"/>
+            </w:r>
+          </w:hyperlink>
+        </w:p>
+        <w:p>
+          <w:pPr>
+            <w:pStyle w:val="11"/>
+            <w:ind w:left="360"/>
+            <w:tabs>
+              <w:tab w:val="right" w:leader="dot" w:pos="9026"/>
+            </w:tabs>
+            <w:spacing w:before="120" w:after="60"/>
+          </w:pPr>
+          <w:hyperlink w:anchor="_Toc100012" w:history="1">
+            <w:r>
+              <w:rPr>
+                <w:rStyle w:val="Hyperlink"/>
+              </w:rPr>
+              <w:t>E-07. Ошибки «ECDSA peripheral not supported» на каждом HTTPS-хендшейке</w:t>
+            </w:r>
+            <w:r>
+              <w:tab/>
+            </w:r>
+            <w:r>
+              <w:fldChar w:fldCharType="begin"/>
+            </w:r>
+            <w:r>
+              <w:instrText xml:space="preserve"> PAGEREF _Toc100012 \h </w:instrText>
+            </w:r>
+            <w:r>
+              <w:fldChar w:fldCharType="separate"/>
+            </w:r>
+            <w:r>
+              <w:t>6</w:t>
+            </w:r>
+            <w:r>
+              <w:fldChar w:fldCharType="end"/>
+            </w:r>
+          </w:hyperlink>
+        </w:p>
+        <w:p>
+          <w:pPr>
+            <w:pStyle w:val="11"/>
+            <w:ind w:left="360"/>
+            <w:tabs>
+              <w:tab w:val="right" w:leader="dot" w:pos="9026"/>
+            </w:tabs>
+            <w:spacing w:before="120" w:after="60"/>
+          </w:pPr>
+          <w:hyperlink w:anchor="_Toc100013" w:history="1">
+            <w:r>
+              <w:rPr>
+                <w:rStyle w:val="Hyperlink"/>
+              </w:rPr>
+              <w:t>E-09. Переполнение фреймбуфера DPI (историческая, до вхождения в ветку)</w:t>
+            </w:r>
+            <w:r>
+              <w:tab/>
+            </w:r>
+            <w:r>
+              <w:fldChar w:fldCharType="begin"/>
+            </w:r>
+            <w:r>
+              <w:instrText xml:space="preserve"> PAGEREF _Toc100013 \h </w:instrText>
+            </w:r>
+            <w:r>
+              <w:fldChar w:fldCharType="separate"/>
+            </w:r>
+            <w:r>
+              <w:t>7</w:t>
+            </w:r>
+            <w:r>
+              <w:fldChar w:fldCharType="end"/>
+            </w:r>
+          </w:hyperlink>
+        </w:p>
+        <w:p>
+          <w:pPr>
+            <w:pStyle w:val="11"/>
+            <w:ind w:left="360"/>
+            <w:tabs>
+              <w:tab w:val="right" w:leader="dot" w:pos="9026"/>
+            </w:tabs>
+            <w:spacing w:before="120" w:after="60"/>
+          </w:pPr>
+          <w:hyperlink w:anchor="_Toc100014" w:history="1">
+            <w:r>
+              <w:rPr>
+                <w:rStyle w:val="Hyperlink"/>
+              </w:rPr>
+              <w:t>E-15. Кнопка «Обновить» на SD: esp_ldo_acquire_channel already in use</w:t>
+            </w:r>
+            <w:r>
+              <w:tab/>
+            </w:r>
+            <w:r>
+              <w:fldChar w:fldCharType="begin"/>
+            </w:r>
+            <w:r>
+              <w:instrText xml:space="preserve"> PAGEREF _Toc100014 \h </w:instrText>
+            </w:r>
+            <w:r>
+              <w:fldChar w:fldCharType="separate"/>
+            </w:r>
+            <w:r>
+              <w:t>7</w:t>
+            </w:r>
+            <w:r>
+              <w:fldChar w:fldCharType="end"/>
+            </w:r>
+          </w:hyperlink>
+        </w:p>
+        <w:p>
+          <w:pPr>
+            <w:pStyle w:val="9"/>
+            <w:tabs>
+              <w:tab w:val="right" w:leader="dot" w:pos="9026"/>
+            </w:tabs>
+            <w:spacing w:before="120" w:after="60"/>
+          </w:pPr>
+          <w:hyperlink w:anchor="_Toc100015" w:history="1">
+            <w:r>
+              <w:rPr>
+                <w:rStyle w:val="Hyperlink"/>
+              </w:rPr>
+              <w:t>5. Интерфейс: кириллица и клавиатура (E-08)</w:t>
+            </w:r>
+            <w:r>
+              <w:tab/>
+            </w:r>
+            <w:r>
+              <w:fldChar w:fldCharType="begin"/>
+            </w:r>
+            <w:r>
+              <w:instrText xml:space="preserve"> PAGEREF _Toc100015 \h </w:instrText>
+            </w:r>
+            <w:r>
+              <w:fldChar w:fldCharType="separate"/>
+            </w:r>
+            <w:r>
+              <w:t>8</w:t>
+            </w:r>
+            <w:r>
+              <w:fldChar w:fldCharType="end"/>
+            </w:r>
+          </w:hyperlink>
+        </w:p>
+        <w:p>
+          <w:pPr>
+            <w:pStyle w:val="11"/>
+            <w:ind w:left="360"/>
+            <w:tabs>
+              <w:tab w:val="right" w:leader="dot" w:pos="9026"/>
+            </w:tabs>
+            <w:spacing w:before="120" w:after="60"/>
+          </w:pPr>
+          <w:hyperlink w:anchor="_Toc100016" w:history="1">
+            <w:r>
+              <w:rPr>
+                <w:rStyle w:val="Hyperlink"/>
+              </w:rPr>
+              <w:t>E-08. Русский текст отображался знаками «?»</w:t>
+            </w:r>
+            <w:r>
+              <w:tab/>
+            </w:r>
+            <w:r>
+              <w:fldChar w:fldCharType="begin"/>
+            </w:r>
+            <w:r>
+              <w:instrText xml:space="preserve"> PAGEREF _Toc100016 \h </w:instrText>
+            </w:r>
+            <w:r>
+              <w:fldChar w:fldCharType="separate"/>
+            </w:r>
+            <w:r>
+              <w:t>8</w:t>
+            </w:r>
+            <w:r>
+              <w:fldChar w:fldCharType="end"/>
+            </w:r>
+          </w:hyperlink>
+        </w:p>
+        <w:p>
+          <w:pPr>
+            <w:pStyle w:val="9"/>
+            <w:tabs>
+              <w:tab w:val="right" w:leader="dot" w:pos="9026"/>
+            </w:tabs>
+            <w:spacing w:before="120" w:after="60"/>
+          </w:pPr>
+          <w:hyperlink w:anchor="_Toc100017" w:history="1">
+            <w:r>
+              <w:rPr>
+                <w:rStyle w:val="Hyperlink"/>
+              </w:rPr>
+              <w:t>6. Медиа-подсистема: сеть, фильмы, плеер, индикация (E-16, E-17, E-19, E-20, E-21, E-22)</w:t>
+            </w:r>
+            <w:r>
+              <w:tab/>
+            </w:r>
+            <w:r>
+              <w:fldChar w:fldCharType="begin"/>
+            </w:r>
+            <w:r>
+              <w:instrText xml:space="preserve"> PAGEREF _Toc100017 \h </w:instrText>
+            </w:r>
+            <w:r>
+              <w:fldChar w:fldCharType="separate"/>
+            </w:r>
+            <w:r>
+              <w:t>9</w:t>
+            </w:r>
+            <w:r>
+              <w:fldChar w:fldCharType="end"/>
+            </w:r>
+          </w:hyperlink>
+        </w:p>
+        <w:p>
+          <w:pPr>
+            <w:pStyle w:val="11"/>
+            <w:ind w:left="360"/>
+            <w:tabs>
+              <w:tab w:val="right" w:leader="dot" w:pos="9026"/>
+            </w:tabs>
+            <w:spacing w:before="120" w:after="60"/>
+          </w:pPr>
+          <w:hyperlink w:anchor="_Toc100018" w:history="1">
+            <w:r>
+              <w:rPr>
+                <w:rStyle w:val="Hyperlink"/>
+              </w:rPr>
+              <w:t>E-16. Все фильмы отклонялись с «сервер не ответил»</w:t>
+            </w:r>
+            <w:r>
+              <w:tab/>
+            </w:r>
+            <w:r>
+              <w:fldChar w:fldCharType="begin"/>
+            </w:r>
+            <w:r>
+              <w:instrText xml:space="preserve"> PAGEREF _Toc100018 \h </w:instrText>
+            </w:r>
+            <w:r>
+              <w:fldChar w:fldCharType="separate"/>
+            </w:r>
+            <w:r>
+              <w:t>9</w:t>
+            </w:r>
+            <w:r>
+              <w:fldChar w:fldCharType="end"/>
+            </w:r>
+          </w:hyperlink>
+        </w:p>
+        <w:p>
+          <w:pPr>
+            <w:pStyle w:val="11"/>
+            <w:ind w:left="360"/>
+            <w:tabs>
+              <w:tab w:val="right" w:leader="dot" w:pos="9026"/>
+            </w:tabs>
+            <w:spacing w:before="120" w:after="60"/>
+          </w:pPr>
+          <w:hyperlink w:anchor="_Toc100019" w:history="1">
+            <w:r>
+              <w:rPr>
+                <w:rStyle w:val="Hyperlink"/>
+              </w:rPr>
+              <w:t>E-17. Экран молчит минуты при долгих операциях — «контроллер повис?»</w:t>
+            </w:r>
+            <w:r>
+              <w:tab/>
+            </w:r>
+            <w:r>
+              <w:fldChar w:fldCharType="begin"/>
+            </w:r>
+            <w:r>
+              <w:instrText xml:space="preserve"> PAGEREF _Toc100019 \h </w:instrText>
+            </w:r>
+            <w:r>
+              <w:fldChar w:fldCharType="separate"/>
+            </w:r>
+            <w:r>
+              <w:t>9</w:t>
+            </w:r>
+            <w:r>
+              <w:fldChar w:fldCharType="end"/>
+            </w:r>
+          </w:hyperlink>
+        </w:p>
+        <w:p>
+          <w:pPr>
+            <w:pStyle w:val="11"/>
+            <w:ind w:left="360"/>
+            <w:tabs>
+              <w:tab w:val="right" w:leader="dot" w:pos="9026"/>
+            </w:tabs>
+            <w:spacing w:before="120" w:after="60"/>
+          </w:pPr>
+          <w:hyperlink w:anchor="_Toc100020" w:history="1">
+            <w:r>
+              <w:rPr>
+                <w:rStyle w:val="Hyperlink"/>
+              </w:rPr>
+              <w:t>E-19. Спам «Write too slow», гейт буферизации отключается, «Failed to set event cb»</w:t>
+            </w:r>
+            <w:r>
+              <w:tab/>
+            </w:r>
+            <w:r>
+              <w:fldChar w:fldCharType="begin"/>
+            </w:r>
+            <w:r>
+              <w:instrText xml:space="preserve"> PAGEREF _Toc100020 \h </w:instrText>
+            </w:r>
+            <w:r>
+              <w:fldChar w:fldCharType="separate"/>
+            </w:r>
+            <w:r>
+              <w:t>10</w:t>
+            </w:r>
+            <w:r>
+              <w:fldChar w:fldCharType="end"/>
+            </w:r>
+          </w:hyperlink>
+        </w:p>
+        <w:p>
+          <w:pPr>
+            <w:pStyle w:val="11"/>
+            <w:ind w:left="360"/>
+            <w:tabs>
+              <w:tab w:val="right" w:leader="dot" w:pos="9026"/>
+            </w:tabs>
+            <w:spacing w:before="120" w:after="60"/>
+          </w:pPr>
+          <w:hyperlink w:anchor="_Toc100021" w:history="1">
+            <w:r>
+              <w:rPr>
+                <w:rStyle w:val="Hyperlink"/>
+              </w:rPr>
+              <w:t>E-20. «The Flame»: мгновенный ложный «сервер не ответил» — moov &gt; 4 МБ</w:t>
+            </w:r>
+            <w:r>
+              <w:tab/>
+            </w:r>
+            <w:r>
+              <w:fldChar w:fldCharType="begin"/>
+            </w:r>
+            <w:r>
+              <w:instrText xml:space="preserve"> PAGEREF _Toc100021 \h </w:instrText>
+            </w:r>
+            <w:r>
+              <w:fldChar w:fldCharType="separate"/>
+            </w:r>
+            <w:r>
+              <w:t>10</w:t>
+            </w:r>
+            <w:r>
+              <w:fldChar w:fldCharType="end"/>
+            </w:r>
+          </w:hyperlink>
+        </w:p>
+        <w:p>
+          <w:pPr>
+            <w:pStyle w:val="11"/>
+            <w:ind w:left="360"/>
+            <w:tabs>
+              <w:tab w:val="right" w:leader="dot" w:pos="9026"/>
+            </w:tabs>
+            <w:spacing w:before="120" w:after="60"/>
+          </w:pPr>
+          <w:hyperlink w:anchor="_Toc100022" w:history="1">
+            <w:r>
+              <w:rPr>
+                <w:rStyle w:val="Hyperlink"/>
+              </w:rPr>
+              <w:t>E-21. Все фильмы Main отклонялись: «нужен H.264 Baseline»; повторные 4,5 МБ moov-пробы</w:t>
+            </w:r>
+            <w:r>
+              <w:tab/>
+            </w:r>
+            <w:r>
+              <w:fldChar w:fldCharType="begin"/>
+            </w:r>
+            <w:r>
+              <w:instrText xml:space="preserve"> PAGEREF _Toc100022 \h </w:instrText>
+            </w:r>
+            <w:r>
+              <w:fldChar w:fldCharType="separate"/>
+            </w:r>
+            <w:r>
+              <w:t>11</w:t>
+            </w:r>
+            <w:r>
+              <w:fldChar w:fldCharType="end"/>
+            </w:r>
+          </w:hyperlink>
+        </w:p>
+        <w:p>
+          <w:pPr>
+            <w:pStyle w:val="11"/>
+            <w:ind w:left="360"/>
+            <w:tabs>
+              <w:tab w:val="right" w:leader="dot" w:pos="9026"/>
+            </w:tabs>
+            <w:spacing w:before="120" w:after="60"/>
+          </w:pPr>
+          <w:hyperlink w:anchor="_Toc100023" w:history="1">
+            <w:r>
+              <w:rPr>
+                <w:rStyle w:val="Hyperlink"/>
+              </w:rPr>
+              <w:t>E-22. Причины подтормаживаний невидимы: «сеть плохая, сервер тормозит или процессор перегружен?»; WDT-дампы при насыщенном декодере</w:t>
+            </w:r>
+            <w:r>
+              <w:tab/>
+            </w:r>
+            <w:r>
+              <w:fldChar w:fldCharType="begin"/>
+            </w:r>
+            <w:r>
+              <w:instrText xml:space="preserve"> PAGEREF _Toc100023 \h </w:instrText>
+            </w:r>
+            <w:r>
+              <w:fldChar w:fldCharType="separate"/>
+            </w:r>
+            <w:r>
+              <w:t>11</w:t>
+            </w:r>
+            <w:r>
+              <w:fldChar w:fldCharType="end"/>
+            </w:r>
+          </w:hyperlink>
+        </w:p>
+        <w:p>
+          <w:pPr>
+            <w:pStyle w:val="9"/>
+            <w:tabs>
+              <w:tab w:val="right" w:leader="dot" w:pos="9026"/>
+            </w:tabs>
+            <w:spacing w:before="120" w:after="60"/>
+          </w:pPr>
+          <w:hyperlink w:anchor="_Toc100024" w:history="1">
+            <w:r>
+              <w:rPr>
+                <w:rStyle w:val="Hyperlink"/>
+              </w:rPr>
+              <w:t>7. Инфраструктура и окружение (E-03, E-13, E-14)</w:t>
+            </w:r>
+            <w:r>
+              <w:tab/>
+            </w:r>
+            <w:r>
+              <w:fldChar w:fldCharType="begin"/>
+            </w:r>
+            <w:r>
+              <w:instrText xml:space="preserve"> PAGEREF _Toc100024 \h </w:instrText>
+            </w:r>
+            <w:r>
+              <w:fldChar w:fldCharType="separate"/>
+            </w:r>
+            <w:r>
+              <w:t>12</w:t>
+            </w:r>
+            <w:r>
+              <w:fldChar w:fldCharType="end"/>
+            </w:r>
+          </w:hyperlink>
+        </w:p>
+        <w:p>
+          <w:pPr>
+            <w:pStyle w:val="11"/>
+            <w:ind w:left="360"/>
+            <w:tabs>
+              <w:tab w:val="right" w:leader="dot" w:pos="9026"/>
+            </w:tabs>
+            <w:spacing w:before="120" w:after="60"/>
+          </w:pPr>
+          <w:hyperlink w:anchor="_Toc100025" w:history="1">
+            <w:r>
+              <w:rPr>
+                <w:rStyle w:val="Hyperlink"/>
+              </w:rPr>
+              <w:t>E-13. Проблемы окружения: инструменты, токен, контейнеризация</w:t>
+            </w:r>
+            <w:r>
+              <w:tab/>
+            </w:r>
+            <w:r>
+              <w:fldChar w:fldCharType="begin"/>
+            </w:r>
+            <w:r>
+              <w:instrText xml:space="preserve"> PAGEREF _Toc100025 \h </w:instrText>
+            </w:r>
+            <w:r>
+              <w:fldChar w:fldCharType="separate"/>
+            </w:r>
+            <w:r>
+              <w:t>12</w:t>
+            </w:r>
+            <w:r>
+              <w:fldChar w:fldCharType="end"/>
+            </w:r>
+          </w:hyperlink>
+        </w:p>
+        <w:p>
+          <w:pPr>
+            <w:pStyle w:val="11"/>
+            <w:ind w:left="360"/>
+            <w:tabs>
+              <w:tab w:val="right" w:leader="dot" w:pos="9026"/>
+            </w:tabs>
+            <w:spacing w:before="120" w:after="60"/>
+          </w:pPr>
+          <w:hyperlink w:anchor="_Toc100026" w:history="1">
+            <w:r>
+              <w:rPr>
+                <w:rStyle w:val="Hyperlink"/>
+              </w:rPr>
+              <w:t>E-03. Документация репозитория отстала от кода</w:t>
+            </w:r>
+            <w:r>
+              <w:tab/>
+            </w:r>
+            <w:r>
+              <w:fldChar w:fldCharType="begin"/>
+            </w:r>
+            <w:r>
+              <w:instrText xml:space="preserve"> PAGEREF _Toc100026 \h </w:instrText>
+            </w:r>
+            <w:r>
+              <w:fldChar w:fldCharType="separate"/>
+            </w:r>
+            <w:r>
+              <w:t>13</w:t>
+            </w:r>
+            <w:r>
+              <w:fldChar w:fldCharType="end"/>
+            </w:r>
+          </w:hyperlink>
+        </w:p>
+        <w:p>
+          <w:pPr>
+            <w:pStyle w:val="11"/>
+            <w:ind w:left="360"/>
+            <w:tabs>
+              <w:tab w:val="right" w:leader="dot" w:pos="9026"/>
+            </w:tabs>
+            <w:spacing w:before="120" w:after="60"/>
+          </w:pPr>
+          <w:hyperlink w:anchor="_Toc100027" w:history="1">
+            <w:r>
+              <w:rPr>
+                <w:rStyle w:val="Hyperlink"/>
+              </w:rPr>
+              <w:t>E-14. Не исправляется: vendor-warning в espressif__esp_lcd_st7701</w:t>
+            </w:r>
+            <w:r>
+              <w:tab/>
+            </w:r>
+            <w:r>
+              <w:fldChar w:fldCharType="begin"/>
+            </w:r>
+            <w:r>
+              <w:instrText xml:space="preserve"> PAGEREF _Toc100027 \h </w:instrText>
+            </w:r>
+            <w:r>
+              <w:fldChar w:fldCharType="separate"/>
+            </w:r>
+            <w:r>
+              <w:t>13</w:t>
+            </w:r>
+            <w:r>
+              <w:fldChar w:fldCharType="end"/>
+            </w:r>
+          </w:hyperlink>
+        </w:p>
+        <w:p>
+          <w:pPr>
+            <w:pStyle w:val="9"/>
+            <w:tabs>
+              <w:tab w:val="right" w:leader="dot" w:pos="9026"/>
+            </w:tabs>
+            <w:spacing w:before="120" w:after="60"/>
+          </w:pPr>
+          <w:hyperlink w:anchor="_Toc100028" w:history="1">
+            <w:r>
+              <w:rPr>
+                <w:rStyle w:val="Hyperlink"/>
+              </w:rPr>
+              <w:t>8. Выводы и практики, внедрённые по итогам</w:t>
+            </w:r>
+            <w:r>
+              <w:tab/>
+            </w:r>
+            <w:r>
+              <w:fldChar w:fldCharType="begin"/>
+            </w:r>
+            <w:r>
+              <w:instrText xml:space="preserve"> PAGEREF _Toc100028 \h </w:instrText>
+            </w:r>
+            <w:r>
+              <w:fldChar w:fldCharType="separate"/>
+            </w:r>
+            <w:r>
+              <w:t>13</w:t>
+            </w:r>
+            <w:r>
+              <w:fldChar w:fldCharType="end"/>
+            </w:r>
+          </w:hyperlink>
         </w:p>
         <w:p>
           <w:r>
@@ -291,6 +1331,7 @@
         <w:pStyle w:val="Heading1"/>
         <w:spacing w:after="160" w:before="360" w:line="312"/>
       </w:pPr>
+      <w:bookmarkStart w:id="100000" w:name="_Toc100000"/>
       <w:r>
         <w:rPr>
           <w:rFonts w:ascii="Arial" w:eastAsia="Arial" w:hAnsi="Arial"/>
@@ -302,6 +1343,7 @@
         </w:rPr>
         <w:t xml:space="preserve">1. Назначение и методика документа</w:t>
       </w:r>
+      <w:bookmarkEnd w:id="100000"/>
     </w:p>
     <w:p>
       <w:pPr>
@@ -366,7 +1408,7 @@
           <w:sz w:val="24"/>
           <w:szCs w:val="24"/>
         </w:rPr>
-        <w:t xml:space="preserve">Журнал открыт: записи E-01…E-14 охватывают первый цикл отладки (подъём сборки на IDF 6, периферия, кириллица), записи E-15…E-21 — второй цикл (SD-карта, подсистема «ФИЛЬМЫ», плеер esp_player, индикация занятости, переход пользователя на локальную сборку). Новые записи добавляются по той же схеме: симптом → причина → решение → урок.</w:t>
+        <w:t xml:space="preserve">Журнал открыт: записи E-01…E-14 охватывают первый цикл отладки (подъём сборки на IDF 6, периферия, кириллица), записи E-15…E-22 — второй цикл (SD-карта, подсистема «ФИЛЬМЫ», плеер esp_player, индикация занятости, переход пользователя на локальную сборку, экранная диагностика производительности). Новые записи добавляются по той же схеме: симптом → причина → решение → урок.</w:t>
       </w:r>
     </w:p>
     <w:p>
@@ -374,6 +1416,7 @@
         <w:pStyle w:val="Heading1"/>
         <w:spacing w:after="160" w:before="360" w:line="312"/>
       </w:pPr>
+      <w:bookmarkStart w:id="100001" w:name="_Toc100001"/>
       <w:r>
         <w:rPr>
           <w:rFonts w:ascii="Arial" w:eastAsia="Arial" w:hAnsi="Arial"/>
@@ -385,6 +1428,7 @@
         </w:rPr>
         <w:t xml:space="preserve">2. Сводный индекс ошибок</w:t>
       </w:r>
+      <w:bookmarkEnd w:id="100001"/>
     </w:p>
     <w:p>
       <w:pPr>
@@ -3641,6 +4685,152 @@
           </w:p>
         </w:tc>
       </w:tr>
+      <w:tr>
+        <w:trPr>
+          <w:cantSplit/>
+          <w:tblHeader w:val="off"/>
+        </w:trPr>
+        <w:tc>
+          <w:tcPr>
+            <w:tcW w:type="pct" w:w="400"/>
+            <w:tcMar>
+              <w:top w:type="dxa" w:w="60"/>
+              <w:left w:type="dxa" w:w="120"/>
+              <w:bottom w:type="dxa" w:w="60"/>
+              <w:right w:type="dxa" w:w="120"/>
+            </w:tcMar>
+          </w:tcPr>
+          <w:p>
+            <w:pPr>
+              <w:spacing w:line="276"/>
+              <w:jc w:val="left"/>
+            </w:pPr>
+            <w:r>
+              <w:rPr>
+                <w:rFonts w:ascii="Times New Roman" w:eastAsia="Times New Roman" w:hAnsi="Times New Roman"/>
+                <w:b w:val="false"/>
+                <w:bCs w:val="false"/>
+                <w:color w:val="000000"/>
+                <w:sz w:val="20"/>
+                <w:szCs w:val="20"/>
+              </w:rPr>
+              <w:t xml:space="preserve">E-22</w:t>
+            </w:r>
+          </w:p>
+        </w:tc>
+        <w:tc>
+          <w:tcPr>
+            <w:tcW w:type="pct" w:w="1700"/>
+            <w:tcMar>
+              <w:top w:type="dxa" w:w="60"/>
+              <w:left w:type="dxa" w:w="120"/>
+              <w:bottom w:type="dxa" w:w="60"/>
+              <w:right w:type="dxa" w:w="120"/>
+            </w:tcMar>
+          </w:tcPr>
+          <w:p>
+            <w:pPr>
+              <w:spacing w:line="276"/>
+              <w:jc w:val="left"/>
+            </w:pPr>
+            <w:r>
+              <w:rPr>
+                <w:rFonts w:ascii="Times New Roman" w:eastAsia="Times New Roman" w:hAnsi="Times New Roman"/>
+                <w:b w:val="false"/>
+                <w:bCs w:val="false"/>
+                <w:color w:val="000000"/>
+                <w:sz w:val="20"/>
+                <w:szCs w:val="20"/>
+              </w:rPr>
+              <w:t xml:space="preserve">Невидимые причины подтормаживаний (сеть/сервер/CPU); WDT-дампы при насыщенном декодере</w:t>
+            </w:r>
+          </w:p>
+        </w:tc>
+        <w:tc>
+          <w:tcPr>
+            <w:tcW w:type="pct" w:w="800"/>
+            <w:tcMar>
+              <w:top w:type="dxa" w:w="60"/>
+              <w:left w:type="dxa" w:w="120"/>
+              <w:bottom w:type="dxa" w:w="60"/>
+              <w:right w:type="dxa" w:w="120"/>
+            </w:tcMar>
+          </w:tcPr>
+          <w:p>
+            <w:pPr>
+              <w:spacing w:line="276"/>
+              <w:jc w:val="left"/>
+            </w:pPr>
+            <w:r>
+              <w:rPr>
+                <w:rFonts w:ascii="Times New Roman" w:eastAsia="Times New Roman" w:hAnsi="Times New Roman"/>
+                <w:b w:val="false"/>
+                <w:bCs w:val="false"/>
+                <w:color w:val="000000"/>
+                <w:sz w:val="20"/>
+                <w:szCs w:val="20"/>
+              </w:rPr>
+              <w:t xml:space="preserve">Плеер / сеть / UI</w:t>
+            </w:r>
+          </w:p>
+        </w:tc>
+        <w:tc>
+          <w:tcPr>
+            <w:tcW w:type="pct" w:w="1300"/>
+            <w:tcMar>
+              <w:top w:type="dxa" w:w="60"/>
+              <w:left w:type="dxa" w:w="120"/>
+              <w:bottom w:type="dxa" w:w="60"/>
+              <w:right w:type="dxa" w:w="120"/>
+            </w:tcMar>
+          </w:tcPr>
+          <w:p>
+            <w:pPr>
+              <w:spacing w:line="276"/>
+              <w:jc w:val="left"/>
+            </w:pPr>
+            <w:r>
+              <w:rPr>
+                <w:rFonts w:ascii="Times New Roman" w:eastAsia="Times New Roman" w:hAnsi="Times New Roman"/>
+                <w:b w:val="false"/>
+                <w:bCs w:val="false"/>
+                <w:color w:val="000000"/>
+                <w:sz w:val="20"/>
+                <w:szCs w:val="20"/>
+              </w:rPr>
+              <w:t xml:space="preserve">c1243b6</w:t>
+            </w:r>
+          </w:p>
+        </w:tc>
+        <w:tc>
+          <w:tcPr>
+            <w:tcW w:type="pct" w:w="800"/>
+            <w:tcMar>
+              <w:top w:type="dxa" w:w="60"/>
+              <w:left w:type="dxa" w:w="120"/>
+              <w:bottom w:type="dxa" w:w="60"/>
+              <w:right w:type="dxa" w:w="120"/>
+            </w:tcMar>
+          </w:tcPr>
+          <w:p>
+            <w:pPr>
+              <w:spacing w:line="276"/>
+              <w:jc w:val="left"/>
+            </w:pPr>
+            <w:r>
+              <w:rPr>
+                <w:rFonts w:ascii="Times New Roman" w:eastAsia="Times New Roman" w:hAnsi="Times New Roman"/>
+                <w:b w:val="false"/>
+                <w:bCs w:val="false"/>
+                <w:color w:val="000000"/>
+                <w:sz w:val="20"/>
+                <w:szCs w:val="20"/>
+              </w:rPr>
+              <w:t xml:space="preserve">Исправлено</w:t>
+            </w:r>
+          </w:p>
+        </w:tc>
+      </w:tr>
     </w:tbl>
     <w:p>
       <w:pPr>
@@ -3655,7 +4845,7 @@
           <w:sz w:val="24"/>
           <w:szCs w:val="24"/>
         </w:rPr>
-        <w:t xml:space="preserve">Коммиты d2e3606 и 668083b применены пользователем параллельно (содержимое совпало с подготовленным патчем); 343c42f…53482b7 — первый цикл исправлений ветки; 7ab5082…eab762a — второй цикл (медиа-подсистема). После каждого коммита CI завершался SUCCESS; ключевые исправления подтверждены работой на реальной плате (E-04/E-05/E-07/E-08/E-15/E-16/E-17/E-19/E-20). Начиная с E-18 сборку выполняет сам пользователь локально в VS Code ESP-IDF; CI остаётся независимым контролем ревизии.</w:t>
+        <w:t xml:space="preserve">Коммиты d2e3606 и 668083b применены пользователем параллельно (содержимое совпало с подготовленным патчем); 343c42f…53482b7 — первый цикл исправлений ветки; 7ab5082…c1243b6 — второй цикл (медиа-подсистема). После каждого коммита CI завершался SUCCESS; ключевые исправления подтверждены работой на реальной плате (E-04/E-05/E-07/E-08/E-15/E-16/E-17/E-19/E-20). Начиная с E-18 сборку выполняет сам пользователь локально в VS Code ESP-IDF; CI остаётся независимым контролем ревизии.</w:t>
       </w:r>
     </w:p>
     <w:p>
@@ -3663,6 +4853,7 @@
         <w:pStyle w:val="Heading1"/>
         <w:spacing w:after="160" w:before="360" w:line="312"/>
       </w:pPr>
+      <w:bookmarkStart w:id="100002" w:name="_Toc100002"/>
       <w:r>
         <w:rPr>
           <w:rFonts w:ascii="Arial" w:eastAsia="Arial" w:hAnsi="Arial"/>
@@ -3674,12 +4865,14 @@
         </w:rPr>
         <w:t xml:space="preserve">3. Сборка и конфигурация (E-01, E-02, E-06, E-10–E-12, E-18)</w:t>
       </w:r>
+      <w:bookmarkEnd w:id="100002"/>
     </w:p>
     <w:p>
       <w:pPr>
         <w:pStyle w:val="Heading2"/>
         <w:spacing w:after="120" w:before="260" w:line="312"/>
       </w:pPr>
+      <w:bookmarkStart w:id="100003" w:name="_Toc100003"/>
       <w:r>
         <w:rPr>
           <w:rFonts w:ascii="Arial" w:eastAsia="Arial" w:hAnsi="Arial"/>
@@ -3691,6 +4884,7 @@
         </w:rPr>
         <w:t xml:space="preserve">E-01. Неявное объявление BSP-функций и незапущенный LEDC</w:t>
       </w:r>
+      <w:bookmarkEnd w:id="100003"/>
     </w:p>
     <w:p>
       <w:pPr>
@@ -3816,6 +5010,7 @@
         <w:pStyle w:val="Heading2"/>
         <w:spacing w:after="120" w:before="260" w:line="312"/>
       </w:pPr>
+      <w:bookmarkStart w:id="100004" w:name="_Toc100004"/>
       <w:r>
         <w:rPr>
           <w:rFonts w:ascii="Arial" w:eastAsia="Arial" w:hAnsi="Arial"/>
@@ -3827,6 +5022,7 @@
         </w:rPr>
         <w:t xml:space="preserve">E-02. Опечатка в ветвлении #elif конфигураций плат</w:t>
       </w:r>
+      <w:bookmarkEnd w:id="100004"/>
     </w:p>
     <w:p>
       <w:pPr>
@@ -3988,6 +5184,7 @@
         <w:pStyle w:val="Heading2"/>
         <w:spacing w:after="120" w:before="260" w:line="312"/>
       </w:pPr>
+      <w:bookmarkStart w:id="100005" w:name="_Toc100005"/>
       <w:r>
         <w:rPr>
           <w:rFonts w:ascii="Arial" w:eastAsia="Arial" w:hAnsi="Arial"/>
@@ -3999,6 +5196,7 @@
         </w:rPr>
         <w:t xml:space="preserve">E-06. Выключенная Kconfig-опция не даёт макроса + порядок функций</w:t>
       </w:r>
+      <w:bookmarkEnd w:id="100005"/>
     </w:p>
     <w:p>
       <w:pPr>
@@ -4124,6 +5322,7 @@
         <w:pStyle w:val="Heading2"/>
         <w:spacing w:after="120" w:before="260" w:line="312"/>
       </w:pPr>
+      <w:bookmarkStart w:id="100006" w:name="_Toc100006"/>
       <w:r>
         <w:rPr>
           <w:rFonts w:ascii="Arial" w:eastAsia="Arial" w:hAnsi="Arial"/>
@@ -4135,6 +5334,7 @@
         </w:rPr>
         <w:t xml:space="preserve">E-10. sdkconfig.defaults не применяется к существующему sdkconfig</w:t>
       </w:r>
+      <w:bookmarkEnd w:id="100006"/>
     </w:p>
     <w:p>
       <w:pPr>
@@ -4258,6 +5458,7 @@
         <w:pStyle w:val="Heading2"/>
         <w:spacing w:after="120" w:before="260" w:line="312"/>
       </w:pPr>
+      <w:bookmarkStart w:id="100007" w:name="_Toc100007"/>
       <w:r>
         <w:rPr>
           <w:rFonts w:ascii="Arial" w:eastAsia="Arial" w:hAnsi="Arial"/>
@@ -4269,6 +5470,7 @@
         </w:rPr>
         <w:t xml:space="preserve">E-11. Флеш-чип Boya и E-12. Удаление флага use_dma2d в IDF 6</w:t>
       </w:r>
+      <w:bookmarkEnd w:id="100007"/>
     </w:p>
     <w:p>
       <w:pPr>
@@ -4365,6 +5567,7 @@
         <w:pStyle w:val="Heading2"/>
         <w:spacing w:after="120" w:before="260" w:line="312"/>
       </w:pPr>
+      <w:bookmarkStart w:id="100008" w:name="_Toc100008"/>
       <w:r>
         <w:rPr>
           <w:rFonts w:ascii="Arial" w:eastAsia="Arial" w:hAnsi="Arial"/>
@@ -4376,6 +5579,7 @@
         </w:rPr>
         <w:t xml:space="preserve">E-18. Локальная сборка пользователя падает: -Werror=format на riscv-тулчейне</w:t>
       </w:r>
+      <w:bookmarkEnd w:id="100008"/>
     </w:p>
     <w:p>
       <w:pPr>
@@ -4537,6 +5741,7 @@
         <w:pStyle w:val="Heading1"/>
         <w:spacing w:after="160" w:before="360" w:line="312"/>
       </w:pPr>
+      <w:bookmarkStart w:id="100009" w:name="_Toc100009"/>
       <w:r>
         <w:rPr>
           <w:rFonts w:ascii="Arial" w:eastAsia="Arial" w:hAnsi="Arial"/>
@@ -4548,12 +5753,14 @@
         </w:rPr>
         <w:t xml:space="preserve">4. Периферия платы: тач, ECDSA, дисплей, SD (E-04, E-05, E-07, E-09, E-15)</w:t>
       </w:r>
+      <w:bookmarkEnd w:id="100009"/>
     </w:p>
     <w:p>
       <w:pPr>
         <w:pStyle w:val="Heading2"/>
         <w:spacing w:after="120" w:before="260" w:line="312"/>
       </w:pPr>
+      <w:bookmarkStart w:id="100010" w:name="_Toc100010"/>
       <w:r>
         <w:rPr>
           <w:rFonts w:ascii="Arial" w:eastAsia="Arial" w:hAnsi="Arial"/>
@@ -4565,6 +5772,7 @@
         </w:rPr>
         <w:t xml:space="preserve">E-04. Тачскрин полностью не отвечает (итерация v2)</w:t>
       </w:r>
+      <w:bookmarkEnd w:id="100010"/>
     </w:p>
     <w:p>
       <w:pPr>
@@ -4682,6 +5890,7 @@
         <w:pStyle w:val="Heading2"/>
         <w:spacing w:after="120" w:before="260" w:line="312"/>
       </w:pPr>
+      <w:bookmarkStart w:id="100011" w:name="_Toc100011"/>
       <w:r>
         <w:rPr>
           <w:rFonts w:ascii="Arial" w:eastAsia="Arial" w:hAnsi="Arial"/>
@@ -4693,6 +5902,7 @@
         </w:rPr>
         <w:t xml:space="preserve">E-05. Тач найден, но координаты — мусор (корневой баг, итерация v3)</w:t>
       </w:r>
+      <w:bookmarkEnd w:id="100011"/>
     </w:p>
     <w:p>
       <w:pPr>
@@ -5430,6 +6640,7 @@
         <w:pStyle w:val="Heading2"/>
         <w:spacing w:after="120" w:before="260" w:line="312"/>
       </w:pPr>
+      <w:bookmarkStart w:id="100012" w:name="_Toc100012"/>
       <w:r>
         <w:rPr>
           <w:rFonts w:ascii="Arial" w:eastAsia="Arial" w:hAnsi="Arial"/>
@@ -5441,6 +6652,7 @@
         </w:rPr>
         <w:t xml:space="preserve">E-07. Ошибки «ECDSA peripheral not supported» на каждом HTTPS-хендшейке</w:t>
       </w:r>
+      <w:bookmarkEnd w:id="100012"/>
     </w:p>
     <w:p>
       <w:pPr>
@@ -5566,6 +6778,7 @@
         <w:pStyle w:val="Heading2"/>
         <w:spacing w:after="120" w:before="260" w:line="312"/>
       </w:pPr>
+      <w:bookmarkStart w:id="100013" w:name="_Toc100013"/>
       <w:r>
         <w:rPr>
           <w:rFonts w:ascii="Arial" w:eastAsia="Arial" w:hAnsi="Arial"/>
@@ -5577,6 +6790,7 @@
         </w:rPr>
         <w:t xml:space="preserve">E-09. Переполнение фреймбуфера DPI (историческая, до вхождения в ветку)</w:t>
       </w:r>
+      <w:bookmarkEnd w:id="100013"/>
     </w:p>
     <w:p>
       <w:pPr>
@@ -5637,6 +6851,7 @@
         <w:pStyle w:val="Heading2"/>
         <w:spacing w:after="120" w:before="260" w:line="312"/>
       </w:pPr>
+      <w:bookmarkStart w:id="100014" w:name="_Toc100014"/>
       <w:r>
         <w:rPr>
           <w:rFonts w:ascii="Arial" w:eastAsia="Arial" w:hAnsi="Arial"/>
@@ -5648,6 +6863,7 @@
         </w:rPr>
         <w:t xml:space="preserve">E-15. Кнопка «Обновить» на SD: esp_ldo_acquire_channel already in use</w:t>
       </w:r>
+      <w:bookmarkEnd w:id="100014"/>
     </w:p>
     <w:p>
       <w:pPr>
@@ -5773,6 +6989,7 @@
         <w:pStyle w:val="Heading1"/>
         <w:spacing w:after="160" w:before="360" w:line="312"/>
       </w:pPr>
+      <w:bookmarkStart w:id="100015" w:name="_Toc100015"/>
       <w:r>
         <w:rPr>
           <w:rFonts w:ascii="Arial" w:eastAsia="Arial" w:hAnsi="Arial"/>
@@ -5784,12 +7001,14 @@
         </w:rPr>
         <w:t xml:space="preserve">5. Интерфейс: кириллица и клавиатура (E-08)</w:t>
       </w:r>
+      <w:bookmarkEnd w:id="100015"/>
     </w:p>
     <w:p>
       <w:pPr>
         <w:pStyle w:val="Heading2"/>
         <w:spacing w:after="120" w:before="260" w:line="312"/>
       </w:pPr>
+      <w:bookmarkStart w:id="100016" w:name="_Toc100016"/>
       <w:r>
         <w:rPr>
           <w:rFonts w:ascii="Arial" w:eastAsia="Arial" w:hAnsi="Arial"/>
@@ -5801,6 +7020,7 @@
         </w:rPr>
         <w:t xml:space="preserve">E-08. Русский текст отображался знаками «?»</w:t>
       </w:r>
+      <w:bookmarkEnd w:id="100016"/>
     </w:p>
     <w:p>
       <w:pPr>
@@ -5906,6 +7126,7 @@
         <w:pStyle w:val="Heading1"/>
         <w:spacing w:after="160" w:before="360" w:line="312"/>
       </w:pPr>
+      <w:bookmarkStart w:id="100017" w:name="_Toc100017"/>
       <w:r>
         <w:rPr>
           <w:rFonts w:ascii="Arial" w:eastAsia="Arial" w:hAnsi="Arial"/>
@@ -5915,8 +7136,9 @@
           <w:sz w:val="32"/>
           <w:szCs w:val="32"/>
         </w:rPr>
-        <w:t xml:space="preserve">6. Медиа-подсистема: сеть, фильмы, плеер, индикация (E-16, E-17, E-19, E-20, E-21)</w:t>
-      </w:r>
+        <w:t xml:space="preserve">6. Медиа-подсистема: сеть, фильмы, плеер, индикация (E-16, E-17, E-19, E-20, E-21, E-22)</w:t>
+      </w:r>
+      <w:bookmarkEnd w:id="100017"/>
     </w:p>
     <w:p>
       <w:pPr>
@@ -5939,6 +7161,7 @@
         <w:pStyle w:val="Heading2"/>
         <w:spacing w:after="120" w:before="260" w:line="312"/>
       </w:pPr>
+      <w:bookmarkStart w:id="100018" w:name="_Toc100018"/>
       <w:r>
         <w:rPr>
           <w:rFonts w:ascii="Arial" w:eastAsia="Arial" w:hAnsi="Arial"/>
@@ -5950,6 +7173,7 @@
         </w:rPr>
         <w:t xml:space="preserve">E-16. Все фильмы отклонялись с «сервер не ответил»</w:t>
       </w:r>
+      <w:bookmarkEnd w:id="100018"/>
     </w:p>
     <w:p>
       <w:pPr>
@@ -6075,6 +7299,7 @@
         <w:pStyle w:val="Heading2"/>
         <w:spacing w:after="120" w:before="260" w:line="312"/>
       </w:pPr>
+      <w:bookmarkStart w:id="100019" w:name="_Toc100019"/>
       <w:r>
         <w:rPr>
           <w:rFonts w:ascii="Arial" w:eastAsia="Arial" w:hAnsi="Arial"/>
@@ -6086,6 +7311,7 @@
         </w:rPr>
         <w:t xml:space="preserve">E-17. Экран молчит минуты при долгих операциях — «контроллер повис?»</w:t>
       </w:r>
+      <w:bookmarkEnd w:id="100019"/>
     </w:p>
     <w:p>
       <w:pPr>
@@ -6213,6 +7439,7 @@
         <w:pStyle w:val="Heading2"/>
         <w:spacing w:after="120" w:before="260" w:line="312"/>
       </w:pPr>
+      <w:bookmarkStart w:id="100020" w:name="_Toc100020"/>
       <w:r>
         <w:rPr>
           <w:rFonts w:ascii="Arial" w:eastAsia="Arial" w:hAnsi="Arial"/>
@@ -6224,6 +7451,7 @@
         </w:rPr>
         <w:t xml:space="preserve">E-19. Спам «Write too slow», гейт буферизации отключается, «Failed to set event cb»</w:t>
       </w:r>
+      <w:bookmarkEnd w:id="100020"/>
     </w:p>
     <w:p>
       <w:pPr>
@@ -6945,6 +8173,7 @@
         <w:pStyle w:val="Heading2"/>
         <w:spacing w:after="120" w:before="260" w:line="312"/>
       </w:pPr>
+      <w:bookmarkStart w:id="100021" w:name="_Toc100021"/>
       <w:r>
         <w:rPr>
           <w:rFonts w:ascii="Arial" w:eastAsia="Arial" w:hAnsi="Arial"/>
@@ -6956,6 +8185,7 @@
         </w:rPr>
         <w:t xml:space="preserve">E-20. «The Flame»: мгновенный ложный «сервер не ответил» — moov &gt; 4 МБ</w:t>
       </w:r>
+      <w:bookmarkEnd w:id="100021"/>
     </w:p>
     <w:p>
       <w:pPr>
@@ -7081,6 +8311,7 @@
         <w:pStyle w:val="Heading2"/>
         <w:spacing w:after="120" w:before="260" w:line="312"/>
       </w:pPr>
+      <w:bookmarkStart w:id="100022" w:name="_Toc100022"/>
       <w:r>
         <w:rPr>
           <w:rFonts w:ascii="Arial" w:eastAsia="Arial" w:hAnsi="Arial"/>
@@ -7092,6 +8323,7 @@
         </w:rPr>
         <w:t xml:space="preserve">E-21. Все фильмы Main отклонялись: «нужен H.264 Baseline»; повторные 4,5 МБ moov-пробы</w:t>
       </w:r>
+      <w:bookmarkEnd w:id="100022"/>
     </w:p>
     <w:p>
       <w:pPr>
@@ -7214,9 +8446,726 @@
     </w:p>
     <w:p>
       <w:pPr>
+        <w:pStyle w:val="Heading2"/>
+        <w:spacing w:after="120" w:before="260" w:line="312"/>
+      </w:pPr>
+      <w:bookmarkStart w:id="100023" w:name="_Toc100023"/>
+      <w:r>
+        <w:rPr>
+          <w:rFonts w:ascii="Arial" w:eastAsia="Arial" w:hAnsi="Arial"/>
+          <w:b/>
+          <w:bCs/>
+          <w:color w:val="0F2B40"/>
+          <w:sz w:val="28"/>
+          <w:szCs w:val="28"/>
+        </w:rPr>
+        <w:t xml:space="preserve">E-22. Причины подтормаживаний невидимы: «сеть плохая, сервер тормозит или процессор перегружен?»; WDT-дампы при насыщенном декодере</w:t>
+      </w:r>
+      <w:bookmarkEnd w:id="100023"/>
+    </w:p>
+    <w:p>
+      <w:pPr>
+        <w:spacing w:after="80" w:line="312"/>
+        <w:ind w:firstLine="480"/>
+        <w:jc w:val="both"/>
+      </w:pPr>
+      <w:r>
+        <w:rPr>
+          <w:rFonts w:ascii="Times New Roman" w:eastAsia="Times New Roman" w:hAnsi="Times New Roman"/>
+          <w:b/>
+          <w:bCs/>
+          <w:color w:val="000000"/>
+          <w:sz w:val="24"/>
+          <w:szCs w:val="24"/>
+        </w:rPr>
+        <w:t xml:space="preserve">Симптом. </w:t>
+      </w:r>
+      <w:r>
+        <w:rPr>
+          <w:rFonts w:ascii="Times New Roman" w:eastAsia="Times New Roman" w:hAnsi="Times New Roman"/>
+          <w:color w:val="000000"/>
+          <w:sz w:val="24"/>
+          <w:szCs w:val="24"/>
+        </w:rPr>
+        <w:t xml:space="preserve">Лог после eab762a: Crashout 512×288 (Baseline) играет, но минуту идёт в цикле </w:t>
+      </w:r>
+      <w:r>
+        <w:rPr>
+          <w:rFonts w:ascii="Consolas" w:eastAsia="Consolas" w:hAnsi="Consolas"/>
+          <w:color w:val="000000"/>
+          <w:sz w:val="24"/>
+          <w:szCs w:val="24"/>
+        </w:rPr>
+        <w:t xml:space="preserve">buffering.../buffered</w:t>
+      </w:r>
+      <w:r>
+        <w:rPr>
+          <w:rFonts w:ascii="Times New Roman" w:eastAsia="Times New Roman" w:hAnsi="Times New Roman"/>
+          <w:color w:val="000000"/>
+          <w:sz w:val="24"/>
+          <w:szCs w:val="24"/>
+        </w:rPr>
+        <w:t xml:space="preserve">, затем раз за разом </w:t>
+      </w:r>
+      <w:r>
+        <w:rPr>
+          <w:rFonts w:ascii="Consolas" w:eastAsia="Consolas" w:hAnsi="Consolas"/>
+          <w:color w:val="000000"/>
+          <w:sz w:val="24"/>
+          <w:szCs w:val="24"/>
+        </w:rPr>
+        <w:t xml:space="preserve">Task watchdog got triggered: IDLE1 (CPU 1)</w:t>
+      </w:r>
+      <w:r>
+        <w:rPr>
+          <w:rFonts w:ascii="Times New Roman" w:eastAsia="Times New Roman" w:hAnsi="Times New Roman"/>
+          <w:color w:val="000000"/>
+          <w:sz w:val="24"/>
+          <w:szCs w:val="24"/>
+        </w:rPr>
+        <w:t xml:space="preserve"> — задачей-нарушителем оказывается vid_dec, застрявший в h264bsdDecodeSliceData (memcpy). Пользователь задаёт точный вопрос: как понять, что именно узко — интернет, задержка сервера или процессор, — и вывести статистику на экран.</w:t>
+      </w:r>
+    </w:p>
+    <w:p>
+      <w:pPr>
+        <w:spacing w:after="80" w:line="312"/>
+        <w:ind w:firstLine="480"/>
+        <w:jc w:val="both"/>
+      </w:pPr>
+      <w:r>
+        <w:rPr>
+          <w:rFonts w:ascii="Times New Roman" w:eastAsia="Times New Roman" w:hAnsi="Times New Roman"/>
+          <w:b/>
+          <w:bCs/>
+          <w:color w:val="000000"/>
+          <w:sz w:val="24"/>
+          <w:szCs w:val="24"/>
+        </w:rPr>
+        <w:t xml:space="preserve">Корневая причина (три независимых слоя). </w:t>
+      </w:r>
+      <w:r>
+        <w:rPr>
+          <w:rFonts w:ascii="Times New Roman" w:eastAsia="Times New Roman" w:hAnsi="Times New Roman"/>
+          <w:color w:val="000000"/>
+          <w:sz w:val="24"/>
+          <w:szCs w:val="24"/>
+        </w:rPr>
+        <w:t xml:space="preserve">(1) TCP-окно lwIP по умолчанию 5760 байт (4×MSS): пропускная способность соединения ≤ окно/RTT, при RTT ~200 мс до нод archive.org это ~25–30 кБ/с — ровно те ~20 кБ/с, что наблюдались в пробах и циклах буферизации; стриму в реальном времени нужно 150–250 кБ/с, то есть узкое место было сконфигурировано заранее. (2) Программный h264bsd на 360p-классе насыщает всё своё ядро (измерено ранее: 360p@30 ≈ 5 fps) — IDLE1 легитимно голодает, и дамп WDT каждые ~5 с является шумом, а не новой ошибкой; визуально это никак не отличить от зависания. (3) Встроенные пороги гейта esp_player 400/200/300 мс при демукс-пуле, который в принципе не удерживает 300 мс данных (лог: «saturated at 278 ms»), приводили к отключению гейта и «голодному» свободному ходу.</w:t>
+      </w:r>
+    </w:p>
+    <w:p>
+      <w:pPr>
+        <w:spacing w:after="80" w:line="312"/>
+        <w:ind w:firstLine="480"/>
+        <w:jc w:val="both"/>
+      </w:pPr>
+      <w:r>
+        <w:rPr>
+          <w:rFonts w:ascii="Times New Roman" w:eastAsia="Times New Roman" w:hAnsi="Times New Roman"/>
+          <w:b/>
+          <w:bCs/>
+          <w:color w:val="000000"/>
+          <w:sz w:val="24"/>
+          <w:szCs w:val="24"/>
+        </w:rPr>
+        <w:t xml:space="preserve">Решение (коммит c1243b6). </w:t>
+      </w:r>
+      <w:r>
+        <w:rPr>
+          <w:rFonts w:ascii="Times New Roman" w:eastAsia="Times New Roman" w:hAnsi="Times New Roman"/>
+          <w:color w:val="000000"/>
+          <w:sz w:val="24"/>
+          <w:szCs w:val="24"/>
+        </w:rPr>
+        <w:t xml:space="preserve">(1) Экранная статистика — новый модуль pstats.c: во время видео OSD в правом верхнем углу рисуется прямо в кадр — обёртка ops LCD-бэкенда esp_video_render перехватывает write_fb, ставит блок статистики в буфер и вызывает оригинал (это единственная поверхность, которой мы владеем, когда рендер владеет панелью); на busy-карточке — строка «сеть N кБ/с CPU0 x% CPU1 y%». Собираются: сетевой приём (КБ/с, runtime-обёртка netif→input, живучая к relink'ам и не требующая sdkconfig), точная загрузка CPU0/CPU1 (run-time stats FreeRTOS: CONFIG_FREERTOS_GENERATE_RUN_TIME_STATS=y в defaults), кадры факт/цель и счётчик СТОПОВ из событий игрока, позиция/длительность и скорость медиа-часов (×0.4 = картинка отстаёт вдвое). (2) TCP-окно и буфер отправки 5760 → 65535, recv mbox 48 (sdkconfig.defaults; применяется при пересоздании sdkconfig — дисциплина E-10). (3) Буферы игрока с реальным запасом: демукс-пул 2 МБ, HTTP read-ahead 256 КБ, prebuffer 1.5 с / rebuffer-resume 1.2 с — гейт дотягивает до порога вместо отключения. (4) IDLE1 снят с task watchdog (esp_task_wdt_delete в media_player_init): насыщение декодера теперь видно по CPU1% и строке КАДР, а не по регистровым дампам. Хост-проверка pstats.c в обеих ветках sdkconfig — scripts/pstats_host/run_check.sh, без предупреждений.</w:t>
+      </w:r>
+    </w:p>
+    <w:p>
+      <w:pPr>
+        <w:keepNext/>
+        <w:spacing w:after="80" w:before="160" w:line="312"/>
+        <w:jc w:val="left"/>
+      </w:pPr>
+      <w:r>
+        <w:rPr>
+          <w:rFonts w:ascii="Arial" w:eastAsia="Arial" w:hAnsi="Arial"/>
+          <w:b/>
+          <w:bCs/>
+          <w:color w:val="0F2B40"/>
+          <w:sz w:val="21"/>
+          <w:szCs w:val="21"/>
+        </w:rPr>
+        <w:t xml:space="preserve">Таблица 4. Строки экранной статистики (OSD видео и busy-карточка) и чтение симптомов</w:t>
+      </w:r>
+    </w:p>
+    <w:tbl>
+      <w:tblPr>
+        <w:tblW w:type="pct" w:w="5000"/>
+        <w:tblBorders>
+          <w:top w:val="single" w:color="529286" w:sz="2"/>
+          <w:left w:val="none" w:color="FFFFFF" w:sz="0"/>
+          <w:bottom w:val="single" w:color="529286" w:sz="2"/>
+          <w:right w:val="none" w:color="FFFFFF" w:sz="0"/>
+          <w:insideH w:val="single" w:color="BECFCC" w:sz="1"/>
+          <w:insideV w:val="none" w:color="FFFFFF" w:sz="0"/>
+        </w:tblBorders>
+        <w:tblLayout w:type="fixed"/>
+      </w:tblPr>
+      <w:tblGrid>
+        <w:gridCol w:w="2636"/>
+        <w:gridCol w:w="2988"/>
+        <w:gridCol w:w="3164"/>
+      </w:tblGrid>
+      <w:tr>
+        <w:trPr>
+          <w:cantSplit/>
+          <w:tblHeader/>
+        </w:trPr>
+        <w:tc>
+          <w:tcPr>
+            <w:tcW w:type="pct" w:w="1500"/>
+            <w:shd w:fill="529286" w:val="clear"/>
+            <w:tcMar>
+              <w:top w:type="dxa" w:w="60"/>
+              <w:left w:type="dxa" w:w="120"/>
+              <w:bottom w:type="dxa" w:w="60"/>
+              <w:right w:type="dxa" w:w="120"/>
+            </w:tcMar>
+          </w:tcPr>
+          <w:p>
+            <w:pPr>
+              <w:spacing w:line="276"/>
+              <w:jc w:val="left"/>
+            </w:pPr>
+            <w:r>
+              <w:rPr>
+                <w:rFonts w:ascii="Arial" w:eastAsia="Arial" w:hAnsi="Arial"/>
+                <w:b/>
+                <w:bCs/>
+                <w:color w:val="FFFFFF"/>
+                <w:sz w:val="21"/>
+                <w:szCs w:val="21"/>
+              </w:rPr>
+              <w:t xml:space="preserve">Строка</w:t>
+            </w:r>
+          </w:p>
+        </w:tc>
+        <w:tc>
+          <w:tcPr>
+            <w:tcW w:type="pct" w:w="1700"/>
+            <w:shd w:fill="529286" w:val="clear"/>
+            <w:tcMar>
+              <w:top w:type="dxa" w:w="60"/>
+              <w:left w:type="dxa" w:w="120"/>
+              <w:bottom w:type="dxa" w:w="60"/>
+              <w:right w:type="dxa" w:w="120"/>
+            </w:tcMar>
+          </w:tcPr>
+          <w:p>
+            <w:pPr>
+              <w:spacing w:line="276"/>
+              <w:jc w:val="left"/>
+            </w:pPr>
+            <w:r>
+              <w:rPr>
+                <w:rFonts w:ascii="Arial" w:eastAsia="Arial" w:hAnsi="Arial"/>
+                <w:b/>
+                <w:bCs/>
+                <w:color w:val="FFFFFF"/>
+                <w:sz w:val="21"/>
+                <w:szCs w:val="21"/>
+              </w:rPr>
+              <w:t xml:space="preserve">Значение</w:t>
+            </w:r>
+          </w:p>
+        </w:tc>
+        <w:tc>
+          <w:tcPr>
+            <w:tcW w:type="pct" w:w="1800"/>
+            <w:shd w:fill="529286" w:val="clear"/>
+            <w:tcMar>
+              <w:top w:type="dxa" w:w="60"/>
+              <w:left w:type="dxa" w:w="120"/>
+              <w:bottom w:type="dxa" w:w="60"/>
+              <w:right w:type="dxa" w:w="120"/>
+            </w:tcMar>
+          </w:tcPr>
+          <w:p>
+            <w:pPr>
+              <w:spacing w:line="276"/>
+              <w:jc w:val="left"/>
+            </w:pPr>
+            <w:r>
+              <w:rPr>
+                <w:rFonts w:ascii="Arial" w:eastAsia="Arial" w:hAnsi="Arial"/>
+                <w:b/>
+                <w:bCs/>
+                <w:color w:val="FFFFFF"/>
+                <w:sz w:val="21"/>
+                <w:szCs w:val="21"/>
+              </w:rPr>
+              <w:t xml:space="preserve">Типичный вывод</w:t>
+            </w:r>
+          </w:p>
+        </w:tc>
+      </w:tr>
+      <w:tr>
+        <w:trPr>
+          <w:cantSplit/>
+          <w:tblHeader w:val="off"/>
+        </w:trPr>
+        <w:tc>
+          <w:tcPr>
+            <w:tcW w:type="pct" w:w="1500"/>
+            <w:tcMar>
+              <w:top w:type="dxa" w:w="60"/>
+              <w:left w:type="dxa" w:w="120"/>
+              <w:bottom w:type="dxa" w:w="60"/>
+              <w:right w:type="dxa" w:w="120"/>
+            </w:tcMar>
+          </w:tcPr>
+          <w:p>
+            <w:pPr>
+              <w:spacing w:line="276"/>
+              <w:jc w:val="left"/>
+            </w:pPr>
+            <w:r>
+              <w:rPr>
+                <w:rFonts w:ascii="Times New Roman" w:eastAsia="Times New Roman" w:hAnsi="Times New Roman"/>
+                <w:b w:val="false"/>
+                <w:bCs w:val="false"/>
+                <w:color w:val="000000"/>
+                <w:sz w:val="20"/>
+                <w:szCs w:val="20"/>
+              </w:rPr>
+              <w:t xml:space="preserve">СЕТЬ 25 кБ/с</w:t>
+            </w:r>
+          </w:p>
+        </w:tc>
+        <w:tc>
+          <w:tcPr>
+            <w:tcW w:type="pct" w:w="1700"/>
+            <w:tcMar>
+              <w:top w:type="dxa" w:w="60"/>
+              <w:left w:type="dxa" w:w="120"/>
+              <w:bottom w:type="dxa" w:w="60"/>
+              <w:right w:type="dxa" w:w="120"/>
+            </w:tcMar>
+          </w:tcPr>
+          <w:p>
+            <w:pPr>
+              <w:spacing w:line="276"/>
+              <w:jc w:val="left"/>
+            </w:pPr>
+            <w:r>
+              <w:rPr>
+                <w:rFonts w:ascii="Times New Roman" w:eastAsia="Times New Roman" w:hAnsi="Times New Roman"/>
+                <w:b w:val="false"/>
+                <w:bCs w:val="false"/>
+                <w:color w:val="000000"/>
+                <w:sz w:val="20"/>
+                <w:szCs w:val="20"/>
+              </w:rPr>
+              <w:t xml:space="preserve">Фактический приём NIC, КБ/с (жёлтая &lt; 50)</w:t>
+            </w:r>
+          </w:p>
+        </w:tc>
+        <w:tc>
+          <w:tcPr>
+            <w:tcW w:type="pct" w:w="1800"/>
+            <w:tcMar>
+              <w:top w:type="dxa" w:w="60"/>
+              <w:left w:type="dxa" w:w="120"/>
+              <w:bottom w:type="dxa" w:w="60"/>
+              <w:right w:type="dxa" w:w="120"/>
+            </w:tcMar>
+          </w:tcPr>
+          <w:p>
+            <w:pPr>
+              <w:spacing w:line="276"/>
+              <w:jc w:val="left"/>
+            </w:pPr>
+            <w:r>
+              <w:rPr>
+                <w:rFonts w:ascii="Times New Roman" w:eastAsia="Times New Roman" w:hAnsi="Times New Roman"/>
+                <w:b w:val="false"/>
+                <w:bCs w:val="false"/>
+                <w:color w:val="000000"/>
+                <w:sz w:val="20"/>
+                <w:szCs w:val="20"/>
+              </w:rPr>
+              <w:t xml:space="preserve">Ниже ~150 — узко сеть/сервер: стрим не успевает</w:t>
+            </w:r>
+          </w:p>
+        </w:tc>
+      </w:tr>
+      <w:tr>
+        <w:trPr>
+          <w:cantSplit/>
+          <w:tblHeader w:val="off"/>
+        </w:trPr>
+        <w:tc>
+          <w:tcPr>
+            <w:tcW w:type="pct" w:w="1500"/>
+            <w:tcMar>
+              <w:top w:type="dxa" w:w="60"/>
+              <w:left w:type="dxa" w:w="120"/>
+              <w:bottom w:type="dxa" w:w="60"/>
+              <w:right w:type="dxa" w:w="120"/>
+            </w:tcMar>
+          </w:tcPr>
+          <w:p>
+            <w:pPr>
+              <w:spacing w:line="276"/>
+              <w:jc w:val="left"/>
+            </w:pPr>
+            <w:r>
+              <w:rPr>
+                <w:rFonts w:ascii="Times New Roman" w:eastAsia="Times New Roman" w:hAnsi="Times New Roman"/>
+                <w:b w:val="false"/>
+                <w:bCs w:val="false"/>
+                <w:color w:val="000000"/>
+                <w:sz w:val="20"/>
+                <w:szCs w:val="20"/>
+              </w:rPr>
+              <w:t xml:space="preserve">CPU0 43% CPU1 96%</w:t>
+            </w:r>
+          </w:p>
+        </w:tc>
+        <w:tc>
+          <w:tcPr>
+            <w:tcW w:type="pct" w:w="1700"/>
+            <w:tcMar>
+              <w:top w:type="dxa" w:w="60"/>
+              <w:left w:type="dxa" w:w="120"/>
+              <w:bottom w:type="dxa" w:w="60"/>
+              <w:right w:type="dxa" w:w="120"/>
+            </w:tcMar>
+          </w:tcPr>
+          <w:p>
+            <w:pPr>
+              <w:spacing w:line="276"/>
+              <w:jc w:val="left"/>
+            </w:pPr>
+            <w:r>
+              <w:rPr>
+                <w:rFonts w:ascii="Times New Roman" w:eastAsia="Times New Roman" w:hAnsi="Times New Roman"/>
+                <w:b w:val="false"/>
+                <w:bCs w:val="false"/>
+                <w:color w:val="000000"/>
+                <w:sz w:val="20"/>
+                <w:szCs w:val="20"/>
+              </w:rPr>
+              <w:t xml:space="preserve">Точная загрузка ядер (run-time stats)</w:t>
+            </w:r>
+          </w:p>
+        </w:tc>
+        <w:tc>
+          <w:tcPr>
+            <w:tcW w:type="pct" w:w="1800"/>
+            <w:tcMar>
+              <w:top w:type="dxa" w:w="60"/>
+              <w:left w:type="dxa" w:w="120"/>
+              <w:bottom w:type="dxa" w:w="60"/>
+              <w:right w:type="dxa" w:w="120"/>
+            </w:tcMar>
+          </w:tcPr>
+          <w:p>
+            <w:pPr>
+              <w:spacing w:line="276"/>
+              <w:jc w:val="left"/>
+            </w:pPr>
+            <w:r>
+              <w:rPr>
+                <w:rFonts w:ascii="Times New Roman" w:eastAsia="Times New Roman" w:hAnsi="Times New Roman"/>
+                <w:b w:val="false"/>
+                <w:bCs w:val="false"/>
+                <w:color w:val="000000"/>
+                <w:sz w:val="20"/>
+                <w:szCs w:val="20"/>
+              </w:rPr>
+              <w:t xml:space="preserve">CPU1 ~100% — декодер насыщен: слайдшоу, это предел SW-декода</w:t>
+            </w:r>
+          </w:p>
+        </w:tc>
+      </w:tr>
+      <w:tr>
+        <w:trPr>
+          <w:cantSplit/>
+          <w:tblHeader w:val="off"/>
+        </w:trPr>
+        <w:tc>
+          <w:tcPr>
+            <w:tcW w:type="pct" w:w="1500"/>
+            <w:tcMar>
+              <w:top w:type="dxa" w:w="60"/>
+              <w:left w:type="dxa" w:w="120"/>
+              <w:bottom w:type="dxa" w:w="60"/>
+              <w:right w:type="dxa" w:w="120"/>
+            </w:tcMar>
+          </w:tcPr>
+          <w:p>
+            <w:pPr>
+              <w:spacing w:line="276"/>
+              <w:jc w:val="left"/>
+            </w:pPr>
+            <w:r>
+              <w:rPr>
+                <w:rFonts w:ascii="Times New Roman" w:eastAsia="Times New Roman" w:hAnsi="Times New Roman"/>
+                <w:b w:val="false"/>
+                <w:bCs w:val="false"/>
+                <w:color w:val="000000"/>
+                <w:sz w:val="20"/>
+                <w:szCs w:val="20"/>
+              </w:rPr>
+              <w:t xml:space="preserve">КАДР 8/23 x0.40</w:t>
+            </w:r>
+          </w:p>
+        </w:tc>
+        <w:tc>
+          <w:tcPr>
+            <w:tcW w:type="pct" w:w="1700"/>
+            <w:tcMar>
+              <w:top w:type="dxa" w:w="60"/>
+              <w:left w:type="dxa" w:w="120"/>
+              <w:bottom w:type="dxa" w:w="60"/>
+              <w:right w:type="dxa" w:w="120"/>
+            </w:tcMar>
+          </w:tcPr>
+          <w:p>
+            <w:pPr>
+              <w:spacing w:line="276"/>
+              <w:jc w:val="left"/>
+            </w:pPr>
+            <w:r>
+              <w:rPr>
+                <w:rFonts w:ascii="Times New Roman" w:eastAsia="Times New Roman" w:hAnsi="Times New Roman"/>
+                <w:b w:val="false"/>
+                <w:bCs w:val="false"/>
+                <w:color w:val="000000"/>
+                <w:sz w:val="20"/>
+                <w:szCs w:val="20"/>
+              </w:rPr>
+              <w:t xml:space="preserve">Рендер-кадры/с против цели и скорость медиа-часов</w:t>
+            </w:r>
+          </w:p>
+        </w:tc>
+        <w:tc>
+          <w:tcPr>
+            <w:tcW w:type="pct" w:w="1800"/>
+            <w:tcMar>
+              <w:top w:type="dxa" w:w="60"/>
+              <w:left w:type="dxa" w:w="120"/>
+              <w:bottom w:type="dxa" w:w="60"/>
+              <w:right w:type="dxa" w:w="120"/>
+            </w:tcMar>
+          </w:tcPr>
+          <w:p>
+            <w:pPr>
+              <w:spacing w:line="276"/>
+              <w:jc w:val="left"/>
+            </w:pPr>
+            <w:r>
+              <w:rPr>
+                <w:rFonts w:ascii="Times New Roman" w:eastAsia="Times New Roman" w:hAnsi="Times New Roman"/>
+                <w:b w:val="false"/>
+                <w:bCs w:val="false"/>
+                <w:color w:val="000000"/>
+                <w:sz w:val="20"/>
+                <w:szCs w:val="20"/>
+              </w:rPr>
+              <w:t xml:space="preserve">КАДР &lt; цели при нормальной сети — CPU; x&lt;1.0 — картинка отстаёт</w:t>
+            </w:r>
+          </w:p>
+        </w:tc>
+      </w:tr>
+      <w:tr>
+        <w:trPr>
+          <w:cantSplit/>
+          <w:tblHeader w:val="off"/>
+        </w:trPr>
+        <w:tc>
+          <w:tcPr>
+            <w:tcW w:type="pct" w:w="1500"/>
+            <w:tcMar>
+              <w:top w:type="dxa" w:w="60"/>
+              <w:left w:type="dxa" w:w="120"/>
+              <w:bottom w:type="dxa" w:w="60"/>
+              <w:right w:type="dxa" w:w="120"/>
+            </w:tcMar>
+          </w:tcPr>
+          <w:p>
+            <w:pPr>
+              <w:spacing w:line="276"/>
+              <w:jc w:val="left"/>
+            </w:pPr>
+            <w:r>
+              <w:rPr>
+                <w:rFonts w:ascii="Times New Roman" w:eastAsia="Times New Roman" w:hAnsi="Times New Roman"/>
+                <w:b w:val="false"/>
+                <w:bCs w:val="false"/>
+                <w:color w:val="000000"/>
+                <w:sz w:val="20"/>
+                <w:szCs w:val="20"/>
+              </w:rPr>
+              <w:t xml:space="preserve">СТОПЫ 12 / БУФЕРИЗАЦИЯ</w:t>
+            </w:r>
+          </w:p>
+        </w:tc>
+        <w:tc>
+          <w:tcPr>
+            <w:tcW w:type="pct" w:w="1700"/>
+            <w:tcMar>
+              <w:top w:type="dxa" w:w="60"/>
+              <w:left w:type="dxa" w:w="120"/>
+              <w:bottom w:type="dxa" w:w="60"/>
+              <w:right w:type="dxa" w:w="120"/>
+            </w:tcMar>
+          </w:tcPr>
+          <w:p>
+            <w:pPr>
+              <w:spacing w:line="276"/>
+              <w:jc w:val="left"/>
+            </w:pPr>
+            <w:r>
+              <w:rPr>
+                <w:rFonts w:ascii="Times New Roman" w:eastAsia="Times New Roman" w:hAnsi="Times New Roman"/>
+                <w:b w:val="false"/>
+                <w:bCs w:val="false"/>
+                <w:color w:val="000000"/>
+                <w:sz w:val="20"/>
+                <w:szCs w:val="20"/>
+              </w:rPr>
+              <w:t xml:space="preserve">Число re-buffering эпизодов / активная пауза</w:t>
+            </w:r>
+          </w:p>
+        </w:tc>
+        <w:tc>
+          <w:tcPr>
+            <w:tcW w:type="pct" w:w="1800"/>
+            <w:tcMar>
+              <w:top w:type="dxa" w:w="60"/>
+              <w:left w:type="dxa" w:w="120"/>
+              <w:bottom w:type="dxa" w:w="60"/>
+              <w:right w:type="dxa" w:w="120"/>
+            </w:tcMar>
+          </w:tcPr>
+          <w:p>
+            <w:pPr>
+              <w:spacing w:line="276"/>
+              <w:jc w:val="left"/>
+            </w:pPr>
+            <w:r>
+              <w:rPr>
+                <w:rFonts w:ascii="Times New Roman" w:eastAsia="Times New Roman" w:hAnsi="Times New Roman"/>
+                <w:b w:val="false"/>
+                <w:bCs w:val="false"/>
+                <w:color w:val="000000"/>
+                <w:sz w:val="20"/>
+                <w:szCs w:val="20"/>
+              </w:rPr>
+              <w:t xml:space="preserve">Растёт при СЕТЬ низкой — сеть; при CPU1 100% — декодер</w:t>
+            </w:r>
+          </w:p>
+        </w:tc>
+      </w:tr>
+      <w:tr>
+        <w:trPr>
+          <w:cantSplit/>
+          <w:tblHeader w:val="off"/>
+        </w:trPr>
+        <w:tc>
+          <w:tcPr>
+            <w:tcW w:type="pct" w:w="1500"/>
+            <w:tcMar>
+              <w:top w:type="dxa" w:w="60"/>
+              <w:left w:type="dxa" w:w="120"/>
+              <w:bottom w:type="dxa" w:w="60"/>
+              <w:right w:type="dxa" w:w="120"/>
+            </w:tcMar>
+          </w:tcPr>
+          <w:p>
+            <w:pPr>
+              <w:spacing w:line="276"/>
+              <w:jc w:val="left"/>
+            </w:pPr>
+            <w:r>
+              <w:rPr>
+                <w:rFonts w:ascii="Times New Roman" w:eastAsia="Times New Roman" w:hAnsi="Times New Roman"/>
+                <w:b w:val="false"/>
+                <w:bCs w:val="false"/>
+                <w:color w:val="000000"/>
+                <w:sz w:val="20"/>
+                <w:szCs w:val="20"/>
+              </w:rPr>
+              <w:t xml:space="preserve">12:34 / 1:28:40</w:t>
+            </w:r>
+          </w:p>
+        </w:tc>
+        <w:tc>
+          <w:tcPr>
+            <w:tcW w:type="pct" w:w="1700"/>
+            <w:tcMar>
+              <w:top w:type="dxa" w:w="60"/>
+              <w:left w:type="dxa" w:w="120"/>
+              <w:bottom w:type="dxa" w:w="60"/>
+              <w:right w:type="dxa" w:w="120"/>
+            </w:tcMar>
+          </w:tcPr>
+          <w:p>
+            <w:pPr>
+              <w:spacing w:line="276"/>
+              <w:jc w:val="left"/>
+            </w:pPr>
+            <w:r>
+              <w:rPr>
+                <w:rFonts w:ascii="Times New Roman" w:eastAsia="Times New Roman" w:hAnsi="Times New Roman"/>
+                <w:b w:val="false"/>
+                <w:bCs w:val="false"/>
+                <w:color w:val="000000"/>
+                <w:sz w:val="20"/>
+                <w:szCs w:val="20"/>
+              </w:rPr>
+              <w:t xml:space="preserve">Позиция / длительность</w:t>
+            </w:r>
+          </w:p>
+        </w:tc>
+        <w:tc>
+          <w:tcPr>
+            <w:tcW w:type="pct" w:w="1800"/>
+            <w:tcMar>
+              <w:top w:type="dxa" w:w="60"/>
+              <w:left w:type="dxa" w:w="120"/>
+              <w:bottom w:type="dxa" w:w="60"/>
+              <w:right w:type="dxa" w:w="120"/>
+            </w:tcMar>
+          </w:tcPr>
+          <w:p>
+            <w:pPr>
+              <w:spacing w:line="276"/>
+              <w:jc w:val="left"/>
+            </w:pPr>
+            <w:r>
+              <w:rPr>
+                <w:rFonts w:ascii="Times New Roman" w:eastAsia="Times New Roman" w:hAnsi="Times New Roman"/>
+                <w:b w:val="false"/>
+                <w:bCs w:val="false"/>
+                <w:color w:val="000000"/>
+                <w:sz w:val="20"/>
+                <w:szCs w:val="20"/>
+              </w:rPr>
+              <w:t xml:space="preserve">Позиция замерла при «ИГРАЕТ» — поток не движется</w:t>
+            </w:r>
+          </w:p>
+        </w:tc>
+      </w:tr>
+    </w:tbl>
+    <w:p>
+      <w:pPr>
         <w:pStyle w:val="Heading1"/>
         <w:spacing w:after="160" w:before="360" w:line="312"/>
       </w:pPr>
+      <w:bookmarkStart w:id="100024" w:name="_Toc100024"/>
       <w:r>
         <w:rPr>
           <w:rFonts w:ascii="Arial" w:eastAsia="Arial" w:hAnsi="Arial"/>
@@ -7228,12 +9177,14 @@
         </w:rPr>
         <w:t xml:space="preserve">7. Инфраструктура и окружение (E-03, E-13, E-14)</w:t>
       </w:r>
+      <w:bookmarkEnd w:id="100024"/>
     </w:p>
     <w:p>
       <w:pPr>
         <w:pStyle w:val="Heading2"/>
         <w:spacing w:after="120" w:before="260" w:line="312"/>
       </w:pPr>
+      <w:bookmarkStart w:id="100025" w:name="_Toc100025"/>
       <w:r>
         <w:rPr>
           <w:rFonts w:ascii="Arial" w:eastAsia="Arial" w:hAnsi="Arial"/>
@@ -7245,6 +9196,7 @@
         </w:rPr>
         <w:t xml:space="preserve">E-13. Проблемы окружения: инструменты, токен, контейнеризация</w:t>
       </w:r>
+      <w:bookmarkEnd w:id="100025"/>
     </w:p>
     <w:p>
       <w:pPr>
@@ -7332,6 +9284,7 @@
         <w:pStyle w:val="Heading2"/>
         <w:spacing w:after="120" w:before="260" w:line="312"/>
       </w:pPr>
+      <w:bookmarkStart w:id="100026" w:name="_Toc100026"/>
       <w:r>
         <w:rPr>
           <w:rFonts w:ascii="Arial" w:eastAsia="Arial" w:hAnsi="Arial"/>
@@ -7343,6 +9296,7 @@
         </w:rPr>
         <w:t xml:space="preserve">E-03. Документация репозитория отстала от кода</w:t>
       </w:r>
+      <w:bookmarkEnd w:id="100026"/>
     </w:p>
     <w:p>
       <w:pPr>
@@ -7365,6 +9319,7 @@
         <w:pStyle w:val="Heading2"/>
         <w:spacing w:after="120" w:before="260" w:line="312"/>
       </w:pPr>
+      <w:bookmarkStart w:id="100027" w:name="_Toc100027"/>
       <w:r>
         <w:rPr>
           <w:rFonts w:ascii="Arial" w:eastAsia="Arial" w:hAnsi="Arial"/>
@@ -7376,6 +9331,7 @@
         </w:rPr>
         <w:t xml:space="preserve">E-14. Не исправляется: vendor-warning в espressif__esp_lcd_st7701</w:t>
       </w:r>
+      <w:bookmarkEnd w:id="100027"/>
     </w:p>
     <w:p>
       <w:pPr>
@@ -7398,6 +9354,7 @@
         <w:pStyle w:val="Heading1"/>
         <w:spacing w:after="160" w:before="360" w:line="312"/>
       </w:pPr>
+      <w:bookmarkStart w:id="100028" w:name="_Toc100028"/>
       <w:r>
         <w:rPr>
           <w:rFonts w:ascii="Arial" w:eastAsia="Arial" w:hAnsi="Arial"/>
@@ -7409,6 +9366,7 @@
         </w:rPr>
         <w:t xml:space="preserve">8. Выводы и практики, внедрённые по итогам</w:t>
       </w:r>
+      <w:bookmarkEnd w:id="100028"/>
     </w:p>
     <w:p>
       <w:pPr>
@@ -7423,7 +9381,7 @@
           <w:sz w:val="24"/>
           <w:szCs w:val="24"/>
         </w:rPr>
-        <w:t xml:space="preserve">За два цикла отладки (9adf20e → eab762a) закрыты: три критичных дефекта периферии (Ethernet не поднялся бы без сброса PHY и правильного тактирования; тач не отвечал без hw-reset и верной шины; координаты были мусором из-за однобайтового смещения регистра), две системные проблемы конфигурации (старение sdkconfig, ECDSA-периферия по ревизии чипа), полный конвейер кириллицы, состояние SD-драйвера при повторной инициализации, сквозной тракт воспроизведения фильмов (прямой URL узла, честные коды ошибок, ленивая проба, профильный gate по факту декодера, кэш вердиктов) и видимость долгих операций (busy-карточка). Ни одна ошибка не потребовала изменения железа — все решения вошли в код/конфиг и подтверждены на плате.</w:t>
+        <w:t xml:space="preserve">За два цикла отладки (9adf20e → c1243b6) закрыты: три критичных дефекта периферии (Ethernet не поднялся бы без сброса PHY и правильного тактирования; тач не отвечал без hw-reset и верной шины; координаты были мусором из-за однобайтового смещения регистра), две системные проблемы конфигурации (старение sdkconfig, ECDSA-периферия по ревизии чипа), полный конвейер кириллицы, состояние SD-драйвера при повторной инициализации, сквозной тракт воспроизведения фильмов (прямой URL узла, честные коды ошибок, ленивая проба, профильный gate по факту декодера, кэш вердиктов) и видимость долгих операций (busy-карточка). Ни одна ошибка не потребовала изменения железа — все решения вошли в код/конфиг и подтверждены на плате.</w:t>
       </w:r>
     </w:p>
     <w:p>
@@ -7693,6 +9651,58 @@
           <w:szCs w:val="24"/>
         </w:rPr>
         <w:t xml:space="preserve">10. </w:t>
+      </w:r>
+      <w:r>
+        <w:rPr>
+          <w:rFonts w:ascii="Times New Roman" w:eastAsia="Times New Roman" w:hAnsi="Times New Roman"/>
+          <w:color w:val="000000"/>
+          <w:sz w:val="24"/>
+          <w:szCs w:val="24"/>
+        </w:rPr>
+        <w:t xml:space="preserve">Пропускная способность TCP = окно/RTT: дефолтное окно lwIP 5760 Б при RTT 200 мс — это ~30 кБ/с независимо от провайдера; для стриминга окно поднимается до 64 КБ, и только затем ищут виноватых вовне (E-22).</w:t>
+      </w:r>
+    </w:p>
+    <w:p>
+      <w:pPr>
+        <w:spacing w:after="80" w:line="312"/>
+        <w:jc w:val="both"/>
+      </w:pPr>
+      <w:r>
+        <w:rPr>
+          <w:rFonts w:ascii="Times New Roman" w:eastAsia="Times New Roman" w:hAnsi="Times New Roman"/>
+          <w:b/>
+          <w:bCs/>
+          <w:color w:val="000000"/>
+          <w:sz w:val="24"/>
+          <w:szCs w:val="24"/>
+        </w:rPr>
+        <w:t xml:space="preserve">11. </w:t>
+      </w:r>
+      <w:r>
+        <w:rPr>
+          <w:rFonts w:ascii="Times New Roman" w:eastAsia="Times New Roman" w:hAnsi="Times New Roman"/>
+          <w:color w:val="000000"/>
+          <w:sz w:val="24"/>
+          <w:szCs w:val="24"/>
+        </w:rPr>
+        <w:t xml:space="preserve">Метрики узких мест показываются там, где виден симптом: диагноз «сеть или процессор» принимается по считаемой статистике на экране (СЕТЬ/CPU/КАДР/СТОПЫ), а не по косвенным признакам; WDT на IDLE-задаче рядом с легитимно занятым декодером — шум, снимаемый осознанно, когда метрика видна иначе (E-22).</w:t>
+      </w:r>
+    </w:p>
+    <w:p>
+      <w:pPr>
+        <w:spacing w:after="80" w:line="312"/>
+        <w:jc w:val="both"/>
+      </w:pPr>
+      <w:r>
+        <w:rPr>
+          <w:rFonts w:ascii="Times New Roman" w:eastAsia="Times New Roman" w:hAnsi="Times New Roman"/>
+          <w:b/>
+          <w:bCs/>
+          <w:color w:val="000000"/>
+          <w:sz w:val="24"/>
+          <w:szCs w:val="24"/>
+        </w:rPr>
+        <w:t xml:space="preserve">12. </w:t>
       </w:r>
       <w:r>
         <w:rPr>
@@ -7991,6 +10001,9 @@
     </w:rPr>
   </w:style>
   <w:style w:type="paragraph" w:styleId="Heading3">
+    <w:pPr>
+      <w:outlineLvl w:val="2"/>
+    </w:pPr>
     <w:name w:val="Heading 3"/>
     <w:basedOn w:val="Normal"/>
     <w:next w:val="Normal"/>
@@ -8002,6 +10015,9 @@
     </w:rPr>
   </w:style>
   <w:style w:type="paragraph" w:styleId="Heading4">
+    <w:pPr>
+      <w:outlineLvl w:val="3"/>
+    </w:pPr>
     <w:name w:val="Heading 4"/>
     <w:basedOn w:val="Normal"/>
     <w:next w:val="Normal"/>
@@ -8013,6 +10029,9 @@
     </w:rPr>
   </w:style>
   <w:style w:type="paragraph" w:styleId="Heading5">
+    <w:pPr>
+      <w:outlineLvl w:val="4"/>
+    </w:pPr>
     <w:name w:val="Heading 5"/>
     <w:basedOn w:val="Normal"/>
     <w:next w:val="Normal"/>
@@ -8022,6 +10041,9 @@
     </w:rPr>
   </w:style>
   <w:style w:type="paragraph" w:styleId="Heading6">
+    <w:pPr>
+      <w:outlineLvl w:val="5"/>
+    </w:pPr>
     <w:name w:val="Heading 6"/>
     <w:basedOn w:val="Normal"/>
     <w:next w:val="Normal"/>
@@ -8128,6 +10150,45 @@
       <w:sz w:val="20"/>
       <w:szCs w:val="20"/>
     </w:rPr>
+  </w:style>
+  <w:style xmlns:w="http://schemas.openxmlformats.org/wordprocessingml/2006/main" w:type="paragraph" w:styleId="9">
+    <w:name w:val="toc 1"/>
+    <w:basedOn w:val="Normal"/>
+    <w:uiPriority w:val="39"/>
+    <w:pPr>
+      <w:tabs>
+        <w:tab w:val="right" w:leader="dot" w:pos="9026"/>
+      </w:tabs>
+      <w:spacing w:before="120" w:after="60"/>
+    </w:pPr>
+    <w:rPr>
+      <w:b/>
+      <w:bCs/>
+    </w:rPr>
+  </w:style>
+  <w:style xmlns:w="http://schemas.openxmlformats.org/wordprocessingml/2006/main" w:type="paragraph" w:styleId="11">
+    <w:name w:val="toc 2"/>
+    <w:basedOn w:val="Normal"/>
+    <w:uiPriority w:val="39"/>
+    <w:pPr>
+      <w:tabs>
+        <w:tab w:val="right" w:leader="dot" w:pos="9026"/>
+      </w:tabs>
+      <w:ind w:left="360"/>
+      <w:spacing w:before="60" w:after="40"/>
+    </w:pPr>
+  </w:style>
+  <w:style xmlns:w="http://schemas.openxmlformats.org/wordprocessingml/2006/main" w:type="paragraph" w:styleId="12">
+    <w:name w:val="toc 3"/>
+    <w:basedOn w:val="Normal"/>
+    <w:uiPriority w:val="39"/>
+    <w:pPr>
+      <w:tabs>
+        <w:tab w:val="right" w:leader="dot" w:pos="9026"/>
+      </w:tabs>
+      <w:ind w:left="720"/>
+      <w:spacing w:before="40" w:after="20"/>
+    </w:pPr>
   </w:style>
 </w:styles>
 </file>

</xml_diff>

<commit_message>
docs: journal E-23 (task_wdt spam fix, false radio-URL error) + media doc revisions 27743df
</commit_message>
<xml_diff>
--- a/docs/CamBrowser_Журнал_ошибок.docx
+++ b/docs/CamBrowser_Журнал_ошибок.docx
@@ -102,7 +102,7 @@
                 <w:sz w:val="24"/>
                 <w:szCs w:val="24"/>
               </w:rPr>
-              <w:t xml:space="preserve">Симптомы, корневые причины, исправления и коммиты (9adf20e → eab762a)</w:t>
+              <w:t xml:space="preserve">Симптомы, корневые причины, исправления и коммиты (9adf20e → 27743df)</w:t>
             </w:r>
           </w:p>
           <w:p>
@@ -138,7 +138,7 @@
                 <w:sz w:val="24"/>
                 <w:szCs w:val="24"/>
               </w:rPr>
-              <w:t xml:space="preserve">Ветка: feature/ethernet-browser · 21 учтённая проблема</w:t>
+              <w:t xml:space="preserve">Ветка: feature/ethernet-browser · 23 учтённые проблемы</w:t>
             </w:r>
           </w:p>
           <w:p>
@@ -877,7 +877,7 @@
               <w:rPr>
                 <w:rStyle w:val="Hyperlink"/>
               </w:rPr>
-              <w:t>6. Медиа-подсистема: сеть, фильмы, плеер, индикация (E-16, E-17, E-19, E-20, E-21, E-22)</w:t>
+              <w:t>6. Медиа-подсистема: сеть, фильмы, плеер, индикация (E-16, E-17, E-19, E-20, E-21, E-22, E-23)</w:t>
             </w:r>
             <w:r>
               <w:tab/>
@@ -1117,41 +1117,6 @@
         </w:p>
         <w:p>
           <w:pPr>
-            <w:pStyle w:val="9"/>
-            <w:tabs>
-              <w:tab w:val="right" w:leader="dot" w:pos="9026"/>
-            </w:tabs>
-            <w:spacing w:before="120" w:after="60"/>
-          </w:pPr>
-          <w:hyperlink w:anchor="_Toc100024" w:history="1">
-            <w:r>
-              <w:rPr>
-                <w:rStyle w:val="Hyperlink"/>
-              </w:rPr>
-              <w:t>7. Инфраструктура и окружение (E-03, E-13, E-14)</w:t>
-            </w:r>
-            <w:r>
-              <w:tab/>
-            </w:r>
-            <w:r>
-              <w:fldChar w:fldCharType="begin"/>
-            </w:r>
-            <w:r>
-              <w:instrText xml:space="preserve"> PAGEREF _Toc100024 \h </w:instrText>
-            </w:r>
-            <w:r>
-              <w:fldChar w:fldCharType="separate"/>
-            </w:r>
-            <w:r>
-              <w:t>12</w:t>
-            </w:r>
-            <w:r>
-              <w:fldChar w:fldCharType="end"/>
-            </w:r>
-          </w:hyperlink>
-        </w:p>
-        <w:p>
-          <w:pPr>
             <w:pStyle w:val="11"/>
             <w:ind w:left="360"/>
             <w:tabs>
@@ -1159,12 +1124,47 @@
             </w:tabs>
             <w:spacing w:before="120" w:after="60"/>
           </w:pPr>
+          <w:hyperlink w:anchor="_Toc100024" w:history="1">
+            <w:r>
+              <w:rPr>
+                <w:rStyle w:val="Hyperlink"/>
+              </w:rPr>
+              <w:t>E-23. Спам «task_wdt: task not found» и ложная «Invalid argument» в журнале при работающем плеере</w:t>
+            </w:r>
+            <w:r>
+              <w:tab/>
+            </w:r>
+            <w:r>
+              <w:fldChar w:fldCharType="begin"/>
+            </w:r>
+            <w:r>
+              <w:instrText xml:space="preserve"> PAGEREF _Toc100024 \h </w:instrText>
+            </w:r>
+            <w:r>
+              <w:fldChar w:fldCharType="separate"/>
+            </w:r>
+            <w:r>
+              <w:t>12</w:t>
+            </w:r>
+            <w:r>
+              <w:fldChar w:fldCharType="end"/>
+            </w:r>
+          </w:hyperlink>
+        </w:p>
+        <w:p>
+          <w:pPr>
+            <w:pStyle w:val="9"/>
+            <w:tabs>
+              <w:tab w:val="right" w:leader="dot" w:pos="9026"/>
+            </w:tabs>
+            <w:spacing w:before="120" w:after="60"/>
+          </w:pPr>
           <w:hyperlink w:anchor="_Toc100025" w:history="1">
             <w:r>
               <w:rPr>
                 <w:rStyle w:val="Hyperlink"/>
               </w:rPr>
-              <w:t>E-13. Проблемы окружения: инструменты, токен, контейнеризация</w:t>
+              <w:t>7. Инфраструктура и окружение (E-03, E-13, E-14)</w:t>
             </w:r>
             <w:r>
               <w:tab/>
@@ -1179,7 +1179,7 @@
               <w:fldChar w:fldCharType="separate"/>
             </w:r>
             <w:r>
-              <w:t>12</w:t>
+              <w:t>13</w:t>
             </w:r>
             <w:r>
               <w:fldChar w:fldCharType="end"/>
@@ -1200,7 +1200,7 @@
               <w:rPr>
                 <w:rStyle w:val="Hyperlink"/>
               </w:rPr>
-              <w:t>E-03. Документация репозитория отстала от кода</w:t>
+              <w:t>E-13. Проблемы окружения: инструменты, токен, контейнеризация</w:t>
             </w:r>
             <w:r>
               <w:tab/>
@@ -1236,6 +1236,42 @@
               <w:rPr>
                 <w:rStyle w:val="Hyperlink"/>
               </w:rPr>
+              <w:t>E-03. Документация репозитория отстала от кода</w:t>
+            </w:r>
+            <w:r>
+              <w:tab/>
+            </w:r>
+            <w:r>
+              <w:fldChar w:fldCharType="begin"/>
+            </w:r>
+            <w:r>
+              <w:instrText xml:space="preserve"> PAGEREF _Toc100027 \h </w:instrText>
+            </w:r>
+            <w:r>
+              <w:fldChar w:fldCharType="separate"/>
+            </w:r>
+            <w:r>
+              <w:t>13</w:t>
+            </w:r>
+            <w:r>
+              <w:fldChar w:fldCharType="end"/>
+            </w:r>
+          </w:hyperlink>
+        </w:p>
+        <w:p>
+          <w:pPr>
+            <w:pStyle w:val="11"/>
+            <w:ind w:left="360"/>
+            <w:tabs>
+              <w:tab w:val="right" w:leader="dot" w:pos="9026"/>
+            </w:tabs>
+            <w:spacing w:before="120" w:after="60"/>
+          </w:pPr>
+          <w:hyperlink w:anchor="_Toc100028" w:history="1">
+            <w:r>
+              <w:rPr>
+                <w:rStyle w:val="Hyperlink"/>
+              </w:rPr>
               <w:t>E-14. Не исправляется: vendor-warning в espressif__esp_lcd_st7701</w:t>
             </w:r>
             <w:r>
@@ -1245,7 +1281,7 @@
               <w:fldChar w:fldCharType="begin"/>
             </w:r>
             <w:r>
-              <w:instrText xml:space="preserve"> PAGEREF _Toc100027 \h </w:instrText>
+              <w:instrText xml:space="preserve"> PAGEREF _Toc100028 \h </w:instrText>
             </w:r>
             <w:r>
               <w:fldChar w:fldCharType="separate"/>
@@ -1266,7 +1302,7 @@
             </w:tabs>
             <w:spacing w:before="120" w:after="60"/>
           </w:pPr>
-          <w:hyperlink w:anchor="_Toc100028" w:history="1">
+          <w:hyperlink w:anchor="_Toc100029" w:history="1">
             <w:r>
               <w:rPr>
                 <w:rStyle w:val="Hyperlink"/>
@@ -1280,13 +1316,13 @@
               <w:fldChar w:fldCharType="begin"/>
             </w:r>
             <w:r>
-              <w:instrText xml:space="preserve"> PAGEREF _Toc100028 \h </w:instrText>
+              <w:instrText xml:space="preserve"> PAGEREF _Toc100029 \h </w:instrText>
             </w:r>
             <w:r>
               <w:fldChar w:fldCharType="separate"/>
             </w:r>
             <w:r>
-              <w:t>13</w:t>
+              <w:t>14</w:t>
             </w:r>
             <w:r>
               <w:fldChar w:fldCharType="end"/>
@@ -1408,7 +1444,7 @@
           <w:sz w:val="24"/>
           <w:szCs w:val="24"/>
         </w:rPr>
-        <w:t xml:space="preserve">Журнал открыт: записи E-01…E-14 охватывают первый цикл отладки (подъём сборки на IDF 6, периферия, кириллица), записи E-15…E-22 — второй цикл (SD-карта, подсистема «ФИЛЬМЫ», плеер esp_player, индикация занятости, переход пользователя на локальную сборку, экранная диагностика производительности). Новые записи добавляются по той же схеме: симптом → причина → решение → урок.</w:t>
+        <w:t xml:space="preserve">Журнал открыт: записи E-01…E-14 охватывают первый цикл отладки (подъём сборки на IDF 6, периферия, кириллица), записи E-15…E-23 — второй цикл (SD-карта, подсистема «ФИЛЬМЫ», плеер esp_player, индикация занятости, переход пользователя на локальную сборку, экранная диагностика производительности, чистота диагностического журнала). Новые записи добавляются по той же схеме: симптом → причина → решение → урок.</w:t>
       </w:r>
     </w:p>
     <w:p>
@@ -4831,6 +4867,152 @@
           </w:p>
         </w:tc>
       </w:tr>
+      <w:tr>
+        <w:trPr>
+          <w:cantSplit/>
+          <w:tblHeader w:val="off"/>
+        </w:trPr>
+        <w:tc>
+          <w:tcPr>
+            <w:tcW w:type="pct" w:w="400"/>
+            <w:tcMar>
+              <w:top w:type="dxa" w:w="60"/>
+              <w:left w:type="dxa" w:w="120"/>
+              <w:bottom w:type="dxa" w:w="60"/>
+              <w:right w:type="dxa" w:w="120"/>
+            </w:tcMar>
+          </w:tcPr>
+          <w:p>
+            <w:pPr>
+              <w:spacing w:line="276"/>
+              <w:jc w:val="left"/>
+            </w:pPr>
+            <w:r>
+              <w:rPr>
+                <w:rFonts w:ascii="Times New Roman" w:eastAsia="Times New Roman" w:hAnsi="Times New Roman"/>
+                <w:b w:val="false"/>
+                <w:bCs w:val="false"/>
+                <w:color w:val="000000"/>
+                <w:sz w:val="20"/>
+                <w:szCs w:val="20"/>
+              </w:rPr>
+              <w:t xml:space="preserve">E-23</w:t>
+            </w:r>
+          </w:p>
+        </w:tc>
+        <w:tc>
+          <w:tcPr>
+            <w:tcW w:type="pct" w:w="1700"/>
+            <w:tcMar>
+              <w:top w:type="dxa" w:w="60"/>
+              <w:left w:type="dxa" w:w="120"/>
+              <w:bottom w:type="dxa" w:w="60"/>
+              <w:right w:type="dxa" w:w="120"/>
+            </w:tcMar>
+          </w:tcPr>
+          <w:p>
+            <w:pPr>
+              <w:spacing w:line="276"/>
+              <w:jc w:val="left"/>
+            </w:pPr>
+            <w:r>
+              <w:rPr>
+                <w:rFonts w:ascii="Times New Roman" w:eastAsia="Times New Roman" w:hAnsi="Times New Roman"/>
+                <w:b w:val="false"/>
+                <w:bCs w:val="false"/>
+                <w:color w:val="000000"/>
+                <w:sz w:val="20"/>
+                <w:szCs w:val="20"/>
+              </w:rPr>
+              <w:t xml:space="preserve">Спам «task_wdt: task not found» и ложная «Invalid argument» при старте радио</w:t>
+            </w:r>
+          </w:p>
+        </w:tc>
+        <w:tc>
+          <w:tcPr>
+            <w:tcW w:type="pct" w:w="800"/>
+            <w:tcMar>
+              <w:top w:type="dxa" w:w="60"/>
+              <w:left w:type="dxa" w:w="120"/>
+              <w:bottom w:type="dxa" w:w="60"/>
+              <w:right w:type="dxa" w:w="120"/>
+            </w:tcMar>
+          </w:tcPr>
+          <w:p>
+            <w:pPr>
+              <w:spacing w:line="276"/>
+              <w:jc w:val="left"/>
+            </w:pPr>
+            <w:r>
+              <w:rPr>
+                <w:rFonts w:ascii="Times New Roman" w:eastAsia="Times New Roman" w:hAnsi="Times New Roman"/>
+                <w:b w:val="false"/>
+                <w:bCs w:val="false"/>
+                <w:color w:val="000000"/>
+                <w:sz w:val="20"/>
+                <w:szCs w:val="20"/>
+              </w:rPr>
+              <w:t xml:space="preserve">Плеер / журнал</w:t>
+            </w:r>
+          </w:p>
+        </w:tc>
+        <w:tc>
+          <w:tcPr>
+            <w:tcW w:type="pct" w:w="1300"/>
+            <w:tcMar>
+              <w:top w:type="dxa" w:w="60"/>
+              <w:left w:type="dxa" w:w="120"/>
+              <w:bottom w:type="dxa" w:w="60"/>
+              <w:right w:type="dxa" w:w="120"/>
+            </w:tcMar>
+          </w:tcPr>
+          <w:p>
+            <w:pPr>
+              <w:spacing w:line="276"/>
+              <w:jc w:val="left"/>
+            </w:pPr>
+            <w:r>
+              <w:rPr>
+                <w:rFonts w:ascii="Times New Roman" w:eastAsia="Times New Roman" w:hAnsi="Times New Roman"/>
+                <w:b w:val="false"/>
+                <w:bCs w:val="false"/>
+                <w:color w:val="000000"/>
+                <w:sz w:val="20"/>
+                <w:szCs w:val="20"/>
+              </w:rPr>
+              <w:t xml:space="preserve">27743df</w:t>
+            </w:r>
+          </w:p>
+        </w:tc>
+        <w:tc>
+          <w:tcPr>
+            <w:tcW w:type="pct" w:w="800"/>
+            <w:tcMar>
+              <w:top w:type="dxa" w:w="60"/>
+              <w:left w:type="dxa" w:w="120"/>
+              <w:bottom w:type="dxa" w:w="60"/>
+              <w:right w:type="dxa" w:w="120"/>
+            </w:tcMar>
+          </w:tcPr>
+          <w:p>
+            <w:pPr>
+              <w:spacing w:line="276"/>
+              <w:jc w:val="left"/>
+            </w:pPr>
+            <w:r>
+              <w:rPr>
+                <w:rFonts w:ascii="Times New Roman" w:eastAsia="Times New Roman" w:hAnsi="Times New Roman"/>
+                <w:b w:val="false"/>
+                <w:bCs w:val="false"/>
+                <w:color w:val="000000"/>
+                <w:sz w:val="20"/>
+                <w:szCs w:val="20"/>
+              </w:rPr>
+              <w:t xml:space="preserve">Исправлено</w:t>
+            </w:r>
+          </w:p>
+        </w:tc>
+      </w:tr>
     </w:tbl>
     <w:p>
       <w:pPr>
@@ -4845,7 +5027,7 @@
           <w:sz w:val="24"/>
           <w:szCs w:val="24"/>
         </w:rPr>
-        <w:t xml:space="preserve">Коммиты d2e3606 и 668083b применены пользователем параллельно (содержимое совпало с подготовленным патчем); 343c42f…53482b7 — первый цикл исправлений ветки; 7ab5082…c1243b6 — второй цикл (медиа-подсистема). После каждого коммита CI завершался SUCCESS; ключевые исправления подтверждены работой на реальной плате (E-04/E-05/E-07/E-08/E-15/E-16/E-17/E-19/E-20). Начиная с E-18 сборку выполняет сам пользователь локально в VS Code ESP-IDF; CI остаётся независимым контролем ревизии.</w:t>
+        <w:t xml:space="preserve">Коммиты d2e3606 и 668083b применены пользователем параллельно (содержимое совпало с подготовленным патчем); 343c42f…53482b7 — первый цикл исправлений ветки; 7ab5082…27743df — второй цикл (медиа-подсистема). После каждого коммита CI завершался SUCCESS; ключевые исправления подтверждены работой на реальной плате (E-04/E-05/E-07/E-08/E-15/E-16/E-17/E-19/E-20). Начиная с E-18 сборку выполняет сам пользователь локально в VS Code ESP-IDF; CI остаётся независимым контролем ревизии.</w:t>
       </w:r>
     </w:p>
     <w:p>
@@ -7136,7 +7318,7 @@
           <w:sz w:val="32"/>
           <w:szCs w:val="32"/>
         </w:rPr>
-        <w:t xml:space="preserve">6. Медиа-подсистема: сеть, фильмы, плеер, индикация (E-16, E-17, E-19, E-20, E-21, E-22)</w:t>
+        <w:t xml:space="preserve">6. Медиа-подсистема: сеть, фильмы, плеер, индикация (E-16, E-17, E-19, E-20, E-21, E-22, E-23)</w:t>
       </w:r>
       <w:bookmarkEnd w:id="100017"/>
     </w:p>
@@ -9162,10 +9344,166 @@
     </w:tbl>
     <w:p>
       <w:pPr>
+        <w:pStyle w:val="Heading2"/>
+        <w:spacing w:after="120" w:before="260" w:line="312"/>
+      </w:pPr>
+      <w:bookmarkStart w:id="100024" w:name="_Toc100024"/>
+      <w:r>
+        <w:rPr>
+          <w:rFonts w:ascii="Arial" w:eastAsia="Arial" w:hAnsi="Arial"/>
+          <w:b/>
+          <w:bCs/>
+          <w:color w:val="0F2B40"/>
+          <w:sz w:val="28"/>
+          <w:szCs w:val="28"/>
+        </w:rPr>
+        <w:t xml:space="preserve">E-23. Спам «task_wdt: task not found» и ложная «Invalid argument» в журнале при работающем плеере</w:t>
+      </w:r>
+      <w:bookmarkEnd w:id="100024"/>
+    </w:p>
+    <w:p>
+      <w:pPr>
+        <w:spacing w:after="80" w:line="312"/>
+        <w:ind w:firstLine="480"/>
+        <w:jc w:val="both"/>
+      </w:pPr>
+      <w:r>
+        <w:rPr>
+          <w:rFonts w:ascii="Times New Roman" w:eastAsia="Times New Roman" w:hAnsi="Times New Roman"/>
+          <w:b/>
+          <w:bCs/>
+          <w:color w:val="000000"/>
+          <w:sz w:val="24"/>
+          <w:szCs w:val="24"/>
+        </w:rPr>
+        <w:t xml:space="preserve">Симптом. </w:t>
+      </w:r>
+      <w:r>
+        <w:rPr>
+          <w:rFonts w:ascii="Times New Roman" w:eastAsia="Times New Roman" w:hAnsi="Times New Roman"/>
+          <w:color w:val="000000"/>
+          <w:sz w:val="24"/>
+          <w:szCs w:val="24"/>
+        </w:rPr>
+        <w:t xml:space="preserve">Лог после c1243b6 (сборка b76e196): радио стартует нормально, но с момента инициализации плеера журнал заливает поток ошибок </w:t>
+      </w:r>
+      <w:r>
+        <w:rPr>
+          <w:rFonts w:ascii="Consolas" w:eastAsia="Consolas" w:hAnsi="Consolas"/>
+          <w:color w:val="000000"/>
+          <w:sz w:val="24"/>
+          <w:szCs w:val="24"/>
+        </w:rPr>
+        <w:t xml:space="preserve">task_wdt: esp_task_wdt_reset(707): task not found</w:t>
+      </w:r>
+      <w:r>
+        <w:rPr>
+          <w:rFonts w:ascii="Times New Roman" w:eastAsia="Times New Roman" w:hAnsi="Times New Roman"/>
+          <w:color w:val="000000"/>
+          <w:sz w:val="24"/>
+          <w:szCs w:val="24"/>
+        </w:rPr>
+        <w:t xml:space="preserve"> — десятки строк в секунду всё время работы; строки UART искажаются («EI (18759)…», «audio track pEarsed»), IDF-монитор сообщает о таймаутах записи в порт. Там же при старте радио: </w:t>
+      </w:r>
+      <w:r>
+        <w:rPr>
+          <w:rFonts w:ascii="Consolas" w:eastAsia="Consolas" w:hAnsi="Consolas"/>
+          <w:color w:val="000000"/>
+          <w:sz w:val="24"/>
+          <w:szCs w:val="24"/>
+        </w:rPr>
+        <w:t xml:space="preserve">ESP_PLAYER_HELPER: Invalid argument. url: http://…/ep128, format: 0x4825ac3c</w:t>
+      </w:r>
+      <w:r>
+        <w:rPr>
+          <w:rFonts w:ascii="Times New Roman" w:eastAsia="Times New Roman" w:hAnsi="Times New Roman"/>
+          <w:color w:val="000000"/>
+          <w:sz w:val="24"/>
+          <w:szCs w:val="24"/>
+        </w:rPr>
+        <w:t xml:space="preserve"> — при том, что поток открывается и играет.</w:t>
+      </w:r>
+    </w:p>
+    <w:p>
+      <w:pPr>
+        <w:spacing w:after="80" w:line="312"/>
+        <w:ind w:firstLine="480"/>
+        <w:jc w:val="both"/>
+      </w:pPr>
+      <w:r>
+        <w:rPr>
+          <w:rFonts w:ascii="Times New Roman" w:eastAsia="Times New Roman" w:hAnsi="Times New Roman"/>
+          <w:b/>
+          <w:bCs/>
+          <w:color w:val="000000"/>
+          <w:sz w:val="24"/>
+          <w:szCs w:val="24"/>
+        </w:rPr>
+        <w:t xml:space="preserve">Корневые причины (две независимые). </w:t>
+      </w:r>
+      <w:r>
+        <w:rPr>
+          <w:rFonts w:ascii="Times New Roman" w:eastAsia="Times New Roman" w:hAnsi="Times New Roman"/>
+          <w:color w:val="000000"/>
+          <w:sz w:val="24"/>
+          <w:szCs w:val="24"/>
+        </w:rPr>
+        <w:t xml:space="preserve">(1) В E-22 IDLE1 снимался с task watchdog вызовом esp_task_wdt_delete(idle1). В IDF это удаляет запись задачи из списка наблюдения, но НЕ снимает зарегистрированный idle-хук: idle_hook_cb() безусловно дергает esp_task_wdt_reset() при каждом проходе IDLE1, и раз записи в списке больше нет, каждый простой ядра 1 даёт «task not found» (task_wdt.c:707) — при радио-потоке ядро простаивает постоянно, отсюда десятки ошибок в секунду. (2) player_get_favor_type() esp_player угадывает контейнер по расширению в URL; у радио-ссылок расширения нет (…/ep128), функция печатает ERROR «Invalid argument … format: 0x…» (в %p — адрес локальной переменной, к сути сбоя отношения не имеет) и возвращает ошибку, которую player_stream.c игнорирует: формат определяется пробой, воспроизведение не затронуто.</w:t>
+      </w:r>
+    </w:p>
+    <w:p>
+      <w:pPr>
+        <w:spacing w:after="80" w:line="312"/>
+        <w:ind w:firstLine="480"/>
+        <w:jc w:val="both"/>
+      </w:pPr>
+      <w:r>
+        <w:rPr>
+          <w:rFonts w:ascii="Times New Roman" w:eastAsia="Times New Roman" w:hAnsi="Times New Roman"/>
+          <w:b/>
+          <w:bCs/>
+          <w:color w:val="000000"/>
+          <w:sz w:val="24"/>
+          <w:szCs w:val="24"/>
+        </w:rPr>
+        <w:t xml:space="preserve">Решение (коммит 27743df). </w:t>
+      </w:r>
+      <w:r>
+        <w:rPr>
+          <w:rFonts w:ascii="Times New Roman" w:eastAsia="Times New Roman" w:hAnsi="Times New Roman"/>
+          <w:color w:val="000000"/>
+          <w:sz w:val="24"/>
+          <w:szCs w:val="24"/>
+        </w:rPr>
+        <w:t xml:space="preserve">(1) Снятие IDLE1 переведено на esp_task_wdt_reconfigure(): публичный API IDF 6 принимает idle_core_mask, внутренний unsubscribe_idle() корректно снимает и idle-хук, и запись задачи; маска «только CPU0» сохраняет намерение E-22 (насыщение декодера видно по CPU1% и КАДР), таймаут и режим паники берутся из Kconfig без изменений. (2) Тег ESP_PLAYER_HELPER приглушён (esp_log_level_set → NONE): его ERROR — только эта ложная диагностика и дубль отказа, который наш код и так показывает своим сообщением. </w:t>
+      </w:r>
+      <w:r>
+        <w:rPr>
+          <w:rFonts w:ascii="Times New Roman" w:eastAsia="Times New Roman" w:hAnsi="Times New Roman"/>
+          <w:b/>
+          <w:bCs/>
+          <w:color w:val="000000"/>
+          <w:sz w:val="24"/>
+          <w:szCs w:val="24"/>
+        </w:rPr>
+        <w:t xml:space="preserve">Урок: </w:t>
+      </w:r>
+      <w:r>
+        <w:rPr>
+          <w:rFonts w:ascii="Times New Roman" w:eastAsia="Times New Roman" w:hAnsi="Times New Roman"/>
+          <w:color w:val="000000"/>
+          <w:sz w:val="24"/>
+          <w:szCs w:val="24"/>
+        </w:rPr>
+        <w:t xml:space="preserve">в IDF «снять задачу с watchdog» и «снять её idle-хук» — разные операции, объединённые только в reconfigure(); приглушать чужой тег разрешено лишь после доказательства безвредности по исходникам (здесь: возвращаемая ошибка игнорируется вызывающим).</w:t>
+      </w:r>
+    </w:p>
+    <w:p>
+      <w:pPr>
         <w:pStyle w:val="Heading1"/>
         <w:spacing w:after="160" w:before="360" w:line="312"/>
       </w:pPr>
-      <w:bookmarkStart w:id="100024" w:name="_Toc100024"/>
+      <w:bookmarkStart w:id="100025" w:name="_Toc100025"/>
       <w:r>
         <w:rPr>
           <w:rFonts w:ascii="Arial" w:eastAsia="Arial" w:hAnsi="Arial"/>
@@ -9177,14 +9515,14 @@
         </w:rPr>
         <w:t xml:space="preserve">7. Инфраструктура и окружение (E-03, E-13, E-14)</w:t>
       </w:r>
-      <w:bookmarkEnd w:id="100024"/>
+      <w:bookmarkEnd w:id="100025"/>
     </w:p>
     <w:p>
       <w:pPr>
         <w:pStyle w:val="Heading2"/>
         <w:spacing w:after="120" w:before="260" w:line="312"/>
       </w:pPr>
-      <w:bookmarkStart w:id="100025" w:name="_Toc100025"/>
+      <w:bookmarkStart w:id="100026" w:name="_Toc100026"/>
       <w:r>
         <w:rPr>
           <w:rFonts w:ascii="Arial" w:eastAsia="Arial" w:hAnsi="Arial"/>
@@ -9196,7 +9534,7 @@
         </w:rPr>
         <w:t xml:space="preserve">E-13. Проблемы окружения: инструменты, токен, контейнеризация</w:t>
       </w:r>
-      <w:bookmarkEnd w:id="100025"/>
+      <w:bookmarkEnd w:id="100026"/>
     </w:p>
     <w:p>
       <w:pPr>
@@ -9284,7 +9622,7 @@
         <w:pStyle w:val="Heading2"/>
         <w:spacing w:after="120" w:before="260" w:line="312"/>
       </w:pPr>
-      <w:bookmarkStart w:id="100026" w:name="_Toc100026"/>
+      <w:bookmarkStart w:id="100027" w:name="_Toc100027"/>
       <w:r>
         <w:rPr>
           <w:rFonts w:ascii="Arial" w:eastAsia="Arial" w:hAnsi="Arial"/>
@@ -9296,7 +9634,7 @@
         </w:rPr>
         <w:t xml:space="preserve">E-03. Документация репозитория отстала от кода</w:t>
       </w:r>
-      <w:bookmarkEnd w:id="100026"/>
+      <w:bookmarkEnd w:id="100027"/>
     </w:p>
     <w:p>
       <w:pPr>
@@ -9319,7 +9657,7 @@
         <w:pStyle w:val="Heading2"/>
         <w:spacing w:after="120" w:before="260" w:line="312"/>
       </w:pPr>
-      <w:bookmarkStart w:id="100027" w:name="_Toc100027"/>
+      <w:bookmarkStart w:id="100028" w:name="_Toc100028"/>
       <w:r>
         <w:rPr>
           <w:rFonts w:ascii="Arial" w:eastAsia="Arial" w:hAnsi="Arial"/>
@@ -9331,7 +9669,7 @@
         </w:rPr>
         <w:t xml:space="preserve">E-14. Не исправляется: vendor-warning в espressif__esp_lcd_st7701</w:t>
       </w:r>
-      <w:bookmarkEnd w:id="100027"/>
+      <w:bookmarkEnd w:id="100028"/>
     </w:p>
     <w:p>
       <w:pPr>
@@ -9354,7 +9692,7 @@
         <w:pStyle w:val="Heading1"/>
         <w:spacing w:after="160" w:before="360" w:line="312"/>
       </w:pPr>
-      <w:bookmarkStart w:id="100028" w:name="_Toc100028"/>
+      <w:bookmarkStart w:id="100029" w:name="_Toc100029"/>
       <w:r>
         <w:rPr>
           <w:rFonts w:ascii="Arial" w:eastAsia="Arial" w:hAnsi="Arial"/>
@@ -9366,7 +9704,7 @@
         </w:rPr>
         <w:t xml:space="preserve">8. Выводы и практики, внедрённые по итогам</w:t>
       </w:r>
-      <w:bookmarkEnd w:id="100028"/>
+      <w:bookmarkEnd w:id="100029"/>
     </w:p>
     <w:p>
       <w:pPr>
@@ -9381,7 +9719,7 @@
           <w:sz w:val="24"/>
           <w:szCs w:val="24"/>
         </w:rPr>
-        <w:t xml:space="preserve">За два цикла отладки (9adf20e → c1243b6) закрыты: три критичных дефекта периферии (Ethernet не поднялся бы без сброса PHY и правильного тактирования; тач не отвечал без hw-reset и верной шины; координаты были мусором из-за однобайтового смещения регистра), две системные проблемы конфигурации (старение sdkconfig, ECDSA-периферия по ревизии чипа), полный конвейер кириллицы, состояние SD-драйвера при повторной инициализации, сквозной тракт воспроизведения фильмов (прямой URL узла, честные коды ошибок, ленивая проба, профильный gate по факту декодера, кэш вердиктов) и видимость долгих операций (busy-карточка). Ни одна ошибка не потребовала изменения железа — все решения вошли в код/конфиг и подтверждены на плате.</w:t>
+        <w:t xml:space="preserve">За два цикла отладки (9adf20e → 27743df) закрыты: три критичных дефекта периферии (Ethernet не поднялся бы без сброса PHY и правильного тактирования; тач не отвечал без hw-reset и верной шины; координаты были мусором из-за однобайтового смещения регистра), две системные проблемы конфигурации (старение sdkconfig, ECDSA-периферия по ревизии чипа), полный конвейер кириллицы, состояние SD-драйвера при повторной инициализации, сквозной тракт воспроизведения фильмов (прямой URL узла, честные коды ошибок, ленивая проба, профильный gate по факту декодера, кэш вердиктов), видимость долгих операций (busy-карточка) и чистота журнала при работающем плеере (E-23). Ни одна ошибка не потребовала изменения железа — все решения вошли в код/конфиг и подтверждены на плате.</w:t>
       </w:r>
     </w:p>
     <w:p>
@@ -9703,6 +10041,32 @@
           <w:szCs w:val="24"/>
         </w:rPr>
         <w:t xml:space="preserve">12. </w:t>
+      </w:r>
+      <w:r>
+        <w:rPr>
+          <w:rFonts w:ascii="Times New Roman" w:eastAsia="Times New Roman" w:hAnsi="Times New Roman"/>
+          <w:color w:val="000000"/>
+          <w:sz w:val="24"/>
+          <w:szCs w:val="24"/>
+        </w:rPr>
+        <w:t xml:space="preserve">IDLE-задачу снимают с task watchdog только через esp_task_wdt_reconfigure(): delete удаляет запись, но оставляет idle-хук — каждый простой ядра сыплет «task not found» и рвёт журнал (E-23).</w:t>
+      </w:r>
+    </w:p>
+    <w:p>
+      <w:pPr>
+        <w:spacing w:after="80" w:line="312"/>
+        <w:jc w:val="both"/>
+      </w:pPr>
+      <w:r>
+        <w:rPr>
+          <w:rFonts w:ascii="Times New Roman" w:eastAsia="Times New Roman" w:hAnsi="Times New Roman"/>
+          <w:b/>
+          <w:bCs/>
+          <w:color w:val="000000"/>
+          <w:sz w:val="24"/>
+          <w:szCs w:val="24"/>
+        </w:rPr>
+        <w:t xml:space="preserve">13. </w:t>
       </w:r>
       <w:r>
         <w:rPr>

</xml_diff>

<commit_message>
docs: journal E-24 (buffering-gate flap storm, decode-throttle signature) + media doc revisions f7b5f69
</commit_message>
<xml_diff>
--- a/docs/CamBrowser_Журнал_ошибок.docx
+++ b/docs/CamBrowser_Журнал_ошибок.docx
@@ -102,7 +102,7 @@
                 <w:sz w:val="24"/>
                 <w:szCs w:val="24"/>
               </w:rPr>
-              <w:t xml:space="preserve">Симптомы, корневые причины, исправления и коммиты (9adf20e → 27743df)</w:t>
+              <w:t xml:space="preserve">Симптомы, корневые причины, исправления и коммиты (9adf20e → f7b5f69)</w:t>
             </w:r>
           </w:p>
           <w:p>
@@ -138,7 +138,7 @@
                 <w:sz w:val="24"/>
                 <w:szCs w:val="24"/>
               </w:rPr>
-              <w:t xml:space="preserve">Ветка: feature/ethernet-browser · 23 учтённые проблемы</w:t>
+              <w:t xml:space="preserve">Ветка: feature/ethernet-browser · 24 учтённые проблемы</w:t>
             </w:r>
           </w:p>
           <w:p>
@@ -877,7 +877,7 @@
               <w:rPr>
                 <w:rStyle w:val="Hyperlink"/>
               </w:rPr>
-              <w:t>6. Медиа-подсистема: сеть, фильмы, плеер, индикация (E-16, E-17, E-19, E-20, E-21, E-22, E-23)</w:t>
+              <w:t>6. Медиа-подсистема: сеть, фильмы, плеер, индикация (E-16, E-17, E-19, E-20, E-21, E-22, E-23, E-24)</w:t>
             </w:r>
             <w:r>
               <w:tab/>
@@ -1153,41 +1153,6 @@
         </w:p>
         <w:p>
           <w:pPr>
-            <w:pStyle w:val="9"/>
-            <w:tabs>
-              <w:tab w:val="right" w:leader="dot" w:pos="9026"/>
-            </w:tabs>
-            <w:spacing w:before="120" w:after="60"/>
-          </w:pPr>
-          <w:hyperlink w:anchor="_Toc100025" w:history="1">
-            <w:r>
-              <w:rPr>
-                <w:rStyle w:val="Hyperlink"/>
-              </w:rPr>
-              <w:t>7. Инфраструктура и окружение (E-03, E-13, E-14)</w:t>
-            </w:r>
-            <w:r>
-              <w:tab/>
-            </w:r>
-            <w:r>
-              <w:fldChar w:fldCharType="begin"/>
-            </w:r>
-            <w:r>
-              <w:instrText xml:space="preserve"> PAGEREF _Toc100025 \h </w:instrText>
-            </w:r>
-            <w:r>
-              <w:fldChar w:fldCharType="separate"/>
-            </w:r>
-            <w:r>
-              <w:t>13</w:t>
-            </w:r>
-            <w:r>
-              <w:fldChar w:fldCharType="end"/>
-            </w:r>
-          </w:hyperlink>
-        </w:p>
-        <w:p>
-          <w:pPr>
             <w:pStyle w:val="11"/>
             <w:ind w:left="360"/>
             <w:tabs>
@@ -1195,12 +1160,47 @@
             </w:tabs>
             <w:spacing w:before="120" w:after="60"/>
           </w:pPr>
+          <w:hyperlink w:anchor="_Toc100025" w:history="1">
+            <w:r>
+              <w:rPr>
+                <w:rStyle w:val="Hyperlink"/>
+              </w:rPr>
+              <w:t>E-24. Шторм «buffering…/buffered»: сотни событий за минуты, пары по 10–30 мс</w:t>
+            </w:r>
+            <w:r>
+              <w:tab/>
+            </w:r>
+            <w:r>
+              <w:fldChar w:fldCharType="begin"/>
+            </w:r>
+            <w:r>
+              <w:instrText xml:space="preserve"> PAGEREF _Toc100025 \h </w:instrText>
+            </w:r>
+            <w:r>
+              <w:fldChar w:fldCharType="separate"/>
+            </w:r>
+            <w:r>
+              <w:t>13</w:t>
+            </w:r>
+            <w:r>
+              <w:fldChar w:fldCharType="end"/>
+            </w:r>
+          </w:hyperlink>
+        </w:p>
+        <w:p>
+          <w:pPr>
+            <w:pStyle w:val="9"/>
+            <w:tabs>
+              <w:tab w:val="right" w:leader="dot" w:pos="9026"/>
+            </w:tabs>
+            <w:spacing w:before="120" w:after="60"/>
+          </w:pPr>
           <w:hyperlink w:anchor="_Toc100026" w:history="1">
             <w:r>
               <w:rPr>
                 <w:rStyle w:val="Hyperlink"/>
               </w:rPr>
-              <w:t>E-13. Проблемы окружения: инструменты, токен, контейнеризация</w:t>
+              <w:t>7. Инфраструктура и окружение (E-03, E-13, E-14)</w:t>
             </w:r>
             <w:r>
               <w:tab/>
@@ -1236,7 +1236,7 @@
               <w:rPr>
                 <w:rStyle w:val="Hyperlink"/>
               </w:rPr>
-              <w:t>E-03. Документация репозитория отстала от кода</w:t>
+              <w:t>E-13. Проблемы окружения: инструменты, токен, контейнеризация</w:t>
             </w:r>
             <w:r>
               <w:tab/>
@@ -1272,6 +1272,42 @@
               <w:rPr>
                 <w:rStyle w:val="Hyperlink"/>
               </w:rPr>
+              <w:t>E-03. Документация репозитория отстала от кода</w:t>
+            </w:r>
+            <w:r>
+              <w:tab/>
+            </w:r>
+            <w:r>
+              <w:fldChar w:fldCharType="begin"/>
+            </w:r>
+            <w:r>
+              <w:instrText xml:space="preserve"> PAGEREF _Toc100028 \h </w:instrText>
+            </w:r>
+            <w:r>
+              <w:fldChar w:fldCharType="separate"/>
+            </w:r>
+            <w:r>
+              <w:t>14</w:t>
+            </w:r>
+            <w:r>
+              <w:fldChar w:fldCharType="end"/>
+            </w:r>
+          </w:hyperlink>
+        </w:p>
+        <w:p>
+          <w:pPr>
+            <w:pStyle w:val="11"/>
+            <w:ind w:left="360"/>
+            <w:tabs>
+              <w:tab w:val="right" w:leader="dot" w:pos="9026"/>
+            </w:tabs>
+            <w:spacing w:before="120" w:after="60"/>
+          </w:pPr>
+          <w:hyperlink w:anchor="_Toc100029" w:history="1">
+            <w:r>
+              <w:rPr>
+                <w:rStyle w:val="Hyperlink"/>
+              </w:rPr>
               <w:t>E-14. Не исправляется: vendor-warning в espressif__esp_lcd_st7701</w:t>
             </w:r>
             <w:r>
@@ -1281,13 +1317,13 @@
               <w:fldChar w:fldCharType="begin"/>
             </w:r>
             <w:r>
-              <w:instrText xml:space="preserve"> PAGEREF _Toc100028 \h </w:instrText>
+              <w:instrText xml:space="preserve"> PAGEREF _Toc100029 \h </w:instrText>
             </w:r>
             <w:r>
               <w:fldChar w:fldCharType="separate"/>
             </w:r>
             <w:r>
-              <w:t>13</w:t>
+              <w:t>14</w:t>
             </w:r>
             <w:r>
               <w:fldChar w:fldCharType="end"/>
@@ -1302,7 +1338,7 @@
             </w:tabs>
             <w:spacing w:before="120" w:after="60"/>
           </w:pPr>
-          <w:hyperlink w:anchor="_Toc100029" w:history="1">
+          <w:hyperlink w:anchor="_Toc100030" w:history="1">
             <w:r>
               <w:rPr>
                 <w:rStyle w:val="Hyperlink"/>
@@ -1316,7 +1352,7 @@
               <w:fldChar w:fldCharType="begin"/>
             </w:r>
             <w:r>
-              <w:instrText xml:space="preserve"> PAGEREF _Toc100029 \h </w:instrText>
+              <w:instrText xml:space="preserve"> PAGEREF _Toc100030 \h </w:instrText>
             </w:r>
             <w:r>
               <w:fldChar w:fldCharType="separate"/>
@@ -1444,7 +1480,7 @@
           <w:sz w:val="24"/>
           <w:szCs w:val="24"/>
         </w:rPr>
-        <w:t xml:space="preserve">Журнал открыт: записи E-01…E-14 охватывают первый цикл отладки (подъём сборки на IDF 6, периферия, кириллица), записи E-15…E-23 — второй цикл (SD-карта, подсистема «ФИЛЬМЫ», плеер esp_player, индикация занятости, переход пользователя на локальную сборку, экранная диагностика производительности, чистота диагностического журнала). Новые записи добавляются по той же схеме: симптом → причина → решение → урок.</w:t>
+        <w:t xml:space="preserve">Журнал открыт: записи E-01…E-14 охватывают первый цикл отладки (подъём сборки на IDF 6, периферия, кириллица), записи E-15…E-24 — второй цикл (SD-карта, подсистема «ФИЛЬМЫ», плеер esp_player, индикация занятости, переход пользователя на локальную сборку, экранная диагностика производительности, чистота диагностического журнала). Новые записи добавляются по той же схеме: симптом → причина → решение → урок.</w:t>
       </w:r>
     </w:p>
     <w:p>
@@ -5013,6 +5049,152 @@
           </w:p>
         </w:tc>
       </w:tr>
+      <w:tr>
+        <w:trPr>
+          <w:cantSplit/>
+          <w:tblHeader w:val="off"/>
+        </w:trPr>
+        <w:tc>
+          <w:tcPr>
+            <w:tcW w:type="pct" w:w="400"/>
+            <w:tcMar>
+              <w:top w:type="dxa" w:w="60"/>
+              <w:left w:type="dxa" w:w="120"/>
+              <w:bottom w:type="dxa" w:w="60"/>
+              <w:right w:type="dxa" w:w="120"/>
+            </w:tcMar>
+          </w:tcPr>
+          <w:p>
+            <w:pPr>
+              <w:spacing w:line="276"/>
+              <w:jc w:val="left"/>
+            </w:pPr>
+            <w:r>
+              <w:rPr>
+                <w:rFonts w:ascii="Times New Roman" w:eastAsia="Times New Roman" w:hAnsi="Times New Roman"/>
+                <w:b w:val="false"/>
+                <w:bCs w:val="false"/>
+                <w:color w:val="000000"/>
+                <w:sz w:val="20"/>
+                <w:szCs w:val="20"/>
+              </w:rPr>
+              <w:t xml:space="preserve">E-24</w:t>
+            </w:r>
+          </w:p>
+        </w:tc>
+        <w:tc>
+          <w:tcPr>
+            <w:tcW w:type="pct" w:w="1700"/>
+            <w:tcMar>
+              <w:top w:type="dxa" w:w="60"/>
+              <w:left w:type="dxa" w:w="120"/>
+              <w:bottom w:type="dxa" w:w="60"/>
+              <w:right w:type="dxa" w:w="120"/>
+            </w:tcMar>
+          </w:tcPr>
+          <w:p>
+            <w:pPr>
+              <w:spacing w:line="276"/>
+              <w:jc w:val="left"/>
+            </w:pPr>
+            <w:r>
+              <w:rPr>
+                <w:rFonts w:ascii="Times New Roman" w:eastAsia="Times New Roman" w:hAnsi="Times New Roman"/>
+                <w:b w:val="false"/>
+                <w:bCs w:val="false"/>
+                <w:color w:val="000000"/>
+                <w:sz w:val="20"/>
+                <w:szCs w:val="20"/>
+              </w:rPr>
+              <w:t xml:space="preserve">Шторм «buffering…/buffered»: сотни событий за минуты, пары по 10–30 мс</w:t>
+            </w:r>
+          </w:p>
+        </w:tc>
+        <w:tc>
+          <w:tcPr>
+            <w:tcW w:type="pct" w:w="800"/>
+            <w:tcMar>
+              <w:top w:type="dxa" w:w="60"/>
+              <w:left w:type="dxa" w:w="120"/>
+              <w:bottom w:type="dxa" w:w="60"/>
+              <w:right w:type="dxa" w:w="120"/>
+            </w:tcMar>
+          </w:tcPr>
+          <w:p>
+            <w:pPr>
+              <w:spacing w:line="276"/>
+              <w:jc w:val="left"/>
+            </w:pPr>
+            <w:r>
+              <w:rPr>
+                <w:rFonts w:ascii="Times New Roman" w:eastAsia="Times New Roman" w:hAnsi="Times New Roman"/>
+                <w:b w:val="false"/>
+                <w:bCs w:val="false"/>
+                <w:color w:val="000000"/>
+                <w:sz w:val="20"/>
+                <w:szCs w:val="20"/>
+              </w:rPr>
+              <w:t xml:space="preserve">Плеер / журнал</w:t>
+            </w:r>
+          </w:p>
+        </w:tc>
+        <w:tc>
+          <w:tcPr>
+            <w:tcW w:type="pct" w:w="1300"/>
+            <w:tcMar>
+              <w:top w:type="dxa" w:w="60"/>
+              <w:left w:type="dxa" w:w="120"/>
+              <w:bottom w:type="dxa" w:w="60"/>
+              <w:right w:type="dxa" w:w="120"/>
+            </w:tcMar>
+          </w:tcPr>
+          <w:p>
+            <w:pPr>
+              <w:spacing w:line="276"/>
+              <w:jc w:val="left"/>
+            </w:pPr>
+            <w:r>
+              <w:rPr>
+                <w:rFonts w:ascii="Times New Roman" w:eastAsia="Times New Roman" w:hAnsi="Times New Roman"/>
+                <w:b w:val="false"/>
+                <w:bCs w:val="false"/>
+                <w:color w:val="000000"/>
+                <w:sz w:val="20"/>
+                <w:szCs w:val="20"/>
+              </w:rPr>
+              <w:t xml:space="preserve">f7b5f69</w:t>
+            </w:r>
+          </w:p>
+        </w:tc>
+        <w:tc>
+          <w:tcPr>
+            <w:tcW w:type="pct" w:w="800"/>
+            <w:tcMar>
+              <w:top w:type="dxa" w:w="60"/>
+              <w:left w:type="dxa" w:w="120"/>
+              <w:bottom w:type="dxa" w:w="60"/>
+              <w:right w:type="dxa" w:w="120"/>
+            </w:tcMar>
+          </w:tcPr>
+          <w:p>
+            <w:pPr>
+              <w:spacing w:line="276"/>
+              <w:jc w:val="left"/>
+            </w:pPr>
+            <w:r>
+              <w:rPr>
+                <w:rFonts w:ascii="Times New Roman" w:eastAsia="Times New Roman" w:hAnsi="Times New Roman"/>
+                <w:b w:val="false"/>
+                <w:bCs w:val="false"/>
+                <w:color w:val="000000"/>
+                <w:sz w:val="20"/>
+                <w:szCs w:val="20"/>
+              </w:rPr>
+              <w:t xml:space="preserve">Исправлено</w:t>
+            </w:r>
+          </w:p>
+        </w:tc>
+      </w:tr>
     </w:tbl>
     <w:p>
       <w:pPr>
@@ -5027,7 +5209,7 @@
           <w:sz w:val="24"/>
           <w:szCs w:val="24"/>
         </w:rPr>
-        <w:t xml:space="preserve">Коммиты d2e3606 и 668083b применены пользователем параллельно (содержимое совпало с подготовленным патчем); 343c42f…53482b7 — первый цикл исправлений ветки; 7ab5082…27743df — второй цикл (медиа-подсистема). После каждого коммита CI завершался SUCCESS; ключевые исправления подтверждены работой на реальной плате (E-04/E-05/E-07/E-08/E-15/E-16/E-17/E-19/E-20). Начиная с E-18 сборку выполняет сам пользователь локально в VS Code ESP-IDF; CI остаётся независимым контролем ревизии.</w:t>
+        <w:t xml:space="preserve">Коммиты d2e3606 и 668083b применены пользователем параллельно (содержимое совпало с подготовленным патчем); 343c42f…53482b7 — первый цикл исправлений ветки; 7ab5082…f7b5f69 — второй цикл (медиа-подсистема). После каждого коммита CI завершался SUCCESS; ключевые исправления подтверждены работой на реальной плате (E-04/E-05/E-07/E-08/E-15/E-16/E-17/E-19/E-20). Начиная с E-18 сборку выполняет сам пользователь локально в VS Code ESP-IDF; CI остаётся независимым контролем ревизии.</w:t>
       </w:r>
     </w:p>
     <w:p>
@@ -7318,7 +7500,7 @@
           <w:sz w:val="32"/>
           <w:szCs w:val="32"/>
         </w:rPr>
-        <w:t xml:space="preserve">6. Медиа-подсистема: сеть, фильмы, плеер, индикация (E-16, E-17, E-19, E-20, E-21, E-22, E-23)</w:t>
+        <w:t xml:space="preserve">6. Медиа-подсистема: сеть, фильмы, плеер, индикация (E-16, E-17, E-19, E-20, E-21, E-22, E-23, E-24)</w:t>
       </w:r>
       <w:bookmarkEnd w:id="100017"/>
     </w:p>
@@ -9500,10 +9682,130 @@
     </w:p>
     <w:p>
       <w:pPr>
+        <w:pStyle w:val="Heading2"/>
+        <w:spacing w:after="120" w:before="260" w:line="312"/>
+      </w:pPr>
+      <w:bookmarkStart w:id="100025" w:name="_Toc100025"/>
+      <w:r>
+        <w:rPr>
+          <w:rFonts w:ascii="Arial" w:eastAsia="Arial" w:hAnsi="Arial"/>
+          <w:b/>
+          <w:bCs/>
+          <w:color w:val="0F2B40"/>
+          <w:sz w:val="28"/>
+          <w:szCs w:val="28"/>
+        </w:rPr>
+        <w:t xml:space="preserve">E-24. Шторм «buffering…/buffered»: сотни событий за минуты, пары по 10–30 мс</w:t>
+      </w:r>
+      <w:bookmarkEnd w:id="100025"/>
+    </w:p>
+    <w:p>
+      <w:pPr>
+        <w:spacing w:after="80" w:line="312"/>
+        <w:ind w:firstLine="480"/>
+        <w:jc w:val="both"/>
+      </w:pPr>
+      <w:r>
+        <w:rPr>
+          <w:rFonts w:ascii="Times New Roman" w:eastAsia="Times New Roman" w:hAnsi="Times New Roman"/>
+          <w:b/>
+          <w:bCs/>
+          <w:color w:val="000000"/>
+          <w:sz w:val="24"/>
+          <w:szCs w:val="24"/>
+        </w:rPr>
+        <w:t xml:space="preserve">Симптом. </w:t>
+      </w:r>
+      <w:r>
+        <w:rPr>
+          <w:rFonts w:ascii="Times New Roman" w:eastAsia="Times New Roman" w:hAnsi="Times New Roman"/>
+          <w:color w:val="000000"/>
+          <w:sz w:val="24"/>
+          <w:szCs w:val="24"/>
+        </w:rPr>
+        <w:t xml:space="preserve">Лог 27743df (Crashout 512×288@23): журнал чист от WDT, но с момента PLAYING за 3,5 минуты — ~350 пар «buffering…/buffered»; в хвосте пары идут с периодом ~260 мс, а внутри пары — 11–30 мс. При этом картинка продолжает идти (слайдшоу из-за декодера), звук не рвётся, STOP по-прошествии 3,7 минут — нормальный.</w:t>
+      </w:r>
+    </w:p>
+    <w:p>
+      <w:pPr>
+        <w:spacing w:after="80" w:line="312"/>
+        <w:ind w:firstLine="480"/>
+        <w:jc w:val="both"/>
+      </w:pPr>
+      <w:r>
+        <w:rPr>
+          <w:rFonts w:ascii="Times New Roman" w:eastAsia="Times New Roman" w:hAnsi="Times New Roman"/>
+          <w:b/>
+          <w:bCs/>
+          <w:color w:val="000000"/>
+          <w:sz w:val="24"/>
+          <w:szCs w:val="24"/>
+        </w:rPr>
+        <w:t xml:space="preserve">Корневая причина. </w:t>
+      </w:r>
+      <w:r>
+        <w:rPr>
+          <w:rFonts w:ascii="Times New Roman" w:eastAsia="Times New Roman" w:hAnsi="Times New Roman"/>
+          <w:color w:val="000000"/>
+          <w:sz w:val="24"/>
+          <w:szCs w:val="24"/>
+        </w:rPr>
+        <w:t xml:space="preserve">effective_ms гейта — это не байты пула, а PTS-диапазон пакетов мастер-дорожки (аудио) в очереди демукса (player_ports.c:78–99). При декодер-ограниченном потоке (tinyh264 ~7 fps при 23) видеочереда хронически полна, экстрактор блокируется на видеопакете (head-of-line), аудио домуксивается урывками — её запас колеблется у порога входа 400 мс. Далее: grace 250 мс истекает → гейт входит (BUFFERING); но первая же проверка выхода видит extractor_push_blocked (экстрактор не может втолкнуть пакет в полную видеочереду) и выходит мгновенно (BUFFERED), не дожидаясь 1200 мс (player_ports.c:133–138). Период цикла = grace; запас аудио ~400 мс сохраняется — это шум телеметрии при CPU-узком месте, а не новое голодание. В первой фазе (первые ~2 минуты) паузы 1,8–12 с — честное голодание: сеть в тот вечер давала ~0,4–0,6 битрейта (~45–90 кБ/с при ~120 кБ/с потока).</w:t>
+      </w:r>
+    </w:p>
+    <w:p>
+      <w:pPr>
+        <w:spacing w:after="80" w:line="312"/>
+        <w:ind w:firstLine="480"/>
+        <w:jc w:val="both"/>
+      </w:pPr>
+      <w:r>
+        <w:rPr>
+          <w:rFonts w:ascii="Times New Roman" w:eastAsia="Times New Roman" w:hAnsi="Times New Roman"/>
+          <w:b/>
+          <w:bCs/>
+          <w:color w:val="000000"/>
+          <w:sz w:val="24"/>
+          <w:szCs w:val="24"/>
+        </w:rPr>
+        <w:t xml:space="preserve">Решение (коммит f7b5f69). </w:t>
+      </w:r>
+      <w:r>
+        <w:rPr>
+          <w:rFonts w:ascii="Times New Roman" w:eastAsia="Times New Roman" w:hAnsi="Times New Roman"/>
+          <w:color w:val="000000"/>
+          <w:sz w:val="24"/>
+          <w:szCs w:val="24"/>
+        </w:rPr>
+        <w:t xml:space="preserve">Пороги не тронуты: grace короче безопасного предела (пауза успевает встать раньше, чем аудио недобежит), resume 1200 мс даёт длинные гладкие отрезки. Телеметрия переведена на rate-limit: pstats по-прежнему считает каждое событие в СТОПЫ/БУФЕРИЗАЦИЯ на OSD, а в UART печатается одна сводная строка в 10 с («buffering #N (buffered #M…)»); счётчики обнуляются на старте каждого потока. </w:t>
+      </w:r>
+      <w:r>
+        <w:rPr>
+          <w:rFonts w:ascii="Times New Roman" w:eastAsia="Times New Roman" w:hAnsi="Times New Roman"/>
+          <w:b/>
+          <w:bCs/>
+          <w:color w:val="000000"/>
+          <w:sz w:val="24"/>
+          <w:szCs w:val="24"/>
+        </w:rPr>
+        <w:t xml:space="preserve">Урок: </w:t>
+      </w:r>
+      <w:r>
+        <w:rPr>
+          <w:rFonts w:ascii="Times New Roman" w:eastAsia="Times New Roman" w:hAnsi="Times New Roman"/>
+          <w:color w:val="000000"/>
+          <w:sz w:val="24"/>
+          <w:szCs w:val="24"/>
+        </w:rPr>
+        <w:t xml:space="preserve">при двух узких местах (сеть + декодер) гейт деградирует до флапанья с периодом grace — диагноз ведётся по OSD (СЕТЬ/CPU1/КАДР), а не по частоте событий в журнале; UART-строки для высокочастотных событий — кандидаты на rate-limit сразу, рядом с ними обязана остаться точная метрика на экране.</w:t>
+      </w:r>
+    </w:p>
+    <w:p>
+      <w:pPr>
         <w:pStyle w:val="Heading1"/>
         <w:spacing w:after="160" w:before="360" w:line="312"/>
       </w:pPr>
-      <w:bookmarkStart w:id="100025" w:name="_Toc100025"/>
+      <w:bookmarkStart w:id="100026" w:name="_Toc100026"/>
       <w:r>
         <w:rPr>
           <w:rFonts w:ascii="Arial" w:eastAsia="Arial" w:hAnsi="Arial"/>
@@ -9515,14 +9817,14 @@
         </w:rPr>
         <w:t xml:space="preserve">7. Инфраструктура и окружение (E-03, E-13, E-14)</w:t>
       </w:r>
-      <w:bookmarkEnd w:id="100025"/>
+      <w:bookmarkEnd w:id="100026"/>
     </w:p>
     <w:p>
       <w:pPr>
         <w:pStyle w:val="Heading2"/>
         <w:spacing w:after="120" w:before="260" w:line="312"/>
       </w:pPr>
-      <w:bookmarkStart w:id="100026" w:name="_Toc100026"/>
+      <w:bookmarkStart w:id="100027" w:name="_Toc100027"/>
       <w:r>
         <w:rPr>
           <w:rFonts w:ascii="Arial" w:eastAsia="Arial" w:hAnsi="Arial"/>
@@ -9534,7 +9836,7 @@
         </w:rPr>
         <w:t xml:space="preserve">E-13. Проблемы окружения: инструменты, токен, контейнеризация</w:t>
       </w:r>
-      <w:bookmarkEnd w:id="100026"/>
+      <w:bookmarkEnd w:id="100027"/>
     </w:p>
     <w:p>
       <w:pPr>
@@ -9622,7 +9924,7 @@
         <w:pStyle w:val="Heading2"/>
         <w:spacing w:after="120" w:before="260" w:line="312"/>
       </w:pPr>
-      <w:bookmarkStart w:id="100027" w:name="_Toc100027"/>
+      <w:bookmarkStart w:id="100028" w:name="_Toc100028"/>
       <w:r>
         <w:rPr>
           <w:rFonts w:ascii="Arial" w:eastAsia="Arial" w:hAnsi="Arial"/>
@@ -9634,7 +9936,7 @@
         </w:rPr>
         <w:t xml:space="preserve">E-03. Документация репозитория отстала от кода</w:t>
       </w:r>
-      <w:bookmarkEnd w:id="100027"/>
+      <w:bookmarkEnd w:id="100028"/>
     </w:p>
     <w:p>
       <w:pPr>
@@ -9657,7 +9959,7 @@
         <w:pStyle w:val="Heading2"/>
         <w:spacing w:after="120" w:before="260" w:line="312"/>
       </w:pPr>
-      <w:bookmarkStart w:id="100028" w:name="_Toc100028"/>
+      <w:bookmarkStart w:id="100029" w:name="_Toc100029"/>
       <w:r>
         <w:rPr>
           <w:rFonts w:ascii="Arial" w:eastAsia="Arial" w:hAnsi="Arial"/>
@@ -9669,7 +9971,7 @@
         </w:rPr>
         <w:t xml:space="preserve">E-14. Не исправляется: vendor-warning в espressif__esp_lcd_st7701</w:t>
       </w:r>
-      <w:bookmarkEnd w:id="100028"/>
+      <w:bookmarkEnd w:id="100029"/>
     </w:p>
     <w:p>
       <w:pPr>
@@ -9692,7 +9994,7 @@
         <w:pStyle w:val="Heading1"/>
         <w:spacing w:after="160" w:before="360" w:line="312"/>
       </w:pPr>
-      <w:bookmarkStart w:id="100029" w:name="_Toc100029"/>
+      <w:bookmarkStart w:id="100030" w:name="_Toc100030"/>
       <w:r>
         <w:rPr>
           <w:rFonts w:ascii="Arial" w:eastAsia="Arial" w:hAnsi="Arial"/>
@@ -9704,7 +10006,7 @@
         </w:rPr>
         <w:t xml:space="preserve">8. Выводы и практики, внедрённые по итогам</w:t>
       </w:r>
-      <w:bookmarkEnd w:id="100029"/>
+      <w:bookmarkEnd w:id="100030"/>
     </w:p>
     <w:p>
       <w:pPr>

</xml_diff>